<commit_message>
docs(tesis): Introduccion y Antecedentes v3 unificados, vacancia verificada contra FMI 25/95
- antecedentes_v3: fusion de los ocho ejes del .tex con la version de Santiago y nueva
  area de vacancia (2.9) verificada en FMI CR 25/95, anexo II: el SRDSF corre sobre deuda
  federal bruta y la consolidada con el BCRA aparece solo como cuadro.
- introduccion_v3: pasivos del BCRA con cifra del FMI (18,4% -> 2,2% del PIB).
- referencias_y_notas_cap1_2_v3: referencias unificadas, cuatro citas con versiones
  distintas marcadas, nota sobre la probabilidad de estabilizacion de 97% del FMI.
- plan_de_labor_grupo v2: inventario tecnico (que se reutiliza, que se rehace).
- para_el_grupo: un solo Word para caps. 1-2 mas el plan de labor.
- Bibliografia: FMI CR 25/95 y presentacion FMI/ESM 2023.

Co-Authored-By: Claude Opus 5.5 <noreply@anthropic.com>
</commit_message>
<xml_diff>
--- a/tesis_oficial_borradores/para_el_grupo/Plan_de_labor.docx
+++ b/tesis_oficial_borradores/para_el_grupo/Plan_de_labor.docx
@@ -2,7 +2,7 @@
 <file path=word/document.xml><?xml version="1.0" encoding="utf-8"?>
 <w:document xmlns:w="http://schemas.openxmlformats.org/wordprocessingml/2006/main" xmlns:m="http://schemas.openxmlformats.org/officeDocument/2006/math" xmlns:r="http://schemas.openxmlformats.org/officeDocument/2006/relationships" xmlns:o="urn:schemas-microsoft-com:office:office" xmlns:v="urn:schemas-microsoft-com:vml" xmlns:w10="urn:schemas-microsoft-com:office:word" xmlns:a="http://schemas.openxmlformats.org/drawingml/2006/main" xmlns:pic="http://schemas.openxmlformats.org/drawingml/2006/picture" xmlns:wp="http://schemas.openxmlformats.org/drawingml/2006/wordprocessingDrawing">
   <w:body>
-    <w:bookmarkStart w:id="24" w:name="plan-de-labor-de-la-tesis"/>
+    <w:bookmarkStart w:id="28" w:name="plan-de-labor-de-la-tesis"/>
     <w:p>
       <w:pPr>
         <w:pStyle w:val="Heading1"/>
@@ -16,7 +16,7 @@
         <w:pStyle w:val="FirstParagraph"/>
       </w:pPr>
       <w:r>
-        <w:t xml:space="preserve">Documento de trabajo del grupo. Versión del 10 de octubre de 2026.</w:t>
+        <w:t xml:space="preserve">Documento de trabajo del grupo. Versión 2, del 10 de octubre de 2026.</w:t>
       </w:r>
     </w:p>
     <w:bookmarkStart w:id="9" w:name="para-qué-sirve-este-documento"/>
@@ -233,13 +233,30 @@
       </w:r>
     </w:p>
     <w:bookmarkEnd w:id="10"/>
-    <w:bookmarkStart w:id="11" w:name="decisiones-tomadas"/>
+    <w:bookmarkStart w:id="14" w:name="Xd89659cf47934cd7c8c10f214dc174c1c6038dd"/>
     <w:p>
       <w:pPr>
         <w:pStyle w:val="Heading2"/>
       </w:pPr>
       <w:r>
-        <w:t xml:space="preserve">3. Decisiones tomadas</w:t>
+        <w:t xml:space="preserve">2b. Inventario técnico: qué tenemos y qué se hace con cada cosa</w:t>
+      </w:r>
+    </w:p>
+    <w:p>
+      <w:pPr>
+        <w:pStyle w:val="FirstParagraph"/>
+      </w:pPr>
+      <w:r>
+        <w:t xml:space="preserve">Hay mucho hecho. La mayor parte se reutiliza; lo que falta son cuatro piezas.</w:t>
+      </w:r>
+    </w:p>
+    <w:bookmarkStart w:id="11" w:name="datos"/>
+    <w:p>
+      <w:pPr>
+        <w:pStyle w:val="Heading3"/>
+      </w:pPr>
+      <w:r>
+        <w:t xml:space="preserve">Datos</w:t>
       </w:r>
     </w:p>
     <w:tbl>
@@ -277,37 +294,37 @@
                 <w:rFonts w:ascii="Calibri" w:hAnsi="Calibri"/>
                 <w:sz w:val="20"/>
               </w:rPr>
-              <w:t xml:space="preserve">N.°</w:t>
-            </w:r>
-          </w:p>
-        </w:tc>
-        <w:tc>
-          <w:tcPr/>
-          <w:p>
-            <w:pPr>
-              <w:pStyle w:val="Compact"/>
-            </w:pPr>
-            <w:r>
-              <w:rPr>
-                <w:rFonts w:ascii="Calibri" w:hAnsi="Calibri"/>
-                <w:sz w:val="20"/>
-              </w:rPr>
-              <w:t xml:space="preserve">Decisión</w:t>
-            </w:r>
-          </w:p>
-        </w:tc>
-        <w:tc>
-          <w:tcPr/>
-          <w:p>
-            <w:pPr>
-              <w:pStyle w:val="Compact"/>
-            </w:pPr>
-            <w:r>
-              <w:rPr>
-                <w:rFonts w:ascii="Calibri" w:hAnsi="Calibri"/>
-                <w:sz w:val="20"/>
-              </w:rPr>
-              <w:t xml:space="preserve">Justificación</w:t>
+              <w:t xml:space="preserve">Qué hay</w:t>
+            </w:r>
+          </w:p>
+        </w:tc>
+        <w:tc>
+          <w:tcPr/>
+          <w:p>
+            <w:pPr>
+              <w:pStyle w:val="Compact"/>
+            </w:pPr>
+            <w:r>
+              <w:rPr>
+                <w:rFonts w:ascii="Calibri" w:hAnsi="Calibri"/>
+                <w:sz w:val="20"/>
+              </w:rPr>
+              <w:t xml:space="preserve">Archivo</w:t>
+            </w:r>
+          </w:p>
+        </w:tc>
+        <w:tc>
+          <w:tcPr/>
+          <w:p>
+            <w:pPr>
+              <w:pStyle w:val="Compact"/>
+            </w:pPr>
+            <w:r>
+              <w:rPr>
+                <w:rFonts w:ascii="Calibri" w:hAnsi="Calibri"/>
+                <w:sz w:val="20"/>
+              </w:rPr>
+              <w:t xml:space="preserve">Qué se hace</w:t>
             </w:r>
           </w:p>
         </w:tc>
@@ -324,37 +341,38 @@
                 <w:rFonts w:ascii="Calibri" w:hAnsi="Calibri"/>
                 <w:sz w:val="20"/>
               </w:rPr>
-              <w:t xml:space="preserve">1</w:t>
-            </w:r>
-          </w:p>
-        </w:tc>
-        <w:tc>
-          <w:tcPr/>
-          <w:p>
-            <w:pPr>
-              <w:pStyle w:val="Compact"/>
-            </w:pPr>
-            <w:r>
-              <w:rPr>
-                <w:rFonts w:ascii="Calibri" w:hAnsi="Calibri"/>
-                <w:sz w:val="20"/>
-              </w:rPr>
-              <w:t xml:space="preserve">La Introducción de Santiago del 7/10 es la base, completada con la Justificación y los objetivos específicos del texto LaTeX.</w:t>
-            </w:r>
-          </w:p>
-        </w:tc>
-        <w:tc>
-          <w:tcPr/>
-          <w:p>
-            <w:pPr>
-              <w:pStyle w:val="Compact"/>
-            </w:pPr>
-            <w:r>
-              <w:rPr>
-                <w:rFonts w:ascii="Calibri" w:hAnsi="Calibri"/>
-                <w:sz w:val="20"/>
-              </w:rPr>
-              <w:t xml:space="preserve">Es la versión más reciente y ya fue revisada.</w:t>
+              <w:t xml:space="preserve">Base 1996-2025 (120 trimestres): deuda/PIB del SPNF, resultado primario/PIB, PIB real, brecha del producto, TCRM, EMBI+, VIX</w:t>
+            </w:r>
+          </w:p>
+        </w:tc>
+        <w:tc>
+          <w:tcPr/>
+          <w:p>
+            <w:pPr>
+              <w:pStyle w:val="Compact"/>
+            </w:pPr>
+            <w:r>
+              <w:rPr>
+                <w:rStyle w:val="VerbatimChar"/>
+                <w:rFonts w:ascii="Calibri" w:hAnsi="Calibri"/>
+                <w:sz w:val="20"/>
+              </w:rPr>
+              <w:t xml:space="preserve">datos/dataset_consolidado_1996_2025.csv</w:t>
+            </w:r>
+          </w:p>
+        </w:tc>
+        <w:tc>
+          <w:tcPr/>
+          <w:p>
+            <w:pPr>
+              <w:pStyle w:val="Compact"/>
+            </w:pPr>
+            <w:r>
+              <w:rPr>
+                <w:rFonts w:ascii="Calibri" w:hAnsi="Calibri"/>
+                <w:sz w:val="20"/>
+              </w:rPr>
+              <w:t xml:space="preserve">Se reutiliza. Hay que sumarle la deuda consolidada y la tasa de la FED.</w:t>
             </w:r>
           </w:p>
         </w:tc>
@@ -371,37 +389,60 @@
                 <w:rFonts w:ascii="Calibri" w:hAnsi="Calibri"/>
                 <w:sz w:val="20"/>
               </w:rPr>
-              <w:t xml:space="preserve">2</w:t>
-            </w:r>
-          </w:p>
-        </w:tc>
-        <w:tc>
-          <w:tcPr/>
-          <w:p>
-            <w:pPr>
-              <w:pStyle w:val="Compact"/>
-            </w:pPr>
-            <w:r>
-              <w:rPr>
-                <w:rFonts w:ascii="Calibri" w:hAnsi="Calibri"/>
-                <w:sz w:val="20"/>
-              </w:rPr>
-              <w:t xml:space="preserve">Todo el trabajo empírico (modelo y simulación) se hace sobre la deuda consolidada SPNF y BCRA.</w:t>
-            </w:r>
-          </w:p>
-        </w:tc>
-        <w:tc>
-          <w:tcPr/>
-          <w:p>
-            <w:pPr>
-              <w:pStyle w:val="Compact"/>
-            </w:pPr>
-            <w:r>
-              <w:rPr>
-                <w:rFonts w:ascii="Calibri" w:hAnsi="Calibri"/>
-                <w:sz w:val="20"/>
-              </w:rPr>
-              <w:t xml:space="preserve">Es el perímetro que plantea la pregunta de investigación, y el FMI considera deuda pública a los pasivos del banco central cuando pueden financiar al Tesoro o implican riesgo fiscal (FMI, 2021, anexo II).</w:t>
+              <w:t xml:space="preserve">Empalmes pre-2004 (deuda, resultado primario y PIB real, por el método de Denton) y TCRM de 1996 extrapolado</w:t>
+            </w:r>
+          </w:p>
+        </w:tc>
+        <w:tc>
+          <w:tcPr/>
+          <w:p>
+            <w:pPr>
+              <w:pStyle w:val="Compact"/>
+            </w:pPr>
+            <w:r>
+              <w:rPr>
+                <w:rStyle w:val="VerbatimChar"/>
+                <w:rFonts w:ascii="Calibri" w:hAnsi="Calibri"/>
+                <w:sz w:val="20"/>
+              </w:rPr>
+              <w:t xml:space="preserve">codigo/ingesta_datos/empalme_*.py</w:t>
+            </w:r>
+            <w:r>
+              <w:rPr>
+                <w:rFonts w:ascii="Calibri" w:hAnsi="Calibri"/>
+                <w:sz w:val="20"/>
+              </w:rPr>
+              <w:t xml:space="preserve">,</w:t>
+            </w:r>
+            <w:r>
+              <w:rPr>
+                <w:rFonts w:ascii="Calibri" w:hAnsi="Calibri"/>
+                <w:sz w:val="20"/>
+              </w:rPr>
+              <w:t xml:space="preserve"> </w:t>
+            </w:r>
+            <w:r>
+              <w:rPr>
+                <w:rStyle w:val="VerbatimChar"/>
+                <w:rFonts w:ascii="Calibri" w:hAnsi="Calibri"/>
+                <w:sz w:val="20"/>
+              </w:rPr>
+              <w:t xml:space="preserve">construir_dataset_1996_2025.py</w:t>
+            </w:r>
+          </w:p>
+        </w:tc>
+        <w:tc>
+          <w:tcPr/>
+          <w:p>
+            <w:pPr>
+              <w:pStyle w:val="Compact"/>
+            </w:pPr>
+            <w:r>
+              <w:rPr>
+                <w:rFonts w:ascii="Calibri" w:hAnsi="Calibri"/>
+                <w:sz w:val="20"/>
+              </w:rPr>
+              <w:t xml:space="preserve">Se reutiliza.</w:t>
             </w:r>
           </w:p>
         </w:tc>
@@ -418,37 +459,60 @@
                 <w:rFonts w:ascii="Calibri" w:hAnsi="Calibri"/>
                 <w:sz w:val="20"/>
               </w:rPr>
-              <w:t xml:space="preserve">3</w:t>
-            </w:r>
-          </w:p>
-        </w:tc>
-        <w:tc>
-          <w:tcPr/>
-          <w:p>
-            <w:pPr>
-              <w:pStyle w:val="Compact"/>
-            </w:pPr>
-            <w:r>
-              <w:rPr>
-                <w:rFonts w:ascii="Calibri" w:hAnsi="Calibri"/>
-                <w:sz w:val="20"/>
-              </w:rPr>
-              <w:t xml:space="preserve">El modelo es un SVARX: la deuda consolidada es una variable más del sistema, con la tasa de la FED y la volatilidad global como variables exógenas.</w:t>
-            </w:r>
-          </w:p>
-        </w:tc>
-        <w:tc>
-          <w:tcPr/>
-          <w:p>
-            <w:pPr>
-              <w:pStyle w:val="Compact"/>
-            </w:pPr>
-            <w:r>
-              <w:rPr>
-                <w:rFonts w:ascii="Calibri" w:hAnsi="Calibri"/>
-                <w:sz w:val="20"/>
-              </w:rPr>
-              <w:t xml:space="preserve">Permite efectos conjuntos: la deuda responde a los shocks y a su vez los afecta. Es lo que hace falta para medir cómo un shock de la FED vuelve sobre la deuda a través del riesgo país y del tipo de cambio.</w:t>
+              <w:t xml:space="preserve">Pasivos remunerados del BCRA, 2004-2025, de la API del BCRA (LEBAC/NOBAC, Leliq/Notaliq, pases)</w:t>
+            </w:r>
+          </w:p>
+        </w:tc>
+        <w:tc>
+          <w:tcPr/>
+          <w:p>
+            <w:pPr>
+              <w:pStyle w:val="Compact"/>
+            </w:pPr>
+            <w:r>
+              <w:rPr>
+                <w:rStyle w:val="VerbatimChar"/>
+                <w:rFonts w:ascii="Calibri" w:hAnsi="Calibri"/>
+                <w:sz w:val="20"/>
+              </w:rPr>
+              <w:t xml:space="preserve">codigo/ingesta_datos/ingesta_bcra_pasivos.py</w:t>
+            </w:r>
+            <w:r>
+              <w:rPr>
+                <w:rFonts w:ascii="Calibri" w:hAnsi="Calibri"/>
+                <w:sz w:val="20"/>
+              </w:rPr>
+              <w:t xml:space="preserve">,</w:t>
+            </w:r>
+            <w:r>
+              <w:rPr>
+                <w:rFonts w:ascii="Calibri" w:hAnsi="Calibri"/>
+                <w:sz w:val="20"/>
+              </w:rPr>
+              <w:t xml:space="preserve"> </w:t>
+            </w:r>
+            <w:r>
+              <w:rPr>
+                <w:rStyle w:val="VerbatimChar"/>
+                <w:rFonts w:ascii="Calibri" w:hAnsi="Calibri"/>
+                <w:sz w:val="20"/>
+              </w:rPr>
+              <w:t xml:space="preserve">datos/procesados/bcra_pasivos_trimestral.csv</w:t>
+            </w:r>
+          </w:p>
+        </w:tc>
+        <w:tc>
+          <w:tcPr/>
+          <w:p>
+            <w:pPr>
+              <w:pStyle w:val="Compact"/>
+            </w:pPr>
+            <w:r>
+              <w:rPr>
+                <w:rFonts w:ascii="Calibri" w:hAnsi="Calibri"/>
+                <w:sz w:val="20"/>
+              </w:rPr>
+              <w:t xml:space="preserve">Se adapta: hay que llevarla a 1996 y revisar el denominador (ver abajo).</w:t>
             </w:r>
           </w:p>
         </w:tc>
@@ -465,37 +529,38 @@
                 <w:rFonts w:ascii="Calibri" w:hAnsi="Calibri"/>
                 <w:sz w:val="20"/>
               </w:rPr>
-              <w:t xml:space="preserve">4</w:t>
-            </w:r>
-          </w:p>
-        </w:tc>
-        <w:tc>
-          <w:tcPr/>
-          <w:p>
-            <w:pPr>
-              <w:pStyle w:val="Compact"/>
-            </w:pPr>
-            <w:r>
-              <w:rPr>
-                <w:rFonts w:ascii="Calibri" w:hAnsi="Calibri"/>
-                <w:sz w:val="20"/>
-              </w:rPr>
-              <w:t xml:space="preserve">La identificación principal es el SVAR restringido por teoría que ya existe. El ordenamiento de Cholesky queda solo como prueba de robustez.</w:t>
-            </w:r>
-          </w:p>
-        </w:tc>
-        <w:tc>
-          <w:tcPr/>
-          <w:p>
-            <w:pPr>
-              <w:pStyle w:val="Compact"/>
-            </w:pPr>
-            <w:r>
-              <w:rPr>
-                <w:rFonts w:ascii="Calibri" w:hAnsi="Calibri"/>
-                <w:sz w:val="20"/>
-              </w:rPr>
-              <w:t xml:space="preserve">No hay razón teórica para ordenar el EMBI+ y el TCRM entre sí, y esa justificación ya fue aprobada por el director.</w:t>
+              <w:t xml:space="preserve">VIX y volatilidad del Bovespa, 1996-2025</w:t>
+            </w:r>
+          </w:p>
+        </w:tc>
+        <w:tc>
+          <w:tcPr/>
+          <w:p>
+            <w:pPr>
+              <w:pStyle w:val="Compact"/>
+            </w:pPr>
+            <w:r>
+              <w:rPr>
+                <w:rStyle w:val="VerbatimChar"/>
+                <w:rFonts w:ascii="Calibri" w:hAnsi="Calibri"/>
+                <w:sz w:val="20"/>
+              </w:rPr>
+              <w:t xml:space="preserve">ingesta_instrumentos_1996_2025.py</w:t>
+            </w:r>
+          </w:p>
+        </w:tc>
+        <w:tc>
+          <w:tcPr/>
+          <w:p>
+            <w:pPr>
+              <w:pStyle w:val="Compact"/>
+            </w:pPr>
+            <w:r>
+              <w:rPr>
+                <w:rFonts w:ascii="Calibri" w:hAnsi="Calibri"/>
+                <w:sz w:val="20"/>
+              </w:rPr>
+              <w:t xml:space="preserve">El VIX se reutiliza como variable exógena.</w:t>
             </w:r>
           </w:p>
         </w:tc>
@@ -512,37 +577,161 @@
                 <w:rFonts w:ascii="Calibri" w:hAnsi="Calibri"/>
                 <w:sz w:val="20"/>
               </w:rPr>
-              <w:t xml:space="preserve">5</w:t>
-            </w:r>
-          </w:p>
-        </w:tc>
-        <w:tc>
-          <w:tcPr/>
-          <w:p>
-            <w:pPr>
-              <w:pStyle w:val="Compact"/>
-            </w:pPr>
-            <w:r>
-              <w:rPr>
-                <w:rFonts w:ascii="Calibri" w:hAnsi="Calibri"/>
-                <w:sz w:val="20"/>
-              </w:rPr>
-              <w:t xml:space="preserve">H1b se contrasta con la probabilidad de que la deuda no se estabilice, con corte en 50%.</w:t>
-            </w:r>
-          </w:p>
-        </w:tc>
-        <w:tc>
-          <w:tcPr/>
-          <w:p>
-            <w:pPr>
-              <w:pStyle w:val="Compact"/>
-            </w:pPr>
-            <w:r>
-              <w:rPr>
-                <w:rFonts w:ascii="Calibri" w:hAnsi="Calibri"/>
-                <w:sz w:val="20"/>
-              </w:rPr>
-              <w:t xml:space="preserve">Es la métrica del FMI (FMI, 2021, párr. 53). El 50% equivale a afirmar que la trayectoria mediana no se estabiliza. El corte calibrado del FMI no se puede replicar con un solo país. Se reporta también la probabilidad completa, para que el resultado no dependa del corte.</w:t>
+              <w:t xml:space="preserve">Spread soberano histórico 1983-2025</w:t>
+            </w:r>
+          </w:p>
+        </w:tc>
+        <w:tc>
+          <w:tcPr/>
+          <w:p>
+            <w:pPr>
+              <w:pStyle w:val="Compact"/>
+            </w:pPr>
+            <w:r>
+              <w:rPr>
+                <w:rStyle w:val="VerbatimChar"/>
+                <w:rFonts w:ascii="Calibri" w:hAnsi="Calibri"/>
+                <w:sz w:val="20"/>
+              </w:rPr>
+              <w:t xml:space="preserve">fase22_*</w:t>
+            </w:r>
+          </w:p>
+        </w:tc>
+        <w:tc>
+          <w:tcPr/>
+          <w:p>
+            <w:pPr>
+              <w:pStyle w:val="Compact"/>
+            </w:pPr>
+            <w:r>
+              <w:rPr>
+                <w:rFonts w:ascii="Calibri" w:hAnsi="Calibri"/>
+                <w:sz w:val="20"/>
+              </w:rPr>
+              <w:t xml:space="preserve">Queda fuera, como ya se había decidido.</w:t>
+            </w:r>
+          </w:p>
+        </w:tc>
+      </w:tr>
+    </w:tbl>
+    <w:p>
+      <w:pPr>
+        <w:pStyle w:val="BodyText"/>
+      </w:pPr>
+      <w:r>
+        <w:rPr>
+          <w:b/>
+          <w:bCs/>
+        </w:rPr>
+        <w:t xml:space="preserve">Problema detectado con los pasivos del BCRA.</w:t>
+      </w:r>
+      <w:r>
+        <w:t xml:space="preserve"> </w:t>
+      </w:r>
+      <w:r>
+        <w:t xml:space="preserve">Nuestra serie da 9,5% del PIB en 2022-2023.</w:t>
+      </w:r>
+      <w:r>
+        <w:t xml:space="preserve"> </w:t>
+      </w:r>
+      <w:r>
+        <w:t xml:space="preserve">El FMI da 18,4% en 2023 (16,2% solo en pesos) sobre el PIB promedio del año, y 11,0% sobre el PIB</w:t>
+      </w:r>
+      <w:r>
+        <w:t xml:space="preserve"> </w:t>
+      </w:r>
+      <w:r>
+        <w:t xml:space="preserve">anualizado del cuarto trimestre (FMI, 2025, anexo II). La diferencia viene del denominador, que</w:t>
+      </w:r>
+      <w:r>
+        <w:t xml:space="preserve"> </w:t>
+      </w:r>
+      <w:r>
+        <w:t xml:space="preserve">pesa mucho con inflación alta. Hay que elegir uno, justificarlo y usar el mismo para la deuda del</w:t>
+      </w:r>
+      <w:r>
+        <w:t xml:space="preserve"> </w:t>
+      </w:r>
+      <w:r>
+        <w:t xml:space="preserve">SPNF y para la del BCRA.</w:t>
+      </w:r>
+    </w:p>
+    <w:bookmarkEnd w:id="11"/>
+    <w:bookmarkStart w:id="12" w:name="modelos"/>
+    <w:p>
+      <w:pPr>
+        <w:pStyle w:val="Heading3"/>
+      </w:pPr>
+      <w:r>
+        <w:t xml:space="preserve">Modelos</w:t>
+      </w:r>
+    </w:p>
+    <w:tbl>
+      <w:tblPr>
+        <w:tblStyle w:val="Table"/>
+        <w:tblW w:type="pct" w:w="5000"/>
+        <w:tblLayout w:type="fixed"/>
+        <w:tblLook w:firstRow="1" w:lastRow="0" w:firstColumn="0" w:lastColumn="0" w:noHBand="0" w:noVBand="0" w:val="0020"/>
+        <w:tblBorders>
+          <w:top w:val="single" w:sz="4" w:color="808080"/>
+          <w:left w:val="single" w:sz="4" w:color="808080"/>
+          <w:bottom w:val="single" w:sz="4" w:color="808080"/>
+          <w:right w:val="single" w:sz="4" w:color="808080"/>
+          <w:insideH w:val="single" w:sz="4" w:color="808080"/>
+          <w:insideV w:val="single" w:sz="4" w:color="808080"/>
+        </w:tblBorders>
+      </w:tblPr>
+      <w:tblGrid>
+        <w:gridCol w:w="2640"/>
+        <w:gridCol w:w="2640"/>
+        <w:gridCol w:w="2640"/>
+      </w:tblGrid>
+      <w:tr>
+        <w:trPr>
+          <w:tblHeader w:val="on"/>
+        </w:trPr>
+        <w:tc>
+          <w:tcPr/>
+          <w:p>
+            <w:pPr>
+              <w:pStyle w:val="Compact"/>
+            </w:pPr>
+            <w:r>
+              <w:rPr>
+                <w:rFonts w:ascii="Calibri" w:hAnsi="Calibri"/>
+                <w:sz w:val="20"/>
+              </w:rPr>
+              <w:t xml:space="preserve">Qué hay</w:t>
+            </w:r>
+          </w:p>
+        </w:tc>
+        <w:tc>
+          <w:tcPr/>
+          <w:p>
+            <w:pPr>
+              <w:pStyle w:val="Compact"/>
+            </w:pPr>
+            <w:r>
+              <w:rPr>
+                <w:rFonts w:ascii="Calibri" w:hAnsi="Calibri"/>
+                <w:sz w:val="20"/>
+              </w:rPr>
+              <w:t xml:space="preserve">Archivo</w:t>
+            </w:r>
+          </w:p>
+        </w:tc>
+        <w:tc>
+          <w:tcPr/>
+          <w:p>
+            <w:pPr>
+              <w:pStyle w:val="Compact"/>
+            </w:pPr>
+            <w:r>
+              <w:rPr>
+                <w:rFonts w:ascii="Calibri" w:hAnsi="Calibri"/>
+                <w:sz w:val="20"/>
+              </w:rPr>
+              <w:t xml:space="preserve">Qué se hace</w:t>
             </w:r>
           </w:p>
         </w:tc>
@@ -559,65 +748,38 @@
                 <w:rFonts w:ascii="Calibri" w:hAnsi="Calibri"/>
                 <w:sz w:val="20"/>
               </w:rPr>
-              <w:t xml:space="preserve">6</w:t>
-            </w:r>
-          </w:p>
-        </w:tc>
-        <w:tc>
-          <w:tcPr/>
-          <w:p>
-            <w:pPr>
-              <w:pStyle w:val="Compact"/>
-            </w:pPr>
-            <w:r>
-              <w:rPr>
-                <w:rFonts w:ascii="Calibri" w:hAnsi="Calibri"/>
-                <w:sz w:val="20"/>
-              </w:rPr>
-              <w:t xml:space="preserve">El criterio</w:t>
-            </w:r>
-            <w:r>
-              <w:rPr>
-                <w:rFonts w:ascii="Calibri" w:hAnsi="Calibri"/>
-                <w:sz w:val="20"/>
-              </w:rPr>
-              <w:t xml:space="preserve"> </w:t>
-            </w:r>
-            <w:r>
-              <w:rPr>
-                <w:rFonts w:ascii="Calibri" w:hAnsi="Calibri"/>
-                <w:sz w:val="20"/>
-              </w:rPr>
-              <w:t xml:space="preserve">“deuda mayor a 100% del PIB”</w:t>
-            </w:r>
-            <w:r>
-              <w:rPr>
-                <w:rFonts w:ascii="Calibri" w:hAnsi="Calibri"/>
-                <w:sz w:val="20"/>
-              </w:rPr>
-              <w:t xml:space="preserve"> </w:t>
-            </w:r>
-            <w:r>
-              <w:rPr>
-                <w:rFonts w:ascii="Calibri" w:hAnsi="Calibri"/>
-                <w:sz w:val="20"/>
-              </w:rPr>
-              <w:t xml:space="preserve">sale de las hipótesis.</w:t>
-            </w:r>
-          </w:p>
-        </w:tc>
-        <w:tc>
-          <w:tcPr/>
-          <w:p>
-            <w:pPr>
-              <w:pStyle w:val="Compact"/>
-            </w:pPr>
-            <w:r>
-              <w:rPr>
-                <w:rFonts w:ascii="Calibri" w:hAnsi="Calibri"/>
-                <w:sz w:val="20"/>
-              </w:rPr>
-              <w:t xml:space="preserve">No tiene fuente que lo justifique.</w:t>
+              <w:t xml:space="preserve">Pruebas de raíz unitaria (ADF, KPSS, DF-GLS) y de quiebre único (Zivot-Andrews)</w:t>
+            </w:r>
+          </w:p>
+        </w:tc>
+        <w:tc>
+          <w:tcPr/>
+          <w:p>
+            <w:pPr>
+              <w:pStyle w:val="Compact"/>
+            </w:pPr>
+            <w:r>
+              <w:rPr>
+                <w:rStyle w:val="VerbatimChar"/>
+                <w:rFonts w:ascii="Calibri" w:hAnsi="Calibri"/>
+                <w:sz w:val="20"/>
+              </w:rPr>
+              <w:t xml:space="preserve">fase1_estacionariedad.py</w:t>
+            </w:r>
+          </w:p>
+        </w:tc>
+        <w:tc>
+          <w:tcPr/>
+          <w:p>
+            <w:pPr>
+              <w:pStyle w:val="Compact"/>
+            </w:pPr>
+            <w:r>
+              <w:rPr>
+                <w:rFonts w:ascii="Calibri" w:hAnsi="Calibri"/>
+                <w:sz w:val="20"/>
+              </w:rPr>
+              <w:t xml:space="preserve">Se reutiliza y se corre sobre la deuda consolidada.</w:t>
             </w:r>
           </w:p>
         </w:tc>
@@ -634,37 +796,30 @@
                 <w:rFonts w:ascii="Calibri" w:hAnsi="Calibri"/>
                 <w:sz w:val="20"/>
               </w:rPr>
-              <w:t xml:space="preserve">7</w:t>
-            </w:r>
-          </w:p>
-        </w:tc>
-        <w:tc>
-          <w:tcPr/>
-          <w:p>
-            <w:pPr>
-              <w:pStyle w:val="Compact"/>
-            </w:pPr>
-            <w:r>
-              <w:rPr>
-                <w:rFonts w:ascii="Calibri" w:hAnsi="Calibri"/>
-                <w:sz w:val="20"/>
-              </w:rPr>
-              <w:t xml:space="preserve">El área de vacancia se reformula.</w:t>
-            </w:r>
-          </w:p>
-        </w:tc>
-        <w:tc>
-          <w:tcPr/>
-          <w:p>
-            <w:pPr>
-              <w:pStyle w:val="Compact"/>
-            </w:pPr>
-            <w:r>
-              <w:rPr>
-                <w:rFonts w:ascii="Calibri" w:hAnsi="Calibri"/>
-                <w:sz w:val="20"/>
-              </w:rPr>
-              <w:t xml:space="preserve">La afirmación</w:t>
+              <w:t xml:space="preserve">Quiebres múltiples de Bai-Perron, con implementación propia</w:t>
+            </w:r>
+          </w:p>
+        </w:tc>
+        <w:tc>
+          <w:tcPr/>
+          <w:p>
+            <w:pPr>
+              <w:pStyle w:val="Compact"/>
+            </w:pPr>
+            <w:r>
+              <w:rPr>
+                <w:rStyle w:val="VerbatimChar"/>
+                <w:rFonts w:ascii="Calibri" w:hAnsi="Calibri"/>
+                <w:sz w:val="20"/>
+              </w:rPr>
+              <w:t xml:space="preserve">fase9_bai_perron.py</w:t>
+            </w:r>
+            <w:r>
+              <w:rPr>
+                <w:rFonts w:ascii="Calibri" w:hAnsi="Calibri"/>
+                <w:sz w:val="20"/>
+              </w:rPr>
+              <w:t xml:space="preserve">,</w:t>
             </w:r>
             <w:r>
               <w:rPr>
@@ -675,24 +830,26 @@
             </w:r>
             <w:r>
               <w:rPr>
-                <w:rFonts w:ascii="Calibri" w:hAnsi="Calibri"/>
-                <w:sz w:val="20"/>
-              </w:rPr>
-              <w:t xml:space="preserve">“el marco del FMI excluye al BCRA”</w:t>
-            </w:r>
-            <w:r>
-              <w:rPr>
-                <w:rFonts w:ascii="Calibri" w:hAnsi="Calibri"/>
-                <w:sz w:val="20"/>
-              </w:rPr>
-              <w:t xml:space="preserve"> </w:t>
-            </w:r>
-            <w:r>
-              <w:rPr>
-                <w:rFonts w:ascii="Calibri" w:hAnsi="Calibri"/>
-                <w:sz w:val="20"/>
-              </w:rPr>
-              <w:t xml:space="preserve">es incorrecta (FMI, 2021, anexo II). La vacancia pasa a ser la combinación de tres aspectos que nadie cubrió juntos para Argentina: identificación estructural, un shock externo identificado y la estimación sobre el perímetro consolidado.</w:t>
+                <w:rStyle w:val="VerbatimChar"/>
+                <w:rFonts w:ascii="Calibri" w:hAnsi="Calibri"/>
+                <w:sz w:val="20"/>
+              </w:rPr>
+              <w:t xml:space="preserve">bai_perron.py</w:t>
+            </w:r>
+          </w:p>
+        </w:tc>
+        <w:tc>
+          <w:tcPr/>
+          <w:p>
+            <w:pPr>
+              <w:pStyle w:val="Compact"/>
+            </w:pPr>
+            <w:r>
+              <w:rPr>
+                <w:rFonts w:ascii="Calibri" w:hAnsi="Calibri"/>
+                <w:sz w:val="20"/>
+              </w:rPr>
+              <w:t xml:space="preserve">Se reutiliza. Los quiebres pasan a ser dummies del SVARX.</w:t>
             </w:r>
           </w:p>
         </w:tc>
@@ -709,37 +866,82 @@
                 <w:rFonts w:ascii="Calibri" w:hAnsi="Calibri"/>
                 <w:sz w:val="20"/>
               </w:rPr>
-              <w:t xml:space="preserve">8</w:t>
-            </w:r>
-          </w:p>
-        </w:tc>
-        <w:tc>
-          <w:tcPr/>
-          <w:p>
-            <w:pPr>
-              <w:pStyle w:val="Compact"/>
-            </w:pPr>
-            <w:r>
-              <w:rPr>
-                <w:rFonts w:ascii="Calibri" w:hAnsi="Calibri"/>
-                <w:sz w:val="20"/>
-              </w:rPr>
-              <w:t xml:space="preserve">El canal cuasifiscal del shock de la FED se redacta en pasado.</w:t>
-            </w:r>
-          </w:p>
-        </w:tc>
-        <w:tc>
-          <w:tcPr/>
-          <w:p>
-            <w:pPr>
-              <w:pStyle w:val="Compact"/>
-            </w:pPr>
-            <w:r>
-              <w:rPr>
-                <w:rFonts w:ascii="Calibri" w:hAnsi="Calibri"/>
-                <w:sz w:val="20"/>
-              </w:rPr>
-              <w:t xml:space="preserve">Los pasivos remunerados del BCRA se redujeron a niveles mínimos desde 2024.</w:t>
+              <w:t xml:space="preserve">Johansen y VECM: no encuentran reacción fiscal</w:t>
+            </w:r>
+          </w:p>
+        </w:tc>
+        <w:tc>
+          <w:tcPr/>
+          <w:p>
+            <w:pPr>
+              <w:pStyle w:val="Compact"/>
+            </w:pPr>
+            <w:r>
+              <w:rPr>
+                <w:rStyle w:val="VerbatimChar"/>
+                <w:rFonts w:ascii="Calibri" w:hAnsi="Calibri"/>
+                <w:sz w:val="20"/>
+              </w:rPr>
+              <w:t xml:space="preserve">fase2</w:t>
+            </w:r>
+            <w:r>
+              <w:rPr>
+                <w:rFonts w:ascii="Calibri" w:hAnsi="Calibri"/>
+                <w:sz w:val="20"/>
+              </w:rPr>
+              <w:t xml:space="preserve">,</w:t>
+            </w:r>
+            <w:r>
+              <w:rPr>
+                <w:rFonts w:ascii="Calibri" w:hAnsi="Calibri"/>
+                <w:sz w:val="20"/>
+              </w:rPr>
+              <w:t xml:space="preserve"> </w:t>
+            </w:r>
+            <w:r>
+              <w:rPr>
+                <w:rStyle w:val="VerbatimChar"/>
+                <w:rFonts w:ascii="Calibri" w:hAnsi="Calibri"/>
+                <w:sz w:val="20"/>
+              </w:rPr>
+              <w:t xml:space="preserve">fase3b</w:t>
+            </w:r>
+            <w:r>
+              <w:rPr>
+                <w:rFonts w:ascii="Calibri" w:hAnsi="Calibri"/>
+                <w:sz w:val="20"/>
+              </w:rPr>
+              <w:t xml:space="preserve">,</w:t>
+            </w:r>
+            <w:r>
+              <w:rPr>
+                <w:rFonts w:ascii="Calibri" w:hAnsi="Calibri"/>
+                <w:sz w:val="20"/>
+              </w:rPr>
+              <w:t xml:space="preserve"> </w:t>
+            </w:r>
+            <w:r>
+              <w:rPr>
+                <w:rStyle w:val="VerbatimChar"/>
+                <w:rFonts w:ascii="Calibri" w:hAnsi="Calibri"/>
+                <w:sz w:val="20"/>
+              </w:rPr>
+              <w:t xml:space="preserve">fase16</w:t>
+            </w:r>
+          </w:p>
+        </w:tc>
+        <w:tc>
+          <w:tcPr/>
+          <w:p>
+            <w:pPr>
+              <w:pStyle w:val="Compact"/>
+            </w:pPr>
+            <w:r>
+              <w:rPr>
+                <w:rFonts w:ascii="Calibri" w:hAnsi="Calibri"/>
+                <w:sz w:val="20"/>
+              </w:rPr>
+              <w:t xml:space="preserve">Se reutiliza para H1a (reacción fiscal), sobre la deuda consolidada.</w:t>
             </w:r>
           </w:p>
         </w:tc>
@@ -756,37 +958,90 @@
                 <w:rFonts w:ascii="Calibri" w:hAnsi="Calibri"/>
                 <w:sz w:val="20"/>
               </w:rPr>
-              <w:t xml:space="preserve">9</w:t>
-            </w:r>
-          </w:p>
-        </w:tc>
-        <w:tc>
-          <w:tcPr/>
-          <w:p>
-            <w:pPr>
-              <w:pStyle w:val="Compact"/>
-            </w:pPr>
-            <w:r>
-              <w:rPr>
-                <w:rFonts w:ascii="Calibri" w:hAnsi="Calibri"/>
-                <w:sz w:val="20"/>
-              </w:rPr>
-              <w:t xml:space="preserve">El módulo de balanza de pagos (exportaciones, importaciones, inversión extranjera directa, fuga de capitales, renovación de vencimientos, necesidades de financiamiento) queda fuera y pasa a investigación futura.</w:t>
-            </w:r>
-          </w:p>
-        </w:tc>
-        <w:tc>
-          <w:tcPr/>
-          <w:p>
-            <w:pPr>
-              <w:pStyle w:val="Compact"/>
-            </w:pPr>
-            <w:r>
-              <w:rPr>
-                <w:rFonts w:ascii="Calibri" w:hAnsi="Calibri"/>
-                <w:sz w:val="20"/>
-              </w:rPr>
-              <w:t xml:space="preserve">No está especificado, y su tamaño es el de otra tesis.</w:t>
+              <w:t xml:space="preserve">SVAR restringido: brecha del producto, resultado primario, EMBI+, TCRM y deuda, con elasticidad cíclica de 0,25 citada y</w:t>
+            </w:r>
+            <w:r>
+              <w:rPr>
+                <w:rFonts w:ascii="Calibri" w:hAnsi="Calibri"/>
+                <w:sz w:val="20"/>
+              </w:rPr>
+              <w:t xml:space="preserve"> </w:t>
+            </w:r>
+            <w:r>
+              <w:rPr>
+                <w:rFonts w:ascii="Calibri" w:hAnsi="Calibri"/>
+                <w:i/>
+                <w:iCs/>
+                <w:sz w:val="20"/>
+              </w:rPr>
+              <w:t xml:space="preserve">bootstrap</w:t>
+            </w:r>
+            <w:r>
+              <w:rPr>
+                <w:rFonts w:ascii="Calibri" w:hAnsi="Calibri"/>
+                <w:sz w:val="20"/>
+              </w:rPr>
+              <w:t xml:space="preserve"> </w:t>
+            </w:r>
+            <w:r>
+              <w:rPr>
+                <w:rFonts w:ascii="Calibri" w:hAnsi="Calibri"/>
+                <w:sz w:val="20"/>
+              </w:rPr>
+              <w:t xml:space="preserve">de 1.000 réplicas</w:t>
+            </w:r>
+          </w:p>
+        </w:tc>
+        <w:tc>
+          <w:tcPr/>
+          <w:p>
+            <w:pPr>
+              <w:pStyle w:val="Compact"/>
+            </w:pPr>
+            <w:r>
+              <w:rPr>
+                <w:rStyle w:val="VerbatimChar"/>
+                <w:rFonts w:ascii="Calibri" w:hAnsi="Calibri"/>
+                <w:sz w:val="20"/>
+              </w:rPr>
+              <w:t xml:space="preserve">fase19_var_restringido_macro.py</w:t>
+            </w:r>
+            <w:r>
+              <w:rPr>
+                <w:rFonts w:ascii="Calibri" w:hAnsi="Calibri"/>
+                <w:sz w:val="20"/>
+              </w:rPr>
+              <w:t xml:space="preserve">,</w:t>
+            </w:r>
+            <w:r>
+              <w:rPr>
+                <w:rFonts w:ascii="Calibri" w:hAnsi="Calibri"/>
+                <w:sz w:val="20"/>
+              </w:rPr>
+              <w:t xml:space="preserve"> </w:t>
+            </w:r>
+            <w:r>
+              <w:rPr>
+                <w:rStyle w:val="VerbatimChar"/>
+                <w:rFonts w:ascii="Calibri" w:hAnsi="Calibri"/>
+                <w:sz w:val="20"/>
+              </w:rPr>
+              <w:t xml:space="preserve">fase23_reestimacion_1996_2025.py</w:t>
+            </w:r>
+          </w:p>
+        </w:tc>
+        <w:tc>
+          <w:tcPr/>
+          <w:p>
+            <w:pPr>
+              <w:pStyle w:val="Compact"/>
+            </w:pPr>
+            <w:r>
+              <w:rPr>
+                <w:rFonts w:ascii="Calibri" w:hAnsi="Calibri"/>
+                <w:sz w:val="20"/>
+              </w:rPr>
+              <w:t xml:space="preserve">Es el núcleo. Se extiende a SVARX: el VAR de statsmodels ya admite variables exógenas, y la identificación se aplica igual sobre los residuos.</w:t>
             </w:r>
           </w:p>
         </w:tc>
@@ -803,44 +1058,1229 @@
                 <w:rFonts w:ascii="Calibri" w:hAnsi="Calibri"/>
                 <w:sz w:val="20"/>
               </w:rPr>
-              <w:t xml:space="preserve">10</w:t>
-            </w:r>
-          </w:p>
-        </w:tc>
-        <w:tc>
-          <w:tcPr/>
-          <w:p>
-            <w:pPr>
-              <w:pStyle w:val="Compact"/>
-            </w:pPr>
-            <w:r>
-              <w:rPr>
-                <w:rFonts w:ascii="Calibri" w:hAnsi="Calibri"/>
-                <w:sz w:val="20"/>
-              </w:rPr>
-              <w:t xml:space="preserve">Todo umbral, corte o tamaño de shock tiene que tener una justificación escrita, propia o citada.</w:t>
-            </w:r>
-          </w:p>
-        </w:tc>
-        <w:tc>
-          <w:tcPr/>
-          <w:p>
-            <w:pPr>
-              <w:pStyle w:val="Compact"/>
-            </w:pPr>
-            <w:r>
-              <w:rPr>
-                <w:rFonts w:ascii="Calibri" w:hAnsi="Calibri"/>
-                <w:sz w:val="20"/>
-              </w:rPr>
-              <w:t xml:space="preserve">Criterio del grupo.</w:t>
+              <w:t xml:space="preserve">Selección de rezagos, multicolinealidad y diagnósticos de residuos</w:t>
+            </w:r>
+          </w:p>
+        </w:tc>
+        <w:tc>
+          <w:tcPr/>
+          <w:p>
+            <w:pPr>
+              <w:pStyle w:val="Compact"/>
+            </w:pPr>
+            <w:r>
+              <w:rPr>
+                <w:rStyle w:val="VerbatimChar"/>
+                <w:rFonts w:ascii="Calibri" w:hAnsi="Calibri"/>
+                <w:sz w:val="20"/>
+              </w:rPr>
+              <w:t xml:space="preserve">fase12</w:t>
+            </w:r>
+            <w:r>
+              <w:rPr>
+                <w:rFonts w:ascii="Calibri" w:hAnsi="Calibri"/>
+                <w:sz w:val="20"/>
+              </w:rPr>
+              <w:t xml:space="preserve">,</w:t>
+            </w:r>
+            <w:r>
+              <w:rPr>
+                <w:rFonts w:ascii="Calibri" w:hAnsi="Calibri"/>
+                <w:sz w:val="20"/>
+              </w:rPr>
+              <w:t xml:space="preserve"> </w:t>
+            </w:r>
+            <w:r>
+              <w:rPr>
+                <w:rStyle w:val="VerbatimChar"/>
+                <w:rFonts w:ascii="Calibri" w:hAnsi="Calibri"/>
+                <w:sz w:val="20"/>
+              </w:rPr>
+              <w:t xml:space="preserve">fase7</w:t>
+            </w:r>
+          </w:p>
+        </w:tc>
+        <w:tc>
+          <w:tcPr/>
+          <w:p>
+            <w:pPr>
+              <w:pStyle w:val="Compact"/>
+            </w:pPr>
+            <w:r>
+              <w:rPr>
+                <w:rFonts w:ascii="Calibri" w:hAnsi="Calibri"/>
+                <w:sz w:val="20"/>
+              </w:rPr>
+              <w:t xml:space="preserve">Se reutiliza para validar el SVARX.</w:t>
+            </w:r>
+          </w:p>
+        </w:tc>
+      </w:tr>
+      <w:tr>
+        <w:tc>
+          <w:tcPr/>
+          <w:p>
+            <w:pPr>
+              <w:pStyle w:val="Compact"/>
+            </w:pPr>
+            <w:r>
+              <w:rPr>
+                <w:rFonts w:ascii="Calibri" w:hAnsi="Calibri"/>
+                <w:sz w:val="20"/>
+              </w:rPr>
+              <w:t xml:space="preserve">Grados de libertad de la t de Student, estimados por momentos (nu = 4,8)</w:t>
+            </w:r>
+          </w:p>
+        </w:tc>
+        <w:tc>
+          <w:tcPr/>
+          <w:p>
+            <w:pPr>
+              <w:pStyle w:val="Compact"/>
+            </w:pPr>
+            <w:r>
+              <w:rPr>
+                <w:rStyle w:val="VerbatimChar"/>
+                <w:rFonts w:ascii="Calibri" w:hAnsi="Calibri"/>
+                <w:sz w:val="20"/>
+              </w:rPr>
+              <w:t xml:space="preserve">fase17_calibracion_nu_dsa.py</w:t>
+            </w:r>
+          </w:p>
+        </w:tc>
+        <w:tc>
+          <w:tcPr/>
+          <w:p>
+            <w:pPr>
+              <w:pStyle w:val="Compact"/>
+            </w:pPr>
+            <w:r>
+              <w:rPr>
+                <w:rFonts w:ascii="Calibri" w:hAnsi="Calibri"/>
+                <w:sz w:val="20"/>
+              </w:rPr>
+              <w:t xml:space="preserve">Se reutiliza.</w:t>
+            </w:r>
+          </w:p>
+        </w:tc>
+      </w:tr>
+      <w:tr>
+        <w:tc>
+          <w:tcPr/>
+          <w:p>
+            <w:pPr>
+              <w:pStyle w:val="Compact"/>
+            </w:pPr>
+            <w:r>
+              <w:rPr>
+                <w:rFonts w:ascii="Calibri" w:hAnsi="Calibri"/>
+                <w:sz w:val="20"/>
+              </w:rPr>
+              <w:t xml:space="preserve">Umbral de Hansen y TVECM</w:t>
+            </w:r>
+          </w:p>
+        </w:tc>
+        <w:tc>
+          <w:tcPr/>
+          <w:p>
+            <w:pPr>
+              <w:pStyle w:val="Compact"/>
+            </w:pPr>
+            <w:r>
+              <w:rPr>
+                <w:rStyle w:val="VerbatimChar"/>
+                <w:rFonts w:ascii="Calibri" w:hAnsi="Calibri"/>
+                <w:sz w:val="20"/>
+              </w:rPr>
+              <w:t xml:space="preserve">fase5</w:t>
+            </w:r>
+            <w:r>
+              <w:rPr>
+                <w:rFonts w:ascii="Calibri" w:hAnsi="Calibri"/>
+                <w:sz w:val="20"/>
+              </w:rPr>
+              <w:t xml:space="preserve">,</w:t>
+            </w:r>
+            <w:r>
+              <w:rPr>
+                <w:rFonts w:ascii="Calibri" w:hAnsi="Calibri"/>
+                <w:sz w:val="20"/>
+              </w:rPr>
+              <w:t xml:space="preserve"> </w:t>
+            </w:r>
+            <w:r>
+              <w:rPr>
+                <w:rStyle w:val="VerbatimChar"/>
+                <w:rFonts w:ascii="Calibri" w:hAnsi="Calibri"/>
+                <w:sz w:val="20"/>
+              </w:rPr>
+              <w:t xml:space="preserve">fase13</w:t>
+            </w:r>
+            <w:r>
+              <w:rPr>
+                <w:rFonts w:ascii="Calibri" w:hAnsi="Calibri"/>
+                <w:sz w:val="20"/>
+              </w:rPr>
+              <w:t xml:space="preserve">,</w:t>
+            </w:r>
+            <w:r>
+              <w:rPr>
+                <w:rFonts w:ascii="Calibri" w:hAnsi="Calibri"/>
+                <w:sz w:val="20"/>
+              </w:rPr>
+              <w:t xml:space="preserve"> </w:t>
+            </w:r>
+            <w:r>
+              <w:rPr>
+                <w:rStyle w:val="VerbatimChar"/>
+                <w:rFonts w:ascii="Calibri" w:hAnsi="Calibri"/>
+                <w:sz w:val="20"/>
+              </w:rPr>
+              <w:t xml:space="preserve">fase21</w:t>
+            </w:r>
+          </w:p>
+        </w:tc>
+        <w:tc>
+          <w:tcPr/>
+          <w:p>
+            <w:pPr>
+              <w:pStyle w:val="Compact"/>
+            </w:pPr>
+            <w:r>
+              <w:rPr>
+                <w:rFonts w:ascii="Calibri" w:hAnsi="Calibri"/>
+                <w:sz w:val="20"/>
+              </w:rPr>
+              <w:t xml:space="preserve">Queda como resultado complementario de H1a.</w:t>
+            </w:r>
+          </w:p>
+        </w:tc>
+      </w:tr>
+      <w:tr>
+        <w:tc>
+          <w:tcPr/>
+          <w:p>
+            <w:pPr>
+              <w:pStyle w:val="Compact"/>
+            </w:pPr>
+            <w:r>
+              <w:rPr>
+                <w:rFonts w:ascii="Calibri" w:hAnsi="Calibri"/>
+                <w:sz w:val="20"/>
+              </w:rPr>
+              <w:t xml:space="preserve">Simulación (DSA)</w:t>
+            </w:r>
+          </w:p>
+        </w:tc>
+        <w:tc>
+          <w:tcPr/>
+          <w:p>
+            <w:pPr>
+              <w:pStyle w:val="Compact"/>
+            </w:pPr>
+            <w:r>
+              <w:rPr>
+                <w:rStyle w:val="VerbatimChar"/>
+                <w:rFonts w:ascii="Calibri" w:hAnsi="Calibri"/>
+                <w:sz w:val="20"/>
+              </w:rPr>
+              <w:t xml:space="preserve">fase6_sostenibilidad_deuda.py</w:t>
+            </w:r>
+          </w:p>
+        </w:tc>
+        <w:tc>
+          <w:tcPr/>
+          <w:p>
+            <w:pPr>
+              <w:pStyle w:val="Compact"/>
+            </w:pPr>
+            <w:r>
+              <w:rPr>
+                <w:rFonts w:ascii="Calibri" w:hAnsi="Calibri"/>
+                <w:b/>
+                <w:bCs/>
+                <w:sz w:val="20"/>
+              </w:rPr>
+              <w:t xml:space="preserve">Se rehace en buena parte</w:t>
+            </w:r>
+            <w:r>
+              <w:rPr>
+                <w:rFonts w:ascii="Calibri" w:hAnsi="Calibri"/>
+                <w:sz w:val="20"/>
+              </w:rPr>
+              <w:t xml:space="preserve"> </w:t>
+            </w:r>
+            <w:r>
+              <w:rPr>
+                <w:rFonts w:ascii="Calibri" w:hAnsi="Calibri"/>
+                <w:sz w:val="20"/>
+              </w:rPr>
+              <w:t xml:space="preserve">(ver abajo). Se reutilizan la identidad con separación de monedas, la t de Student y los gráficos.</w:t>
+            </w:r>
+          </w:p>
+        </w:tc>
+      </w:tr>
+      <w:tr>
+        <w:tc>
+          <w:tcPr/>
+          <w:p>
+            <w:pPr>
+              <w:pStyle w:val="Compact"/>
+            </w:pPr>
+            <w:r>
+              <w:rPr>
+                <w:rFonts w:ascii="Calibri" w:hAnsi="Calibri"/>
+                <w:sz w:val="20"/>
+              </w:rPr>
+              <w:t xml:space="preserve">DOLS, variables instrumentales, CIR, DCC-GARCH, dependencia de colas, histórico 1983-2025</w:t>
+            </w:r>
+          </w:p>
+        </w:tc>
+        <w:tc>
+          <w:tcPr/>
+          <w:p>
+            <w:pPr>
+              <w:pStyle w:val="Compact"/>
+            </w:pPr>
+            <w:r>
+              <w:rPr>
+                <w:rStyle w:val="VerbatimChar"/>
+                <w:rFonts w:ascii="Calibri" w:hAnsi="Calibri"/>
+                <w:sz w:val="20"/>
+              </w:rPr>
+              <w:t xml:space="preserve">fase3</w:t>
+            </w:r>
+            <w:r>
+              <w:rPr>
+                <w:rFonts w:ascii="Calibri" w:hAnsi="Calibri"/>
+                <w:sz w:val="20"/>
+              </w:rPr>
+              <w:t xml:space="preserve">,</w:t>
+            </w:r>
+            <w:r>
+              <w:rPr>
+                <w:rFonts w:ascii="Calibri" w:hAnsi="Calibri"/>
+                <w:sz w:val="20"/>
+              </w:rPr>
+              <w:t xml:space="preserve"> </w:t>
+            </w:r>
+            <w:r>
+              <w:rPr>
+                <w:rStyle w:val="VerbatimChar"/>
+                <w:rFonts w:ascii="Calibri" w:hAnsi="Calibri"/>
+                <w:sz w:val="20"/>
+              </w:rPr>
+              <w:t xml:space="preserve">fase4</w:t>
+            </w:r>
+            <w:r>
+              <w:rPr>
+                <w:rFonts w:ascii="Calibri" w:hAnsi="Calibri"/>
+                <w:sz w:val="20"/>
+              </w:rPr>
+              <w:t xml:space="preserve">,</w:t>
+            </w:r>
+            <w:r>
+              <w:rPr>
+                <w:rFonts w:ascii="Calibri" w:hAnsi="Calibri"/>
+                <w:sz w:val="20"/>
+              </w:rPr>
+              <w:t xml:space="preserve"> </w:t>
+            </w:r>
+            <w:r>
+              <w:rPr>
+                <w:rStyle w:val="VerbatimChar"/>
+                <w:rFonts w:ascii="Calibri" w:hAnsi="Calibri"/>
+                <w:sz w:val="20"/>
+              </w:rPr>
+              <w:t xml:space="preserve">fase10</w:t>
+            </w:r>
+            <w:r>
+              <w:rPr>
+                <w:rFonts w:ascii="Calibri" w:hAnsi="Calibri"/>
+                <w:sz w:val="20"/>
+              </w:rPr>
+              <w:t xml:space="preserve">,</w:t>
+            </w:r>
+            <w:r>
+              <w:rPr>
+                <w:rFonts w:ascii="Calibri" w:hAnsi="Calibri"/>
+                <w:sz w:val="20"/>
+              </w:rPr>
+              <w:t xml:space="preserve"> </w:t>
+            </w:r>
+            <w:r>
+              <w:rPr>
+                <w:rStyle w:val="VerbatimChar"/>
+                <w:rFonts w:ascii="Calibri" w:hAnsi="Calibri"/>
+                <w:sz w:val="20"/>
+              </w:rPr>
+              <w:t xml:space="preserve">fase11</w:t>
+            </w:r>
+            <w:r>
+              <w:rPr>
+                <w:rFonts w:ascii="Calibri" w:hAnsi="Calibri"/>
+                <w:sz w:val="20"/>
+              </w:rPr>
+              <w:t xml:space="preserve">,</w:t>
+            </w:r>
+            <w:r>
+              <w:rPr>
+                <w:rFonts w:ascii="Calibri" w:hAnsi="Calibri"/>
+                <w:sz w:val="20"/>
+              </w:rPr>
+              <w:t xml:space="preserve"> </w:t>
+            </w:r>
+            <w:r>
+              <w:rPr>
+                <w:rStyle w:val="VerbatimChar"/>
+                <w:rFonts w:ascii="Calibri" w:hAnsi="Calibri"/>
+                <w:sz w:val="20"/>
+              </w:rPr>
+              <w:t xml:space="preserve">fase14</w:t>
+            </w:r>
+            <w:r>
+              <w:rPr>
+                <w:rFonts w:ascii="Calibri" w:hAnsi="Calibri"/>
+                <w:sz w:val="20"/>
+              </w:rPr>
+              <w:t xml:space="preserve">,</w:t>
+            </w:r>
+            <w:r>
+              <w:rPr>
+                <w:rFonts w:ascii="Calibri" w:hAnsi="Calibri"/>
+                <w:sz w:val="20"/>
+              </w:rPr>
+              <w:t xml:space="preserve"> </w:t>
+            </w:r>
+            <w:r>
+              <w:rPr>
+                <w:rStyle w:val="VerbatimChar"/>
+                <w:rFonts w:ascii="Calibri" w:hAnsi="Calibri"/>
+                <w:sz w:val="20"/>
+              </w:rPr>
+              <w:t xml:space="preserve">fase20</w:t>
+            </w:r>
+            <w:r>
+              <w:rPr>
+                <w:rFonts w:ascii="Calibri" w:hAnsi="Calibri"/>
+                <w:sz w:val="20"/>
+              </w:rPr>
+              <w:t xml:space="preserve">,</w:t>
+            </w:r>
+            <w:r>
+              <w:rPr>
+                <w:rFonts w:ascii="Calibri" w:hAnsi="Calibri"/>
+                <w:sz w:val="20"/>
+              </w:rPr>
+              <w:t xml:space="preserve"> </w:t>
+            </w:r>
+            <w:r>
+              <w:rPr>
+                <w:rStyle w:val="VerbatimChar"/>
+                <w:rFonts w:ascii="Calibri" w:hAnsi="Calibri"/>
+                <w:sz w:val="20"/>
+              </w:rPr>
+              <w:t xml:space="preserve">fase22</w:t>
+            </w:r>
+          </w:p>
+        </w:tc>
+        <w:tc>
+          <w:tcPr/>
+          <w:p>
+            <w:pPr>
+              <w:pStyle w:val="Compact"/>
+            </w:pPr>
+            <w:r>
+              <w:rPr>
+                <w:rFonts w:ascii="Calibri" w:hAnsi="Calibri"/>
+                <w:sz w:val="20"/>
+              </w:rPr>
+              <w:t xml:space="preserve">Quedan fuera, como ya se había decidido.</w:t>
             </w:r>
           </w:p>
         </w:tc>
       </w:tr>
     </w:tbl>
-    <w:bookmarkEnd w:id="11"/>
-    <w:bookmarkStart w:id="20" w:name="etapas"/>
+    <w:p>
+      <w:pPr>
+        <w:pStyle w:val="BodyText"/>
+      </w:pPr>
+      <w:r>
+        <w:rPr>
+          <w:b/>
+          <w:bCs/>
+        </w:rPr>
+        <w:t xml:space="preserve">Por qué hay que rehacer la simulación.</w:t>
+      </w:r>
+      <w:r>
+        <w:t xml:space="preserve"> </w:t>
+      </w:r>
+      <w:r>
+        <w:t xml:space="preserve">Revisada con el criterio de que todo número tiene que</w:t>
+      </w:r>
+      <w:r>
+        <w:t xml:space="preserve"> </w:t>
+      </w:r>
+      <w:r>
+        <w:t xml:space="preserve">estar justificado, tiene cuatro problemas:</w:t>
+      </w:r>
+    </w:p>
+    <w:p>
+      <w:pPr>
+        <w:pStyle w:val="Compact"/>
+        <w:numPr>
+          <w:ilvl w:val="0"/>
+          <w:numId w:val="1003"/>
+        </w:numPr>
+      </w:pPr>
+      <w:r>
+        <w:t xml:space="preserve">Los desvíos de los shocks (1,5%, 4%, 5%, 2% y 15%) están</w:t>
+      </w:r>
+      <w:r>
+        <w:t xml:space="preserve"> </w:t>
+      </w:r>
+      <w:r>
+        <w:t xml:space="preserve">“calibrados a mano”</w:t>
+      </w:r>
+      <w:r>
+        <w:t xml:space="preserve">, según el propio</w:t>
+      </w:r>
+      <w:r>
+        <w:t xml:space="preserve"> </w:t>
+      </w:r>
+      <w:r>
+        <w:t xml:space="preserve">código.</w:t>
+      </w:r>
+    </w:p>
+    <w:p>
+      <w:pPr>
+        <w:pStyle w:val="Compact"/>
+        <w:numPr>
+          <w:ilvl w:val="0"/>
+          <w:numId w:val="1003"/>
+        </w:numPr>
+      </w:pPr>
+      <w:r>
+        <w:t xml:space="preserve">Los parámetros del escenario base (resultado primario 1,5%, crecimiento 3,5%, tasa en pesos 6%,</w:t>
+      </w:r>
+      <w:r>
+        <w:t xml:space="preserve"> </w:t>
+      </w:r>
+      <w:r>
+        <w:t xml:space="preserve">tasa en dólares 7,5%) no tienen fuente.</w:t>
+      </w:r>
+    </w:p>
+    <w:p>
+      <w:pPr>
+        <w:pStyle w:val="Compact"/>
+        <w:numPr>
+          <w:ilvl w:val="0"/>
+          <w:numId w:val="1003"/>
+        </w:numPr>
+      </w:pPr>
+      <w:r>
+        <w:t xml:space="preserve">Los shocks son independientes año a año: el SVAR solo aporta las correlaciones, no su</w:t>
+      </w:r>
+      <w:r>
+        <w:t xml:space="preserve"> </w:t>
+      </w:r>
+      <w:r>
+        <w:t xml:space="preserve">dinámica. Así no hay efectos conjuntos, que es lo que pide la pregunta.</w:t>
+      </w:r>
+    </w:p>
+    <w:p>
+      <w:pPr>
+        <w:pStyle w:val="Compact"/>
+        <w:numPr>
+          <w:ilvl w:val="0"/>
+          <w:numId w:val="1003"/>
+        </w:numPr>
+      </w:pPr>
+      <w:r>
+        <w:t xml:space="preserve">Usa el criterio de 100% del PIB, que salió de las hipótesis.</w:t>
+      </w:r>
+    </w:p>
+    <w:p>
+      <w:pPr>
+        <w:pStyle w:val="FirstParagraph"/>
+      </w:pPr>
+      <w:r>
+        <w:t xml:space="preserve">La versión nueva simula directamente desde el SVARX estimado (remuestreo de residuos, con sus</w:t>
+      </w:r>
+      <w:r>
+        <w:t xml:space="preserve"> </w:t>
+      </w:r>
+      <w:r>
+        <w:t xml:space="preserve">rezagos), acumula la deuda con la identidad y calcula las métricas del FMI. Para el escenario base</w:t>
+      </w:r>
+      <w:r>
+        <w:t xml:space="preserve"> </w:t>
+      </w:r>
+      <w:r>
+        <w:t xml:space="preserve">hay que adoptar un sendero con fuente, por ejemplo el del propio FMI (2025), lo que además permite</w:t>
+      </w:r>
+      <w:r>
+        <w:t xml:space="preserve"> </w:t>
+      </w:r>
+      <w:r>
+        <w:t xml:space="preserve">comparar con su resultado.</w:t>
+      </w:r>
+    </w:p>
+    <w:bookmarkEnd w:id="12"/>
+    <w:bookmarkStart w:id="13" w:name="las-cuatro-piezas-que-faltan"/>
+    <w:p>
+      <w:pPr>
+        <w:pStyle w:val="Heading3"/>
+      </w:pPr>
+      <w:r>
+        <w:t xml:space="preserve">Las cuatro piezas que faltan</w:t>
+      </w:r>
+    </w:p>
+    <w:p>
+      <w:pPr>
+        <w:pStyle w:val="Compact"/>
+        <w:numPr>
+          <w:ilvl w:val="0"/>
+          <w:numId w:val="1004"/>
+        </w:numPr>
+      </w:pPr>
+      <w:r>
+        <w:t xml:space="preserve">Deuda consolidada 1996-2025 con un denominador coherente.</w:t>
+      </w:r>
+    </w:p>
+    <w:p>
+      <w:pPr>
+        <w:pStyle w:val="Compact"/>
+        <w:numPr>
+          <w:ilvl w:val="0"/>
+          <w:numId w:val="1004"/>
+        </w:numPr>
+      </w:pPr>
+      <w:r>
+        <w:t xml:space="preserve">Tasa de la FED y tasa sombra (FRED).</w:t>
+      </w:r>
+    </w:p>
+    <w:p>
+      <w:pPr>
+        <w:pStyle w:val="Compact"/>
+        <w:numPr>
+          <w:ilvl w:val="0"/>
+          <w:numId w:val="1004"/>
+        </w:numPr>
+      </w:pPr>
+      <w:r>
+        <w:t xml:space="preserve">SVARX: extender</w:t>
+      </w:r>
+      <w:r>
+        <w:t xml:space="preserve"> </w:t>
+      </w:r>
+      <w:r>
+        <w:rPr>
+          <w:rStyle w:val="VerbatimChar"/>
+        </w:rPr>
+        <w:t xml:space="preserve">fase19</w:t>
+      </w:r>
+      <w:r>
+        <w:t xml:space="preserve"> </w:t>
+      </w:r>
+      <w:r>
+        <w:t xml:space="preserve">con variables exógenas.</w:t>
+      </w:r>
+    </w:p>
+    <w:p>
+      <w:pPr>
+        <w:pStyle w:val="Compact"/>
+        <w:numPr>
+          <w:ilvl w:val="0"/>
+          <w:numId w:val="1004"/>
+        </w:numPr>
+      </w:pPr>
+      <w:r>
+        <w:t xml:space="preserve">Simulación nueva, desde el SVARX y con las métricas del FMI.</w:t>
+      </w:r>
+    </w:p>
+    <w:bookmarkEnd w:id="13"/>
+    <w:bookmarkEnd w:id="14"/>
+    <w:bookmarkStart w:id="15" w:name="decisiones-tomadas"/>
+    <w:p>
+      <w:pPr>
+        <w:pStyle w:val="Heading2"/>
+      </w:pPr>
+      <w:r>
+        <w:t xml:space="preserve">3. Decisiones tomadas</w:t>
+      </w:r>
+    </w:p>
+    <w:tbl>
+      <w:tblPr>
+        <w:tblStyle w:val="Table"/>
+        <w:tblW w:type="pct" w:w="5000"/>
+        <w:tblLayout w:type="fixed"/>
+        <w:tblLook w:firstRow="1" w:lastRow="0" w:firstColumn="0" w:lastColumn="0" w:noHBand="0" w:noVBand="0" w:val="0020"/>
+        <w:tblBorders>
+          <w:top w:val="single" w:sz="4" w:color="808080"/>
+          <w:left w:val="single" w:sz="4" w:color="808080"/>
+          <w:bottom w:val="single" w:sz="4" w:color="808080"/>
+          <w:right w:val="single" w:sz="4" w:color="808080"/>
+          <w:insideH w:val="single" w:sz="4" w:color="808080"/>
+          <w:insideV w:val="single" w:sz="4" w:color="808080"/>
+        </w:tblBorders>
+      </w:tblPr>
+      <w:tblGrid>
+        <w:gridCol w:w="2640"/>
+        <w:gridCol w:w="2640"/>
+        <w:gridCol w:w="2640"/>
+      </w:tblGrid>
+      <w:tr>
+        <w:trPr>
+          <w:tblHeader w:val="on"/>
+        </w:trPr>
+        <w:tc>
+          <w:tcPr/>
+          <w:p>
+            <w:pPr>
+              <w:pStyle w:val="Compact"/>
+            </w:pPr>
+            <w:r>
+              <w:rPr>
+                <w:rFonts w:ascii="Calibri" w:hAnsi="Calibri"/>
+                <w:sz w:val="20"/>
+              </w:rPr>
+              <w:t xml:space="preserve">N.°</w:t>
+            </w:r>
+          </w:p>
+        </w:tc>
+        <w:tc>
+          <w:tcPr/>
+          <w:p>
+            <w:pPr>
+              <w:pStyle w:val="Compact"/>
+            </w:pPr>
+            <w:r>
+              <w:rPr>
+                <w:rFonts w:ascii="Calibri" w:hAnsi="Calibri"/>
+                <w:sz w:val="20"/>
+              </w:rPr>
+              <w:t xml:space="preserve">Decisión</w:t>
+            </w:r>
+          </w:p>
+        </w:tc>
+        <w:tc>
+          <w:tcPr/>
+          <w:p>
+            <w:pPr>
+              <w:pStyle w:val="Compact"/>
+            </w:pPr>
+            <w:r>
+              <w:rPr>
+                <w:rFonts w:ascii="Calibri" w:hAnsi="Calibri"/>
+                <w:sz w:val="20"/>
+              </w:rPr>
+              <w:t xml:space="preserve">Justificación</w:t>
+            </w:r>
+          </w:p>
+        </w:tc>
+      </w:tr>
+      <w:tr>
+        <w:tc>
+          <w:tcPr/>
+          <w:p>
+            <w:pPr>
+              <w:pStyle w:val="Compact"/>
+            </w:pPr>
+            <w:r>
+              <w:rPr>
+                <w:rFonts w:ascii="Calibri" w:hAnsi="Calibri"/>
+                <w:sz w:val="20"/>
+              </w:rPr>
+              <w:t xml:space="preserve">1</w:t>
+            </w:r>
+          </w:p>
+        </w:tc>
+        <w:tc>
+          <w:tcPr/>
+          <w:p>
+            <w:pPr>
+              <w:pStyle w:val="Compact"/>
+            </w:pPr>
+            <w:r>
+              <w:rPr>
+                <w:rFonts w:ascii="Calibri" w:hAnsi="Calibri"/>
+                <w:sz w:val="20"/>
+              </w:rPr>
+              <w:t xml:space="preserve">La Introducción de Santiago del 7/10 es la base, completada con la Justificación y los objetivos específicos del texto LaTeX.</w:t>
+            </w:r>
+          </w:p>
+        </w:tc>
+        <w:tc>
+          <w:tcPr/>
+          <w:p>
+            <w:pPr>
+              <w:pStyle w:val="Compact"/>
+            </w:pPr>
+            <w:r>
+              <w:rPr>
+                <w:rFonts w:ascii="Calibri" w:hAnsi="Calibri"/>
+                <w:sz w:val="20"/>
+              </w:rPr>
+              <w:t xml:space="preserve">Es la versión más reciente y ya fue revisada.</w:t>
+            </w:r>
+          </w:p>
+        </w:tc>
+      </w:tr>
+      <w:tr>
+        <w:tc>
+          <w:tcPr/>
+          <w:p>
+            <w:pPr>
+              <w:pStyle w:val="Compact"/>
+            </w:pPr>
+            <w:r>
+              <w:rPr>
+                <w:rFonts w:ascii="Calibri" w:hAnsi="Calibri"/>
+                <w:sz w:val="20"/>
+              </w:rPr>
+              <w:t xml:space="preserve">2</w:t>
+            </w:r>
+          </w:p>
+        </w:tc>
+        <w:tc>
+          <w:tcPr/>
+          <w:p>
+            <w:pPr>
+              <w:pStyle w:val="Compact"/>
+            </w:pPr>
+            <w:r>
+              <w:rPr>
+                <w:rFonts w:ascii="Calibri" w:hAnsi="Calibri"/>
+                <w:sz w:val="20"/>
+              </w:rPr>
+              <w:t xml:space="preserve">Todo el trabajo empírico (modelo y simulación) se hace sobre la deuda consolidada SPNF y BCRA.</w:t>
+            </w:r>
+          </w:p>
+        </w:tc>
+        <w:tc>
+          <w:tcPr/>
+          <w:p>
+            <w:pPr>
+              <w:pStyle w:val="Compact"/>
+            </w:pPr>
+            <w:r>
+              <w:rPr>
+                <w:rFonts w:ascii="Calibri" w:hAnsi="Calibri"/>
+                <w:sz w:val="20"/>
+              </w:rPr>
+              <w:t xml:space="preserve">Es el perímetro que plantea la pregunta de investigación, y el FMI considera deuda pública a los pasivos del banco central cuando pueden financiar al Tesoro o implican riesgo fiscal (FMI, 2021, anexo II).</w:t>
+            </w:r>
+          </w:p>
+        </w:tc>
+      </w:tr>
+      <w:tr>
+        <w:tc>
+          <w:tcPr/>
+          <w:p>
+            <w:pPr>
+              <w:pStyle w:val="Compact"/>
+            </w:pPr>
+            <w:r>
+              <w:rPr>
+                <w:rFonts w:ascii="Calibri" w:hAnsi="Calibri"/>
+                <w:sz w:val="20"/>
+              </w:rPr>
+              <w:t xml:space="preserve">3</w:t>
+            </w:r>
+          </w:p>
+        </w:tc>
+        <w:tc>
+          <w:tcPr/>
+          <w:p>
+            <w:pPr>
+              <w:pStyle w:val="Compact"/>
+            </w:pPr>
+            <w:r>
+              <w:rPr>
+                <w:rFonts w:ascii="Calibri" w:hAnsi="Calibri"/>
+                <w:sz w:val="20"/>
+              </w:rPr>
+              <w:t xml:space="preserve">El modelo es un SVARX: la deuda consolidada es una variable más del sistema, con la tasa de la FED y la volatilidad global como variables exógenas.</w:t>
+            </w:r>
+          </w:p>
+        </w:tc>
+        <w:tc>
+          <w:tcPr/>
+          <w:p>
+            <w:pPr>
+              <w:pStyle w:val="Compact"/>
+            </w:pPr>
+            <w:r>
+              <w:rPr>
+                <w:rFonts w:ascii="Calibri" w:hAnsi="Calibri"/>
+                <w:sz w:val="20"/>
+              </w:rPr>
+              <w:t xml:space="preserve">Permite efectos conjuntos: la deuda responde a los shocks y a su vez los afecta. Es lo que hace falta para medir cómo un shock de la FED vuelve sobre la deuda a través del riesgo país y del tipo de cambio.</w:t>
+            </w:r>
+          </w:p>
+        </w:tc>
+      </w:tr>
+      <w:tr>
+        <w:tc>
+          <w:tcPr/>
+          <w:p>
+            <w:pPr>
+              <w:pStyle w:val="Compact"/>
+            </w:pPr>
+            <w:r>
+              <w:rPr>
+                <w:rFonts w:ascii="Calibri" w:hAnsi="Calibri"/>
+                <w:sz w:val="20"/>
+              </w:rPr>
+              <w:t xml:space="preserve">4</w:t>
+            </w:r>
+          </w:p>
+        </w:tc>
+        <w:tc>
+          <w:tcPr/>
+          <w:p>
+            <w:pPr>
+              <w:pStyle w:val="Compact"/>
+            </w:pPr>
+            <w:r>
+              <w:rPr>
+                <w:rFonts w:ascii="Calibri" w:hAnsi="Calibri"/>
+                <w:sz w:val="20"/>
+              </w:rPr>
+              <w:t xml:space="preserve">La identificación principal es el SVAR restringido por teoría que ya existe. El ordenamiento de Cholesky queda solo como prueba de robustez.</w:t>
+            </w:r>
+          </w:p>
+        </w:tc>
+        <w:tc>
+          <w:tcPr/>
+          <w:p>
+            <w:pPr>
+              <w:pStyle w:val="Compact"/>
+            </w:pPr>
+            <w:r>
+              <w:rPr>
+                <w:rFonts w:ascii="Calibri" w:hAnsi="Calibri"/>
+                <w:sz w:val="20"/>
+              </w:rPr>
+              <w:t xml:space="preserve">No hay razón teórica para ordenar el EMBI+ y el TCRM entre sí, y esa justificación ya fue aprobada por el director.</w:t>
+            </w:r>
+          </w:p>
+        </w:tc>
+      </w:tr>
+      <w:tr>
+        <w:tc>
+          <w:tcPr/>
+          <w:p>
+            <w:pPr>
+              <w:pStyle w:val="Compact"/>
+            </w:pPr>
+            <w:r>
+              <w:rPr>
+                <w:rFonts w:ascii="Calibri" w:hAnsi="Calibri"/>
+                <w:sz w:val="20"/>
+              </w:rPr>
+              <w:t xml:space="preserve">5</w:t>
+            </w:r>
+          </w:p>
+        </w:tc>
+        <w:tc>
+          <w:tcPr/>
+          <w:p>
+            <w:pPr>
+              <w:pStyle w:val="Compact"/>
+            </w:pPr>
+            <w:r>
+              <w:rPr>
+                <w:rFonts w:ascii="Calibri" w:hAnsi="Calibri"/>
+                <w:sz w:val="20"/>
+              </w:rPr>
+              <w:t xml:space="preserve">H1b se contrasta con la probabilidad de que la deuda no se estabilice, con corte en 50%.</w:t>
+            </w:r>
+          </w:p>
+        </w:tc>
+        <w:tc>
+          <w:tcPr/>
+          <w:p>
+            <w:pPr>
+              <w:pStyle w:val="Compact"/>
+            </w:pPr>
+            <w:r>
+              <w:rPr>
+                <w:rFonts w:ascii="Calibri" w:hAnsi="Calibri"/>
+                <w:sz w:val="20"/>
+              </w:rPr>
+              <w:t xml:space="preserve">Es la métrica del FMI (FMI, 2021, párr. 53). El 50% equivale a afirmar que la trayectoria mediana no se estabiliza. El corte calibrado del FMI no se puede replicar con un solo país. Se reporta también la probabilidad completa, para que el resultado no dependa del corte.</w:t>
+            </w:r>
+          </w:p>
+        </w:tc>
+      </w:tr>
+      <w:tr>
+        <w:tc>
+          <w:tcPr/>
+          <w:p>
+            <w:pPr>
+              <w:pStyle w:val="Compact"/>
+            </w:pPr>
+            <w:r>
+              <w:rPr>
+                <w:rFonts w:ascii="Calibri" w:hAnsi="Calibri"/>
+                <w:sz w:val="20"/>
+              </w:rPr>
+              <w:t xml:space="preserve">6</w:t>
+            </w:r>
+          </w:p>
+        </w:tc>
+        <w:tc>
+          <w:tcPr/>
+          <w:p>
+            <w:pPr>
+              <w:pStyle w:val="Compact"/>
+            </w:pPr>
+            <w:r>
+              <w:rPr>
+                <w:rFonts w:ascii="Calibri" w:hAnsi="Calibri"/>
+                <w:sz w:val="20"/>
+              </w:rPr>
+              <w:t xml:space="preserve">El criterio</w:t>
+            </w:r>
+            <w:r>
+              <w:rPr>
+                <w:rFonts w:ascii="Calibri" w:hAnsi="Calibri"/>
+                <w:sz w:val="20"/>
+              </w:rPr>
+              <w:t xml:space="preserve"> </w:t>
+            </w:r>
+            <w:r>
+              <w:rPr>
+                <w:rFonts w:ascii="Calibri" w:hAnsi="Calibri"/>
+                <w:sz w:val="20"/>
+              </w:rPr>
+              <w:t xml:space="preserve">“deuda mayor a 100% del PIB”</w:t>
+            </w:r>
+            <w:r>
+              <w:rPr>
+                <w:rFonts w:ascii="Calibri" w:hAnsi="Calibri"/>
+                <w:sz w:val="20"/>
+              </w:rPr>
+              <w:t xml:space="preserve"> </w:t>
+            </w:r>
+            <w:r>
+              <w:rPr>
+                <w:rFonts w:ascii="Calibri" w:hAnsi="Calibri"/>
+                <w:sz w:val="20"/>
+              </w:rPr>
+              <w:t xml:space="preserve">sale de las hipótesis.</w:t>
+            </w:r>
+          </w:p>
+        </w:tc>
+        <w:tc>
+          <w:tcPr/>
+          <w:p>
+            <w:pPr>
+              <w:pStyle w:val="Compact"/>
+            </w:pPr>
+            <w:r>
+              <w:rPr>
+                <w:rFonts w:ascii="Calibri" w:hAnsi="Calibri"/>
+                <w:sz w:val="20"/>
+              </w:rPr>
+              <w:t xml:space="preserve">No tiene fuente que lo justifique.</w:t>
+            </w:r>
+          </w:p>
+        </w:tc>
+      </w:tr>
+      <w:tr>
+        <w:tc>
+          <w:tcPr/>
+          <w:p>
+            <w:pPr>
+              <w:pStyle w:val="Compact"/>
+            </w:pPr>
+            <w:r>
+              <w:rPr>
+                <w:rFonts w:ascii="Calibri" w:hAnsi="Calibri"/>
+                <w:sz w:val="20"/>
+              </w:rPr>
+              <w:t xml:space="preserve">7</w:t>
+            </w:r>
+          </w:p>
+        </w:tc>
+        <w:tc>
+          <w:tcPr/>
+          <w:p>
+            <w:pPr>
+              <w:pStyle w:val="Compact"/>
+            </w:pPr>
+            <w:r>
+              <w:rPr>
+                <w:rFonts w:ascii="Calibri" w:hAnsi="Calibri"/>
+                <w:sz w:val="20"/>
+              </w:rPr>
+              <w:t xml:space="preserve">El área de vacancia se reformula.</w:t>
+            </w:r>
+          </w:p>
+        </w:tc>
+        <w:tc>
+          <w:tcPr/>
+          <w:p>
+            <w:pPr>
+              <w:pStyle w:val="Compact"/>
+            </w:pPr>
+            <w:r>
+              <w:rPr>
+                <w:rFonts w:ascii="Calibri" w:hAnsi="Calibri"/>
+                <w:sz w:val="20"/>
+              </w:rPr>
+              <w:t xml:space="preserve">El marco del FMI sí admite incluir los pasivos del banco central (FMI, 2021, anexo II), pero en su análisis de Argentina corre las herramientas sobre la deuda federal bruta y muestra la consolidada solo como cuadro (FMI, 2025, anexo II, cuadro 2). La vacancia pasa a ser la combinación de tres aspectos: identificación estructural, un shock externo identificado y la estimación sobre el perímetro consolidado.</w:t>
+            </w:r>
+          </w:p>
+        </w:tc>
+      </w:tr>
+      <w:tr>
+        <w:tc>
+          <w:tcPr/>
+          <w:p>
+            <w:pPr>
+              <w:pStyle w:val="Compact"/>
+            </w:pPr>
+            <w:r>
+              <w:rPr>
+                <w:rFonts w:ascii="Calibri" w:hAnsi="Calibri"/>
+                <w:sz w:val="20"/>
+              </w:rPr>
+              <w:t xml:space="preserve">8</w:t>
+            </w:r>
+          </w:p>
+        </w:tc>
+        <w:tc>
+          <w:tcPr/>
+          <w:p>
+            <w:pPr>
+              <w:pStyle w:val="Compact"/>
+            </w:pPr>
+            <w:r>
+              <w:rPr>
+                <w:rFonts w:ascii="Calibri" w:hAnsi="Calibri"/>
+                <w:sz w:val="20"/>
+              </w:rPr>
+              <w:t xml:space="preserve">El canal cuasifiscal del shock de la FED se redacta en pasado.</w:t>
+            </w:r>
+          </w:p>
+        </w:tc>
+        <w:tc>
+          <w:tcPr/>
+          <w:p>
+            <w:pPr>
+              <w:pStyle w:val="Compact"/>
+            </w:pPr>
+            <w:r>
+              <w:rPr>
+                <w:rFonts w:ascii="Calibri" w:hAnsi="Calibri"/>
+                <w:sz w:val="20"/>
+              </w:rPr>
+              <w:t xml:space="preserve">Los pasivos remunerados del BCRA se redujeron a niveles mínimos desde 2024.</w:t>
+            </w:r>
+          </w:p>
+        </w:tc>
+      </w:tr>
+      <w:tr>
+        <w:tc>
+          <w:tcPr/>
+          <w:p>
+            <w:pPr>
+              <w:pStyle w:val="Compact"/>
+            </w:pPr>
+            <w:r>
+              <w:rPr>
+                <w:rFonts w:ascii="Calibri" w:hAnsi="Calibri"/>
+                <w:sz w:val="20"/>
+              </w:rPr>
+              <w:t xml:space="preserve">9</w:t>
+            </w:r>
+          </w:p>
+        </w:tc>
+        <w:tc>
+          <w:tcPr/>
+          <w:p>
+            <w:pPr>
+              <w:pStyle w:val="Compact"/>
+            </w:pPr>
+            <w:r>
+              <w:rPr>
+                <w:rFonts w:ascii="Calibri" w:hAnsi="Calibri"/>
+                <w:sz w:val="20"/>
+              </w:rPr>
+              <w:t xml:space="preserve">El módulo de balanza de pagos (exportaciones, importaciones, inversión extranjera directa, fuga de capitales, renovación de vencimientos, necesidades de financiamiento) queda fuera y pasa a investigación futura.</w:t>
+            </w:r>
+          </w:p>
+        </w:tc>
+        <w:tc>
+          <w:tcPr/>
+          <w:p>
+            <w:pPr>
+              <w:pStyle w:val="Compact"/>
+            </w:pPr>
+            <w:r>
+              <w:rPr>
+                <w:rFonts w:ascii="Calibri" w:hAnsi="Calibri"/>
+                <w:sz w:val="20"/>
+              </w:rPr>
+              <w:t xml:space="preserve">No está especificado, y su tamaño es el de otra tesis.</w:t>
+            </w:r>
+          </w:p>
+        </w:tc>
+      </w:tr>
+      <w:tr>
+        <w:tc>
+          <w:tcPr/>
+          <w:p>
+            <w:pPr>
+              <w:pStyle w:val="Compact"/>
+            </w:pPr>
+            <w:r>
+              <w:rPr>
+                <w:rFonts w:ascii="Calibri" w:hAnsi="Calibri"/>
+                <w:sz w:val="20"/>
+              </w:rPr>
+              <w:t xml:space="preserve">10</w:t>
+            </w:r>
+          </w:p>
+        </w:tc>
+        <w:tc>
+          <w:tcPr/>
+          <w:p>
+            <w:pPr>
+              <w:pStyle w:val="Compact"/>
+            </w:pPr>
+            <w:r>
+              <w:rPr>
+                <w:rFonts w:ascii="Calibri" w:hAnsi="Calibri"/>
+                <w:sz w:val="20"/>
+              </w:rPr>
+              <w:t xml:space="preserve">Todo umbral, corte o tamaño de shock tiene que tener una justificación escrita, propia o citada.</w:t>
+            </w:r>
+          </w:p>
+        </w:tc>
+        <w:tc>
+          <w:tcPr/>
+          <w:p>
+            <w:pPr>
+              <w:pStyle w:val="Compact"/>
+            </w:pPr>
+            <w:r>
+              <w:rPr>
+                <w:rFonts w:ascii="Calibri" w:hAnsi="Calibri"/>
+                <w:sz w:val="20"/>
+              </w:rPr>
+              <w:t xml:space="preserve">Criterio del grupo.</w:t>
+            </w:r>
+          </w:p>
+        </w:tc>
+      </w:tr>
+    </w:tbl>
+    <w:bookmarkEnd w:id="15"/>
+    <w:bookmarkStart w:id="24" w:name="etapas"/>
     <w:p>
       <w:pPr>
         <w:pStyle w:val="Heading2"/>
@@ -899,13 +2339,13 @@
         <w:t xml:space="preserve">.</w:t>
       </w:r>
     </w:p>
-    <w:bookmarkStart w:id="12" w:name="etapa-1.-introducción-en-curso"/>
+    <w:bookmarkStart w:id="16" w:name="X448d40dca89f9f9c4f6217ad26cdb620dc83252"/>
     <w:p>
       <w:pPr>
         <w:pStyle w:val="Heading3"/>
       </w:pPr>
       <w:r>
-        <w:t xml:space="preserve">Etapa 1. Introducción (en curso)</w:t>
+        <w:t xml:space="preserve">Etapa 1. Introducción (borrador listo para revisión del grupo)</w:t>
       </w:r>
     </w:p>
     <w:p>
@@ -913,7 +2353,7 @@
         <w:pStyle w:val="Compact"/>
         <w:numPr>
           <w:ilvl w:val="0"/>
-          <w:numId w:val="1003"/>
+          <w:numId w:val="1005"/>
         </w:numPr>
       </w:pPr>
       <w:r>
@@ -952,112 +2392,21 @@
         <w:pStyle w:val="Compact"/>
         <w:numPr>
           <w:ilvl w:val="0"/>
-          <w:numId w:val="1003"/>
-        </w:numPr>
-      </w:pPr>
-      <w:r>
-        <w:t xml:space="preserve">Pendiente: definir el tamaño del shock de la FED (ver punto 6) y verificar los datos marcados.</w:t>
-      </w:r>
-    </w:p>
-    <w:bookmarkEnd w:id="12"/>
-    <w:bookmarkStart w:id="13" w:name="X8a765d22a67875d9611bde465a64a4e2920c3f8"/>
-    <w:p>
-      <w:pPr>
-        <w:pStyle w:val="Heading3"/>
-      </w:pPr>
-      <w:r>
-        <w:t xml:space="preserve">Etapa 2. Antecedentes y área de vacancia (en curso)</w:t>
-      </w:r>
-    </w:p>
-    <w:p>
-      <w:pPr>
-        <w:pStyle w:val="Compact"/>
-        <w:numPr>
-          <w:ilvl w:val="0"/>
-          <w:numId w:val="1004"/>
-        </w:numPr>
-      </w:pPr>
-      <w:r>
-        <w:t xml:space="preserve">Hecho: borrador de la vacancia (</w:t>
-      </w:r>
-      <w:r>
-        <w:rPr>
-          <w:rStyle w:val="VerbatimChar"/>
-        </w:rPr>
-        <w:t xml:space="preserve">area_vacancia_v1</w:t>
-      </w:r>
-      <w:r>
-        <w:t xml:space="preserve">).</w:t>
-      </w:r>
-    </w:p>
-    <w:p>
-      <w:pPr>
-        <w:pStyle w:val="Compact"/>
-        <w:numPr>
-          <w:ilvl w:val="0"/>
-          <w:numId w:val="1004"/>
-        </w:numPr>
-      </w:pPr>
-      <w:r>
-        <w:t xml:space="preserve">Pendiente:</w:t>
-      </w:r>
-    </w:p>
-    <w:p>
-      <w:pPr>
-        <w:pStyle w:val="Compact"/>
-        <w:numPr>
-          <w:ilvl w:val="1"/>
           <w:numId w:val="1005"/>
         </w:numPr>
       </w:pPr>
       <w:r>
-        <w:t xml:space="preserve">bajar a mano el informe del FMI sobre Argentina de 2025 (Informe de País N.° 25/95, anexo I)</w:t>
-      </w:r>
-      <w:r>
-        <w:t xml:space="preserve"> </w:t>
-      </w:r>
-      <w:r>
-        <w:t xml:space="preserve">para confirmar si incluye la deuda del BCRA;</w:t>
-      </w:r>
-    </w:p>
-    <w:p>
-      <w:pPr>
-        <w:pStyle w:val="Compact"/>
-        <w:numPr>
-          <w:ilvl w:val="1"/>
-          <w:numId w:val="1005"/>
-        </w:numPr>
-      </w:pPr>
-      <w:r>
-        <w:t xml:space="preserve">releer Levy Yeyati y Sturzenegger (2023) y Klemm et al. (2014) para confirmar cómo se los</w:t>
-      </w:r>
-      <w:r>
-        <w:t xml:space="preserve"> </w:t>
-      </w:r>
-      <w:r>
-        <w:t xml:space="preserve">describe;</w:t>
-      </w:r>
-    </w:p>
-    <w:p>
-      <w:pPr>
-        <w:pStyle w:val="Compact"/>
-        <w:numPr>
-          <w:ilvl w:val="1"/>
-          <w:numId w:val="1005"/>
-        </w:numPr>
-      </w:pPr>
-      <w:r>
-        <w:t xml:space="preserve">fusionar los antecedentes de Santiago con los del texto LaTeX, sin duplicar autores.</w:t>
-      </w:r>
-    </w:p>
-    <w:bookmarkEnd w:id="13"/>
-    <w:bookmarkStart w:id="14" w:name="X7986390af5f7f4df758a01518b5d5b90eb0dffc"/>
+        <w:t xml:space="preserve">Pendiente: definir el tamaño del shock de la FED (ver punto 6) y verificar los datos marcados.</w:t>
+      </w:r>
+    </w:p>
+    <w:bookmarkEnd w:id="16"/>
+    <w:bookmarkStart w:id="17" w:name="X54a10ff3e6f155a28511cdc459424258071cfb3"/>
     <w:p>
       <w:pPr>
         <w:pStyle w:val="Heading3"/>
       </w:pPr>
       <w:r>
-        <w:t xml:space="preserve">Etapa 3. Datos (pendiente; es el siguiente paso técnico)</w:t>
+        <w:t xml:space="preserve">Etapa 2. Antecedentes y área de vacancia (borrador listo para revisión del grupo)</w:t>
       </w:r>
     </w:p>
     <w:p>
@@ -1069,7 +2418,7 @@
         </w:numPr>
       </w:pPr>
       <w:r>
-        <w:t xml:space="preserve">Construir la deuda consolidada 1996-2025:</w:t>
+        <w:t xml:space="preserve">Hecho:</w:t>
       </w:r>
     </w:p>
     <w:p>
@@ -1081,13 +2430,22 @@
         </w:numPr>
       </w:pPr>
       <w:r>
-        <w:t xml:space="preserve">bajar de la API del BCRA los pases (serie 1261) y las LEBAC (serie 1258) para 1996-2003;</w:t>
-      </w:r>
-      <w:r>
-        <w:t xml:space="preserve"> </w:t>
-      </w:r>
-      <w:r>
-        <w:t xml:space="preserve">las LEBAC empiezan en 2002, así que antes de ese año valen cero;</w:t>
+        <w:t xml:space="preserve">los antecedentes de Santiago y los del texto LaTeX quedaron fusionados en ocho ejes, más la</w:t>
+      </w:r>
+      <w:r>
+        <w:t xml:space="preserve"> </w:t>
+      </w:r>
+      <w:r>
+        <w:t xml:space="preserve">vacancia (</w:t>
+      </w:r>
+      <w:r>
+        <w:rPr>
+          <w:rStyle w:val="VerbatimChar"/>
+        </w:rPr>
+        <w:t xml:space="preserve">antecedentes_v3</w:t>
+      </w:r>
+      <w:r>
+        <w:t xml:space="preserve">);</w:t>
       </w:r>
     </w:p>
     <w:p>
@@ -1099,7 +2457,13 @@
         </w:numPr>
       </w:pPr>
       <w:r>
-        <w:t xml:space="preserve">empalmar el PIB nominal base 1993 con el base 2004;</w:t>
+        <w:t xml:space="preserve">se verificó en el informe del FMI de 2025 (Informe de País N.° 25/95, anexo II) el perímetro</w:t>
+      </w:r>
+      <w:r>
+        <w:t xml:space="preserve"> </w:t>
+      </w:r>
+      <w:r>
+        <w:t xml:space="preserve">que usa ese organismo;</w:t>
       </w:r>
     </w:p>
     <w:p>
@@ -1111,13 +2475,7 @@
         </w:numPr>
       </w:pPr>
       <w:r>
-        <w:t xml:space="preserve">verificar que la deuda del SPNF y los pasivos del BCRA estén expresados sobre el mismo PIB</w:t>
-      </w:r>
-      <w:r>
-        <w:t xml:space="preserve"> </w:t>
-      </w:r>
-      <w:r>
-        <w:t xml:space="preserve">antes de sumarlos.</w:t>
+        <w:t xml:space="preserve">Introducción y Antecedentes quedaron en un solo Word.</w:t>
       </w:r>
     </w:p>
     <w:p>
@@ -1129,129 +2487,53 @@
         </w:numPr>
       </w:pPr>
       <w:r>
-        <w:t xml:space="preserve">Recalcular la proporción de deuda en pesos para el perímetro consolidado. Hoy el código usa</w:t>
-      </w:r>
-      <w:r>
-        <w:t xml:space="preserve"> </w:t>
-      </w:r>
-      <w:r>
-        <w:t xml:space="preserve">46,3% para el SPNF solo.</w:t>
+        <w:t xml:space="preserve">Pendiente:</w:t>
       </w:r>
     </w:p>
     <w:p>
       <w:pPr>
         <w:pStyle w:val="Compact"/>
         <w:numPr>
-          <w:ilvl w:val="0"/>
-          <w:numId w:val="1006"/>
+          <w:ilvl w:val="1"/>
+          <w:numId w:val="1008"/>
         </w:numPr>
       </w:pPr>
       <w:r>
-        <w:t xml:space="preserve">Bajar la tasa de la FED y la tasa sombra de Wu y Xia (que cubre los años de tasa cero) desde</w:t>
-      </w:r>
-      <w:r>
-        <w:t xml:space="preserve"> </w:t>
-      </w:r>
-      <w:r>
-        <w:t xml:space="preserve">FRED, y pasarlas a frecuencia trimestral.</w:t>
+        <w:t xml:space="preserve">resolver cuatro referencias que aparecen con dos versiones distintas: Adler y Sosa, Adler y</w:t>
+      </w:r>
+      <w:r>
+        <w:t xml:space="preserve"> </w:t>
+      </w:r>
+      <w:r>
+        <w:t xml:space="preserve">Magud, Cetrángolo et al., y Wijayanti y Rachmanira;</w:t>
       </w:r>
     </w:p>
     <w:p>
       <w:pPr>
         <w:pStyle w:val="Compact"/>
         <w:numPr>
-          <w:ilvl w:val="0"/>
-          <w:numId w:val="1006"/>
-        </w:numPr>
-      </w:pPr>
-      <w:r>
-        <w:t xml:space="preserve">Validación: gráfico y valores de control de cada serie, revisados por el grupo antes de</w:t>
-      </w:r>
-      <w:r>
-        <w:t xml:space="preserve"> </w:t>
-      </w:r>
-      <w:r>
-        <w:t xml:space="preserve">seguir.</w:t>
-      </w:r>
-    </w:p>
-    <w:bookmarkEnd w:id="14"/>
-    <w:bookmarkStart w:id="15" w:name="etapa-4.-metodología-pendiente"/>
-    <w:p>
-      <w:pPr>
-        <w:pStyle w:val="Heading3"/>
-      </w:pPr>
-      <w:r>
-        <w:t xml:space="preserve">Etapa 4. Metodología (pendiente)</w:t>
-      </w:r>
-    </w:p>
-    <w:p>
-      <w:pPr>
-        <w:pStyle w:val="Compact"/>
-        <w:numPr>
-          <w:ilvl w:val="0"/>
+          <w:ilvl w:val="1"/>
           <w:numId w:val="1008"/>
         </w:numPr>
       </w:pPr>
       <w:r>
-        <w:t xml:space="preserve">Reescribir el capítulo con el SVARX y la identificación.</w:t>
-      </w:r>
-    </w:p>
-    <w:p>
-      <w:pPr>
-        <w:pStyle w:val="Compact"/>
-        <w:numPr>
-          <w:ilvl w:val="0"/>
-          <w:numId w:val="1008"/>
-        </w:numPr>
-      </w:pPr>
-      <w:r>
-        <w:t xml:space="preserve">Definir el tamaño del shock de la FED con criterio justificado: un desvío estándar de la</w:t>
-      </w:r>
-      <w:r>
-        <w:t xml:space="preserve"> </w:t>
-      </w:r>
-      <w:r>
-        <w:t xml:space="preserve">serie, un episodio histórico como el de 2022-2023, o ambos.</w:t>
-      </w:r>
-    </w:p>
-    <w:p>
-      <w:pPr>
-        <w:pStyle w:val="Compact"/>
-        <w:numPr>
-          <w:ilvl w:val="0"/>
-          <w:numId w:val="1008"/>
-        </w:numPr>
-      </w:pPr>
-      <w:r>
-        <w:t xml:space="preserve">Justificar el corte de H1b, siguiendo lo ya escrito en la Introducción.</w:t>
-      </w:r>
-    </w:p>
-    <w:p>
-      <w:pPr>
-        <w:pStyle w:val="Compact"/>
-        <w:numPr>
-          <w:ilvl w:val="0"/>
-          <w:numId w:val="1008"/>
-        </w:numPr>
-      </w:pPr>
-      <w:r>
-        <w:t xml:space="preserve">Agregar diagnósticos de residuos: autocorrelación, heterocedasticidad, normalidad y</w:t>
-      </w:r>
-      <w:r>
-        <w:t xml:space="preserve"> </w:t>
-      </w:r>
-      <w:r>
-        <w:t xml:space="preserve">estabilidad.</w:t>
-      </w:r>
-    </w:p>
-    <w:bookmarkEnd w:id="15"/>
-    <w:bookmarkStart w:id="16" w:name="etapa-5.-estimación-pendiente"/>
+        <w:t xml:space="preserve">releer Levy Yeyati y Sturzenegger (2023), Klemm et al. (2014), Porto (2020) y Bouabdallah et</w:t>
+      </w:r>
+      <w:r>
+        <w:t xml:space="preserve"> </w:t>
+      </w:r>
+      <w:r>
+        <w:t xml:space="preserve">al. (2017).</w:t>
+      </w:r>
+    </w:p>
+    <w:bookmarkEnd w:id="17"/>
+    <w:bookmarkStart w:id="18" w:name="X7986390af5f7f4df758a01518b5d5b90eb0dffc"/>
     <w:p>
       <w:pPr>
         <w:pStyle w:val="Heading3"/>
       </w:pPr>
       <w:r>
-        <w:t xml:space="preserve">Etapa 5. Estimación (pendiente)</w:t>
+        <w:t xml:space="preserve">Etapa 3. Datos (pendiente; es el siguiente paso técnico)</w:t>
       </w:r>
     </w:p>
     <w:p>
@@ -1263,7 +2545,55 @@
         </w:numPr>
       </w:pPr>
       <w:r>
-        <w:t xml:space="preserve">Pruebas de raíz unitaria y de quiebres sobre la serie consolidada.</w:t>
+        <w:t xml:space="preserve">Construir la deuda consolidada 1996-2025:</w:t>
+      </w:r>
+    </w:p>
+    <w:p>
+      <w:pPr>
+        <w:pStyle w:val="Compact"/>
+        <w:numPr>
+          <w:ilvl w:val="1"/>
+          <w:numId w:val="1010"/>
+        </w:numPr>
+      </w:pPr>
+      <w:r>
+        <w:t xml:space="preserve">bajar de la API del BCRA los pases (serie 1261) y las LEBAC (serie 1258) para 1996-2003;</w:t>
+      </w:r>
+      <w:r>
+        <w:t xml:space="preserve"> </w:t>
+      </w:r>
+      <w:r>
+        <w:t xml:space="preserve">las LEBAC empiezan en 2002, así que antes de ese año valen cero;</w:t>
+      </w:r>
+    </w:p>
+    <w:p>
+      <w:pPr>
+        <w:pStyle w:val="Compact"/>
+        <w:numPr>
+          <w:ilvl w:val="1"/>
+          <w:numId w:val="1010"/>
+        </w:numPr>
+      </w:pPr>
+      <w:r>
+        <w:t xml:space="preserve">empalmar el PIB nominal base 1993 con el base 2004;</w:t>
+      </w:r>
+    </w:p>
+    <w:p>
+      <w:pPr>
+        <w:pStyle w:val="Compact"/>
+        <w:numPr>
+          <w:ilvl w:val="1"/>
+          <w:numId w:val="1010"/>
+        </w:numPr>
+      </w:pPr>
+      <w:r>
+        <w:t xml:space="preserve">verificar que la deuda del SPNF y los pasivos del BCRA estén expresados sobre el mismo PIB</w:t>
+      </w:r>
+      <w:r>
+        <w:t xml:space="preserve"> </w:t>
+      </w:r>
+      <w:r>
+        <w:t xml:space="preserve">antes de sumarlos.</w:t>
       </w:r>
     </w:p>
     <w:p>
@@ -1275,7 +2605,13 @@
         </w:numPr>
       </w:pPr>
       <w:r>
-        <w:t xml:space="preserve">SVARX con dummies en los quiebres que detecte el test de Bai-Perron.</w:t>
+        <w:t xml:space="preserve">Recalcular la proporción de deuda en pesos para el perímetro consolidado. Hoy el código usa</w:t>
+      </w:r>
+      <w:r>
+        <w:t xml:space="preserve"> </w:t>
+      </w:r>
+      <w:r>
+        <w:t xml:space="preserve">46,3% para el SPNF solo.</w:t>
       </w:r>
     </w:p>
     <w:p>
@@ -1287,7 +2623,13 @@
         </w:numPr>
       </w:pPr>
       <w:r>
-        <w:t xml:space="preserve">Respuestas al impulso ante un shock de la FED.</w:t>
+        <w:t xml:space="preserve">Bajar la tasa de la FED y la tasa sombra de Wu y Xia (que cubre los años de tasa cero) desde</w:t>
+      </w:r>
+      <w:r>
+        <w:t xml:space="preserve"> </w:t>
+      </w:r>
+      <w:r>
+        <w:t xml:space="preserve">FRED, y pasarlas a frecuencia trimestral.</w:t>
       </w:r>
     </w:p>
     <w:p>
@@ -1299,69 +2641,23 @@
         </w:numPr>
       </w:pPr>
       <w:r>
-        <w:t xml:space="preserve">Descomposición de varianza (H1a).</w:t>
-      </w:r>
-    </w:p>
-    <w:bookmarkEnd w:id="16"/>
-    <w:bookmarkStart w:id="17" w:name="etapa-6.-simulación-pendiente"/>
+        <w:t xml:space="preserve">Validación: gráfico y valores de control de cada serie, revisados por el grupo antes de</w:t>
+      </w:r>
+      <w:r>
+        <w:t xml:space="preserve"> </w:t>
+      </w:r>
+      <w:r>
+        <w:t xml:space="preserve">seguir.</w:t>
+      </w:r>
+    </w:p>
+    <w:bookmarkEnd w:id="18"/>
+    <w:bookmarkStart w:id="19" w:name="etapa-4.-metodología-pendiente"/>
     <w:p>
       <w:pPr>
         <w:pStyle w:val="Heading3"/>
       </w:pPr>
       <w:r>
-        <w:t xml:space="preserve">Etapa 6. Simulación (pendiente)</w:t>
-      </w:r>
-    </w:p>
-    <w:p>
-      <w:pPr>
-        <w:pStyle w:val="Compact"/>
-        <w:numPr>
-          <w:ilvl w:val="0"/>
-          <w:numId w:val="1010"/>
-        </w:numPr>
-      </w:pPr>
-      <w:r>
-        <w:t xml:space="preserve">Monte Carlo en el escenario base y con el shock de la FED.</w:t>
-      </w:r>
-    </w:p>
-    <w:p>
-      <w:pPr>
-        <w:pStyle w:val="Compact"/>
-        <w:numPr>
-          <w:ilvl w:val="0"/>
-          <w:numId w:val="1010"/>
-        </w:numPr>
-      </w:pPr>
-      <w:r>
-        <w:t xml:space="preserve">Métricas del FMI: probabilidad de no estabilización y ancho del abanico entre los</w:t>
-      </w:r>
-      <w:r>
-        <w:t xml:space="preserve"> </w:t>
-      </w:r>
-      <w:r>
-        <w:t xml:space="preserve">percentiles 5 y 95, medidos a cinco años y a 2035.</w:t>
-      </w:r>
-    </w:p>
-    <w:p>
-      <w:pPr>
-        <w:pStyle w:val="Compact"/>
-        <w:numPr>
-          <w:ilvl w:val="0"/>
-          <w:numId w:val="1010"/>
-        </w:numPr>
-      </w:pPr>
-      <w:r>
-        <w:t xml:space="preserve">Contraste de H1b y H2.</w:t>
-      </w:r>
-    </w:p>
-    <w:bookmarkEnd w:id="17"/>
-    <w:bookmarkStart w:id="18" w:name="X5b5e10ffb8ec09026463f48317a32f04e4fea2b"/>
-    <w:p>
-      <w:pPr>
-        <w:pStyle w:val="Heading3"/>
-      </w:pPr>
-      <w:r>
-        <w:t xml:space="preserve">Etapa 7. Resultados, discusión y conclusiones (pendiente)</w:t>
+        <w:t xml:space="preserve">Etapa 4. Metodología (pendiente)</w:t>
       </w:r>
     </w:p>
     <w:p>
@@ -1373,23 +2669,65 @@
         </w:numPr>
       </w:pPr>
       <w:r>
-        <w:t xml:space="preserve">Si algún resultado contradice lo que hoy dice la tesis, se frena y se discute en el grupo</w:t>
-      </w:r>
-      <w:r>
-        <w:t xml:space="preserve"> </w:t>
-      </w:r>
-      <w:r>
-        <w:t xml:space="preserve">antes de escribirlo.</w:t>
-      </w:r>
-    </w:p>
-    <w:bookmarkEnd w:id="18"/>
-    <w:bookmarkStart w:id="19" w:name="etapa-8.-entrega-pendiente"/>
+        <w:t xml:space="preserve">Reescribir el capítulo con el SVARX y la identificación.</w:t>
+      </w:r>
+    </w:p>
+    <w:p>
+      <w:pPr>
+        <w:pStyle w:val="Compact"/>
+        <w:numPr>
+          <w:ilvl w:val="0"/>
+          <w:numId w:val="1011"/>
+        </w:numPr>
+      </w:pPr>
+      <w:r>
+        <w:t xml:space="preserve">Definir el tamaño del shock de la FED con criterio justificado: un desvío estándar de la</w:t>
+      </w:r>
+      <w:r>
+        <w:t xml:space="preserve"> </w:t>
+      </w:r>
+      <w:r>
+        <w:t xml:space="preserve">serie, un episodio histórico como el de 2022-2023, o ambos.</w:t>
+      </w:r>
+    </w:p>
+    <w:p>
+      <w:pPr>
+        <w:pStyle w:val="Compact"/>
+        <w:numPr>
+          <w:ilvl w:val="0"/>
+          <w:numId w:val="1011"/>
+        </w:numPr>
+      </w:pPr>
+      <w:r>
+        <w:t xml:space="preserve">Justificar el corte de H1b, siguiendo lo ya escrito en la Introducción.</w:t>
+      </w:r>
+    </w:p>
+    <w:p>
+      <w:pPr>
+        <w:pStyle w:val="Compact"/>
+        <w:numPr>
+          <w:ilvl w:val="0"/>
+          <w:numId w:val="1011"/>
+        </w:numPr>
+      </w:pPr>
+      <w:r>
+        <w:t xml:space="preserve">Agregar diagnósticos de residuos: autocorrelación, heterocedasticidad, normalidad y</w:t>
+      </w:r>
+      <w:r>
+        <w:t xml:space="preserve"> </w:t>
+      </w:r>
+      <w:r>
+        <w:t xml:space="preserve">estabilidad.</w:t>
+      </w:r>
+    </w:p>
+    <w:bookmarkEnd w:id="19"/>
+    <w:bookmarkStart w:id="20" w:name="etapa-5.-estimación-pendiente"/>
     <w:p>
       <w:pPr>
         <w:pStyle w:val="Heading3"/>
       </w:pPr>
       <w:r>
-        <w:t xml:space="preserve">Etapa 8. Entrega (pendiente)</w:t>
+        <w:t xml:space="preserve">Etapa 5. Estimación (pendiente)</w:t>
       </w:r>
     </w:p>
     <w:p>
@@ -1401,12 +2739,150 @@
         </w:numPr>
       </w:pPr>
       <w:r>
+        <w:t xml:space="preserve">Pruebas de raíz unitaria y de quiebres sobre la serie consolidada.</w:t>
+      </w:r>
+    </w:p>
+    <w:p>
+      <w:pPr>
+        <w:pStyle w:val="Compact"/>
+        <w:numPr>
+          <w:ilvl w:val="0"/>
+          <w:numId w:val="1012"/>
+        </w:numPr>
+      </w:pPr>
+      <w:r>
+        <w:t xml:space="preserve">SVARX con dummies en los quiebres que detecte el test de Bai-Perron.</w:t>
+      </w:r>
+    </w:p>
+    <w:p>
+      <w:pPr>
+        <w:pStyle w:val="Compact"/>
+        <w:numPr>
+          <w:ilvl w:val="0"/>
+          <w:numId w:val="1012"/>
+        </w:numPr>
+      </w:pPr>
+      <w:r>
+        <w:t xml:space="preserve">Respuestas al impulso ante un shock de la FED.</w:t>
+      </w:r>
+    </w:p>
+    <w:p>
+      <w:pPr>
+        <w:pStyle w:val="Compact"/>
+        <w:numPr>
+          <w:ilvl w:val="0"/>
+          <w:numId w:val="1012"/>
+        </w:numPr>
+      </w:pPr>
+      <w:r>
+        <w:t xml:space="preserve">Descomposición de varianza (H1a).</w:t>
+      </w:r>
+    </w:p>
+    <w:bookmarkEnd w:id="20"/>
+    <w:bookmarkStart w:id="21" w:name="etapa-6.-simulación-pendiente"/>
+    <w:p>
+      <w:pPr>
+        <w:pStyle w:val="Heading3"/>
+      </w:pPr>
+      <w:r>
+        <w:t xml:space="preserve">Etapa 6. Simulación (pendiente)</w:t>
+      </w:r>
+    </w:p>
+    <w:p>
+      <w:pPr>
+        <w:pStyle w:val="Compact"/>
+        <w:numPr>
+          <w:ilvl w:val="0"/>
+          <w:numId w:val="1013"/>
+        </w:numPr>
+      </w:pPr>
+      <w:r>
+        <w:t xml:space="preserve">Monte Carlo en el escenario base y con el shock de la FED.</w:t>
+      </w:r>
+    </w:p>
+    <w:p>
+      <w:pPr>
+        <w:pStyle w:val="Compact"/>
+        <w:numPr>
+          <w:ilvl w:val="0"/>
+          <w:numId w:val="1013"/>
+        </w:numPr>
+      </w:pPr>
+      <w:r>
+        <w:t xml:space="preserve">Métricas del FMI: probabilidad de no estabilización y ancho del abanico entre los</w:t>
+      </w:r>
+      <w:r>
+        <w:t xml:space="preserve"> </w:t>
+      </w:r>
+      <w:r>
+        <w:t xml:space="preserve">percentiles 5 y 95, medidos a cinco años y a 2035.</w:t>
+      </w:r>
+    </w:p>
+    <w:p>
+      <w:pPr>
+        <w:pStyle w:val="Compact"/>
+        <w:numPr>
+          <w:ilvl w:val="0"/>
+          <w:numId w:val="1013"/>
+        </w:numPr>
+      </w:pPr>
+      <w:r>
+        <w:t xml:space="preserve">Contraste de H1b y H2.</w:t>
+      </w:r>
+    </w:p>
+    <w:bookmarkEnd w:id="21"/>
+    <w:bookmarkStart w:id="22" w:name="X5b5e10ffb8ec09026463f48317a32f04e4fea2b"/>
+    <w:p>
+      <w:pPr>
+        <w:pStyle w:val="Heading3"/>
+      </w:pPr>
+      <w:r>
+        <w:t xml:space="preserve">Etapa 7. Resultados, discusión y conclusiones (pendiente)</w:t>
+      </w:r>
+    </w:p>
+    <w:p>
+      <w:pPr>
+        <w:pStyle w:val="Compact"/>
+        <w:numPr>
+          <w:ilvl w:val="0"/>
+          <w:numId w:val="1014"/>
+        </w:numPr>
+      </w:pPr>
+      <w:r>
+        <w:t xml:space="preserve">Si algún resultado contradice lo que hoy dice la tesis, se frena y se discute en el grupo</w:t>
+      </w:r>
+      <w:r>
+        <w:t xml:space="preserve"> </w:t>
+      </w:r>
+      <w:r>
+        <w:t xml:space="preserve">antes de escribirlo.</w:t>
+      </w:r>
+    </w:p>
+    <w:bookmarkEnd w:id="22"/>
+    <w:bookmarkStart w:id="23" w:name="etapa-8.-entrega-pendiente"/>
+    <w:p>
+      <w:pPr>
+        <w:pStyle w:val="Heading3"/>
+      </w:pPr>
+      <w:r>
+        <w:t xml:space="preserve">Etapa 8. Entrega (pendiente)</w:t>
+      </w:r>
+    </w:p>
+    <w:p>
+      <w:pPr>
+        <w:pStyle w:val="Compact"/>
+        <w:numPr>
+          <w:ilvl w:val="0"/>
+          <w:numId w:val="1015"/>
+        </w:numPr>
+      </w:pPr>
+      <w:r>
         <w:t xml:space="preserve">Pasar todo al formato final, revisar las referencias y compilar.</w:t>
       </w:r>
     </w:p>
-    <w:bookmarkEnd w:id="19"/>
-    <w:bookmarkEnd w:id="20"/>
-    <w:bookmarkStart w:id="21" w:name="pendientes-de-verificación"/>
+    <w:bookmarkEnd w:id="23"/>
+    <w:bookmarkEnd w:id="24"/>
+    <w:bookmarkStart w:id="25" w:name="pendientes-de-verificación"/>
     <w:p>
       <w:pPr>
         <w:pStyle w:val="Heading2"/>
@@ -1705,29 +3181,61 @@
                 <w:rFonts w:ascii="Calibri" w:hAnsi="Calibri"/>
                 <w:sz w:val="20"/>
               </w:rPr>
-              <w:t xml:space="preserve">Si el análisis del FMI de 2025 incluye la deuda del BCRA</w:t>
-            </w:r>
-          </w:p>
-        </w:tc>
-        <w:tc>
-          <w:tcPr/>
-          <w:p>
-            <w:pPr>
-              <w:pStyle w:val="Compact"/>
-            </w:pPr>
-            <w:r>
-              <w:rPr>
-                <w:rFonts w:ascii="Calibri" w:hAnsi="Calibri"/>
-                <w:sz w:val="20"/>
-              </w:rPr>
-              <w:t xml:space="preserve">Vacancia</w:t>
+              <w:t xml:space="preserve">Cuatro referencias con dos versiones distintas (Adler y Sosa, Adler y Magud, Cetrángolo et al., Wijayanti y Rachmanira)</w:t>
+            </w:r>
+          </w:p>
+        </w:tc>
+        <w:tc>
+          <w:tcPr/>
+          <w:p>
+            <w:pPr>
+              <w:pStyle w:val="Compact"/>
+            </w:pPr>
+            <w:r>
+              <w:rPr>
+                <w:rFonts w:ascii="Calibri" w:hAnsi="Calibri"/>
+                <w:sz w:val="20"/>
+              </w:rPr>
+              <w:t xml:space="preserve">Antecedentes</w:t>
+            </w:r>
+          </w:p>
+        </w:tc>
+      </w:tr>
+      <w:tr>
+        <w:tc>
+          <w:tcPr/>
+          <w:p>
+            <w:pPr>
+              <w:pStyle w:val="Compact"/>
+            </w:pPr>
+            <w:r>
+              <w:rPr>
+                <w:rFonts w:ascii="Calibri" w:hAnsi="Calibri"/>
+                <w:sz w:val="20"/>
+              </w:rPr>
+              <w:t xml:space="preserve">Denominador de los pasivos del BCRA: 9,5% en nuestra serie frente a 18,4% del FMI en 2023</w:t>
+            </w:r>
+          </w:p>
+        </w:tc>
+        <w:tc>
+          <w:tcPr/>
+          <w:p>
+            <w:pPr>
+              <w:pStyle w:val="Compact"/>
+            </w:pPr>
+            <w:r>
+              <w:rPr>
+                <w:rFonts w:ascii="Calibri" w:hAnsi="Calibri"/>
+                <w:sz w:val="20"/>
+              </w:rPr>
+              <w:t xml:space="preserve">Datos</w:t>
             </w:r>
           </w:p>
         </w:tc>
       </w:tr>
     </w:tbl>
-    <w:bookmarkEnd w:id="21"/>
-    <w:bookmarkStart w:id="22" w:name="decisiones-abiertas"/>
+    <w:bookmarkEnd w:id="25"/>
+    <w:bookmarkStart w:id="26" w:name="decisiones-abiertas"/>
     <w:p>
       <w:pPr>
         <w:pStyle w:val="Heading2"/>
@@ -1741,7 +3249,7 @@
         <w:pStyle w:val="Compact"/>
         <w:numPr>
           <w:ilvl w:val="0"/>
-          <w:numId w:val="1013"/>
+          <w:numId w:val="1016"/>
         </w:numPr>
       </w:pPr>
       <w:r>
@@ -1769,7 +3277,53 @@
         <w:pStyle w:val="Compact"/>
         <w:numPr>
           <w:ilvl w:val="0"/>
-          <w:numId w:val="1013"/>
+          <w:numId w:val="1016"/>
+        </w:numPr>
+      </w:pPr>
+      <w:r>
+        <w:rPr>
+          <w:b/>
+          <w:bCs/>
+        </w:rPr>
+        <w:t xml:space="preserve">H1b: corte del 50% o contraste contra el FMI.</w:t>
+      </w:r>
+      <w:r>
+        <w:t xml:space="preserve"> </w:t>
+      </w:r>
+      <w:r>
+        <w:t xml:space="preserve">El FMI estimó en 2025 una probabilidad de</w:t>
+      </w:r>
+      <w:r>
+        <w:t xml:space="preserve"> </w:t>
+      </w:r>
+      <w:r>
+        <w:t xml:space="preserve">estabilización de alrededor de 97% (FMI, 2025, anexo II). Con un corte del 50%, H1b casi</w:t>
+      </w:r>
+      <w:r>
+        <w:t xml:space="preserve"> </w:t>
+      </w:r>
+      <w:r>
+        <w:t xml:space="preserve">seguro se rechaza. La alternativa es contrastar si nuestra probabilidad de no estabilización</w:t>
+      </w:r>
+      <w:r>
+        <w:t xml:space="preserve"> </w:t>
+      </w:r>
+      <w:r>
+        <w:t xml:space="preserve">supera el 3% del FMI, lo que conecta la hipótesis con la vacancia. El detalle está en la nota 2</w:t>
+      </w:r>
+      <w:r>
+        <w:t xml:space="preserve"> </w:t>
+      </w:r>
+      <w:r>
+        <w:t xml:space="preserve">del documento de Introducción y Antecedentes.</w:t>
+      </w:r>
+    </w:p>
+    <w:p>
+      <w:pPr>
+        <w:pStyle w:val="Compact"/>
+        <w:numPr>
+          <w:ilvl w:val="0"/>
+          <w:numId w:val="1016"/>
         </w:numPr>
       </w:pPr>
       <w:r>
@@ -1792,8 +3346,8 @@
         <w:t xml:space="preserve">reportar los dos.</w:t>
       </w:r>
     </w:p>
-    <w:bookmarkEnd w:id="22"/>
-    <w:bookmarkStart w:id="23" w:name="referencias-de-este-documento"/>
+    <w:bookmarkEnd w:id="26"/>
+    <w:bookmarkStart w:id="27" w:name="referencias-de-este-documento"/>
     <w:p>
       <w:pPr>
         <w:pStyle w:val="Heading2"/>
@@ -1807,7 +3361,7 @@
         <w:pStyle w:val="Compact"/>
         <w:numPr>
           <w:ilvl w:val="0"/>
-          <w:numId w:val="1014"/>
+          <w:numId w:val="1017"/>
         </w:numPr>
       </w:pPr>
       <w:r>
@@ -1849,7 +3403,7 @@
         <w:pStyle w:val="Compact"/>
         <w:numPr>
           <w:ilvl w:val="0"/>
-          <w:numId w:val="1014"/>
+          <w:numId w:val="1017"/>
         </w:numPr>
       </w:pPr>
       <w:r>
@@ -1891,7 +3445,49 @@
         <w:pStyle w:val="Compact"/>
         <w:numPr>
           <w:ilvl w:val="0"/>
-          <w:numId w:val="1014"/>
+          <w:numId w:val="1017"/>
+        </w:numPr>
+      </w:pPr>
+      <w:r>
+        <w:t xml:space="preserve">Fondo Monetario Internacional. (2025).</w:t>
+      </w:r>
+      <w:r>
+        <w:t xml:space="preserve"> </w:t>
+      </w:r>
+      <w:r>
+        <w:rPr>
+          <w:i/>
+          <w:iCs/>
+        </w:rPr>
+        <w:t xml:space="preserve">Argentina: Request for an extended arrangement under</w:t>
+      </w:r>
+      <w:r>
+        <w:rPr>
+          <w:i/>
+          <w:iCs/>
+        </w:rPr>
+        <w:t xml:space="preserve"> </w:t>
+      </w:r>
+      <w:r>
+        <w:rPr>
+          <w:i/>
+          <w:iCs/>
+        </w:rPr>
+        <w:t xml:space="preserve">the Extended Fund Facility</w:t>
+      </w:r>
+      <w:r>
+        <w:t xml:space="preserve"> </w:t>
+      </w:r>
+      <w:r>
+        <w:t xml:space="preserve">(IMF Country Report No. 25/95).</w:t>
+      </w:r>
+    </w:p>
+    <w:p>
+      <w:pPr>
+        <w:pStyle w:val="Compact"/>
+        <w:numPr>
+          <w:ilvl w:val="0"/>
+          <w:numId w:val="1017"/>
         </w:numPr>
       </w:pPr>
       <w:r>
@@ -1911,8 +3507,8 @@
         <w:t xml:space="preserve">.</w:t>
       </w:r>
     </w:p>
-    <w:bookmarkEnd w:id="23"/>
-    <w:bookmarkEnd w:id="24"/>
+    <w:bookmarkEnd w:id="27"/>
+    <w:bookmarkEnd w:id="28"/>
     <w:sectPr>
       <w:footnotePr>
         <w:numRestart w:val="eachSect"/>
@@ -2221,15 +3817,6 @@
     <w:abstractNumId w:val="991"/>
   </w:num>
   <w:num w:numId="1003">
-    <w:abstractNumId w:val="991"/>
-  </w:num>
-  <w:num w:numId="1004">
-    <w:abstractNumId w:val="991"/>
-  </w:num>
-  <w:num w:numId="1005">
-    <w:abstractNumId w:val="991"/>
-  </w:num>
-  <w:num w:numId="1006">
     <w:abstractNumId w:val="99411"/>
     <w:lvlOverride w:ilvl="0">
       <w:startOverride w:val="1"/>
@@ -2259,25 +3846,7 @@
       <w:startOverride w:val="1"/>
     </w:lvlOverride>
   </w:num>
-  <w:num w:numId="1007">
-    <w:abstractNumId w:val="991"/>
-  </w:num>
-  <w:num w:numId="1008">
-    <w:abstractNumId w:val="991"/>
-  </w:num>
-  <w:num w:numId="1009">
-    <w:abstractNumId w:val="991"/>
-  </w:num>
-  <w:num w:numId="1010">
-    <w:abstractNumId w:val="991"/>
-  </w:num>
-  <w:num w:numId="1011">
-    <w:abstractNumId w:val="991"/>
-  </w:num>
-  <w:num w:numId="1012">
-    <w:abstractNumId w:val="991"/>
-  </w:num>
-  <w:num w:numId="1013">
+  <w:num w:numId="1004">
     <w:abstractNumId w:val="99411"/>
     <w:lvlOverride w:ilvl="0">
       <w:startOverride w:val="1"/>
@@ -2307,7 +3876,97 @@
       <w:startOverride w:val="1"/>
     </w:lvlOverride>
   </w:num>
+  <w:num w:numId="1005">
+    <w:abstractNumId w:val="991"/>
+  </w:num>
+  <w:num w:numId="1006">
+    <w:abstractNumId w:val="991"/>
+  </w:num>
+  <w:num w:numId="1007">
+    <w:abstractNumId w:val="991"/>
+  </w:num>
+  <w:num w:numId="1008">
+    <w:abstractNumId w:val="991"/>
+  </w:num>
+  <w:num w:numId="1009">
+    <w:abstractNumId w:val="99411"/>
+    <w:lvlOverride w:ilvl="0">
+      <w:startOverride w:val="1"/>
+    </w:lvlOverride>
+    <w:lvlOverride w:ilvl="1">
+      <w:startOverride w:val="1"/>
+    </w:lvlOverride>
+    <w:lvlOverride w:ilvl="2">
+      <w:startOverride w:val="1"/>
+    </w:lvlOverride>
+    <w:lvlOverride w:ilvl="3">
+      <w:startOverride w:val="1"/>
+    </w:lvlOverride>
+    <w:lvlOverride w:ilvl="4">
+      <w:startOverride w:val="1"/>
+    </w:lvlOverride>
+    <w:lvlOverride w:ilvl="5">
+      <w:startOverride w:val="1"/>
+    </w:lvlOverride>
+    <w:lvlOverride w:ilvl="6">
+      <w:startOverride w:val="1"/>
+    </w:lvlOverride>
+    <w:lvlOverride w:ilvl="7">
+      <w:startOverride w:val="1"/>
+    </w:lvlOverride>
+    <w:lvlOverride w:ilvl="8">
+      <w:startOverride w:val="1"/>
+    </w:lvlOverride>
+  </w:num>
+  <w:num w:numId="1010">
+    <w:abstractNumId w:val="991"/>
+  </w:num>
+  <w:num w:numId="1011">
+    <w:abstractNumId w:val="991"/>
+  </w:num>
+  <w:num w:numId="1012">
+    <w:abstractNumId w:val="991"/>
+  </w:num>
+  <w:num w:numId="1013">
+    <w:abstractNumId w:val="991"/>
+  </w:num>
   <w:num w:numId="1014">
+    <w:abstractNumId w:val="991"/>
+  </w:num>
+  <w:num w:numId="1015">
+    <w:abstractNumId w:val="991"/>
+  </w:num>
+  <w:num w:numId="1016">
+    <w:abstractNumId w:val="99411"/>
+    <w:lvlOverride w:ilvl="0">
+      <w:startOverride w:val="1"/>
+    </w:lvlOverride>
+    <w:lvlOverride w:ilvl="1">
+      <w:startOverride w:val="1"/>
+    </w:lvlOverride>
+    <w:lvlOverride w:ilvl="2">
+      <w:startOverride w:val="1"/>
+    </w:lvlOverride>
+    <w:lvlOverride w:ilvl="3">
+      <w:startOverride w:val="1"/>
+    </w:lvlOverride>
+    <w:lvlOverride w:ilvl="4">
+      <w:startOverride w:val="1"/>
+    </w:lvlOverride>
+    <w:lvlOverride w:ilvl="5">
+      <w:startOverride w:val="1"/>
+    </w:lvlOverride>
+    <w:lvlOverride w:ilvl="6">
+      <w:startOverride w:val="1"/>
+    </w:lvlOverride>
+    <w:lvlOverride w:ilvl="7">
+      <w:startOverride w:val="1"/>
+    </w:lvlOverride>
+    <w:lvlOverride w:ilvl="8">
+      <w:startOverride w:val="1"/>
+    </w:lvlOverride>
+  </w:num>
+  <w:num w:numId="1017">
     <w:abstractNumId w:val="991"/>
   </w:num>
 </w:numbering>

</xml_diff>

<commit_message>
docs(tesis): nombres sin versiones, H1a con el concepto de Santiago, regla de rezagos AIC+estabilidad y canales del shock FED
Co-Authored-By: Claude Opus 5.5 <noreply@anthropic.com>
</commit_message>
<xml_diff>
--- a/tesis_oficial_borradores/para_el_grupo/Plan_de_labor.docx
+++ b/tesis_oficial_borradores/para_el_grupo/Plan_de_labor.docx
@@ -16,7 +16,7 @@
         <w:pStyle w:val="FirstParagraph"/>
       </w:pPr>
       <w:r>
-        <w:t xml:space="preserve">Documento de trabajo del grupo. Versión 2, del 10 de octubre de 2026.</w:t>
+        <w:t xml:space="preserve">Documento de trabajo del grupo. Última actualización: 11 de octubre de 2026.</w:t>
       </w:r>
     </w:p>
     <w:bookmarkStart w:id="9" w:name="para-qué-sirve-este-documento"/>
@@ -866,7 +866,7 @@
                 <w:rFonts w:ascii="Calibri" w:hAnsi="Calibri"/>
                 <w:sz w:val="20"/>
               </w:rPr>
-              <w:t xml:space="preserve">Johansen y VECM: no encuentran reacción fiscal</w:t>
+              <w:t xml:space="preserve">Johansen y VECM (versión anterior)</w:t>
             </w:r>
           </w:p>
         </w:tc>
@@ -941,7 +941,22 @@
                 <w:rFonts w:ascii="Calibri" w:hAnsi="Calibri"/>
                 <w:sz w:val="20"/>
               </w:rPr>
-              <w:t xml:space="preserve">Se reutiliza para H1a (reacción fiscal), sobre la deuda consolidada.</w:t>
+              <w:t xml:space="preserve">Reemplazados por la ecuación fiscal del SVARX (</w:t>
+            </w:r>
+            <w:r>
+              <w:rPr>
+                <w:rStyle w:val="VerbatimChar"/>
+                <w:rFonts w:ascii="Calibri" w:hAnsi="Calibri"/>
+                <w:sz w:val="20"/>
+              </w:rPr>
+              <w:t xml:space="preserve">fase24</w:t>
+            </w:r>
+            <w:r>
+              <w:rPr>
+                <w:rFonts w:ascii="Calibri" w:hAnsi="Calibri"/>
+                <w:sz w:val="20"/>
+              </w:rPr>
+              <w:t xml:space="preserve">), estimada sobre la deuda consolidada con datos reales. Su reacción fiscal da 0,019 (p = 0,005), significativa, a diferencia del VECM anterior.</w:t>
             </w:r>
           </w:p>
         </w:tc>
@@ -2393,7 +2408,7 @@
         <w:rPr>
           <w:rStyle w:val="VerbatimChar"/>
         </w:rPr>
-        <w:t xml:space="preserve">introduccion_v3</w:t>
+        <w:t xml:space="preserve">introduccion</w:t>
       </w:r>
       <w:r>
         <w:t xml:space="preserve">). Corrige citas mal usadas (Reinhart et al.,</w:t>
@@ -2472,7 +2487,7 @@
         <w:rPr>
           <w:rStyle w:val="VerbatimChar"/>
         </w:rPr>
-        <w:t xml:space="preserve">antecedentes_v3</w:t>
+        <w:t xml:space="preserve">antecedentes</w:t>
       </w:r>
       <w:r>
         <w:t xml:space="preserve">);</w:t>

</xml_diff>

<commit_message>
feat(tesis): ventana unica, shocks a la manera del FMI, canal de tasas en pesos y capitulos 6-8
- fase24: todas las especificaciones sobre la misma muestra efectiva 1998T2-2025T4 (PMAX=6)
- fase25: variante --shocks fmi (bloques de dos anios, FMI 2021 anexo VI) y --canal-domestico
- fase25b: diagnostico del ancho del abanico con shocks del FMI
- Resultados, Discusion y Conclusiones; H1b a 2030 y 2035; nota del shock FED cerrada
- Se borra un PDF mal rotulado (era Berger, Caballero y Engel, no Uribe y Yue)

Co-Authored-By: Claude Opus 5.5 <noreply@anthropic.com>
</commit_message>
<xml_diff>
--- a/tesis_oficial_borradores/para_el_grupo/Plan_de_labor.docx
+++ b/tesis_oficial_borradores/para_el_grupo/Plan_de_labor.docx
@@ -2,7 +2,7 @@
 <file path=word/document.xml><?xml version="1.0" encoding="utf-8"?>
 <w:document xmlns:w="http://schemas.openxmlformats.org/wordprocessingml/2006/main" xmlns:m="http://schemas.openxmlformats.org/officeDocument/2006/math" xmlns:r="http://schemas.openxmlformats.org/officeDocument/2006/relationships" xmlns:o="urn:schemas-microsoft-com:office:office" xmlns:v="urn:schemas-microsoft-com:vml" xmlns:w10="urn:schemas-microsoft-com:office:word" xmlns:a="http://schemas.openxmlformats.org/drawingml/2006/main" xmlns:pic="http://schemas.openxmlformats.org/drawingml/2006/picture" xmlns:wp="http://schemas.openxmlformats.org/drawingml/2006/wordprocessingDrawing">
   <w:body>
-    <w:bookmarkStart w:id="27" w:name="plan-de-labor-de-la-tesis"/>
+    <w:bookmarkStart w:id="28" w:name="plan-de-labor-de-la-tesis"/>
     <w:p>
       <w:pPr>
         <w:pStyle w:val="Heading1"/>
@@ -1642,13 +1642,13 @@
       </w:r>
     </w:p>
     <w:bookmarkEnd w:id="12"/>
-    <w:bookmarkStart w:id="13" w:name="las-cuatro-piezas-que-faltan"/>
+    <w:bookmarkStart w:id="13" w:name="las-cuatro-piezas-que-faltaban-hechas"/>
     <w:p>
       <w:pPr>
         <w:pStyle w:val="Heading3"/>
       </w:pPr>
       <w:r>
-        <w:t xml:space="preserve">Las cuatro piezas que faltan</w:t>
+        <w:t xml:space="preserve">Las cuatro piezas que faltaban (hechas)</w:t>
       </w:r>
     </w:p>
     <w:p>
@@ -1660,7 +1660,7 @@
         </w:numPr>
       </w:pPr>
       <w:r>
-        <w:t xml:space="preserve">Deuda consolidada 1996-2025 con un denominador coherente.</w:t>
+        <w:t xml:space="preserve">Deuda consolidada 1996-2025 con un denominador coherente: bruta, neta a valor libros y neta con las Letras Intransferibles a valor nominal (la principal).</w:t>
       </w:r>
     </w:p>
     <w:p>
@@ -1672,7 +1672,7 @@
         </w:numPr>
       </w:pPr>
       <w:r>
-        <w:t xml:space="preserve">Tasa de la FED y tasa sombra (FRED).</w:t>
+        <w:t xml:space="preserve">Tasa de la FED y tasa sombra de Wu y Xia, trimestrales.</w:t>
       </w:r>
     </w:p>
     <w:p>
@@ -1684,22 +1684,16 @@
         </w:numPr>
       </w:pPr>
       <w:r>
-        <w:t xml:space="preserve">SVARX: extender</w:t>
-      </w:r>
-      <w:r>
-        <w:t xml:space="preserve"> </w:t>
+        <w:t xml:space="preserve">SVARX nuevo (</w:t>
       </w:r>
       <w:r>
         <w:rPr>
           <w:rStyle w:val="VerbatimChar"/>
         </w:rPr>
-        <w:t xml:space="preserve">fase19</w:t>
-      </w:r>
-      <w:r>
-        <w:t xml:space="preserve"> </w:t>
-      </w:r>
-      <w:r>
-        <w:t xml:space="preserve">con variables exógenas.</w:t>
+        <w:t xml:space="preserve">fase24_svarx_1996_2025.py</w:t>
+      </w:r>
+      <w:r>
+        <w:t xml:space="preserve">).</w:t>
       </w:r>
     </w:p>
     <w:p>
@@ -1711,7 +1705,25 @@
         </w:numPr>
       </w:pPr>
       <w:r>
-        <w:t xml:space="preserve">Simulación nueva, desde el SVARX y con las métricas del FMI.</w:t>
+        <w:t xml:space="preserve">Simulación desde el SVARX con la métrica del FMI (</w:t>
+      </w:r>
+      <w:r>
+        <w:rPr>
+          <w:rStyle w:val="VerbatimChar"/>
+        </w:rPr>
+        <w:t xml:space="preserve">fase25_simulacion_dsa_svarx.py</w:t>
+      </w:r>
+      <w:r>
+        <w:t xml:space="preserve">), más la variante con shocks a la manera del FMI y su diagnóstico (</w:t>
+      </w:r>
+      <w:r>
+        <w:rPr>
+          <w:rStyle w:val="VerbatimChar"/>
+        </w:rPr>
+        <w:t xml:space="preserve">fase25b_diagnostico_abanico_fmi.py</w:t>
+      </w:r>
+      <w:r>
+        <w:t xml:space="preserve">).</w:t>
       </w:r>
     </w:p>
     <w:bookmarkEnd w:id="13"/>
@@ -2323,9 +2335,244 @@
           </w:p>
         </w:tc>
       </w:tr>
+      <w:tr>
+        <w:tc>
+          <w:tcPr/>
+          <w:p>
+            <w:pPr>
+              <w:pStyle w:val="Compact"/>
+            </w:pPr>
+            <w:r>
+              <w:rPr>
+                <w:rFonts w:ascii="Calibri" w:hAnsi="Calibri"/>
+                <w:sz w:val="20"/>
+              </w:rPr>
+              <w:t xml:space="preserve">11</w:t>
+            </w:r>
+          </w:p>
+        </w:tc>
+        <w:tc>
+          <w:tcPr/>
+          <w:p>
+            <w:pPr>
+              <w:pStyle w:val="Compact"/>
+            </w:pPr>
+            <w:r>
+              <w:rPr>
+                <w:rFonts w:ascii="Calibri" w:hAnsi="Calibri"/>
+                <w:sz w:val="20"/>
+              </w:rPr>
+              <w:t xml:space="preserve">Ventana única: todas las especificaciones se estiman sobre la misma muestra efectiva, 1998T2-2025T4, y los primeros trimestres de 1996-1998 se usan como condiciones iniciales de los rezagos.</w:t>
+            </w:r>
+          </w:p>
+        </w:tc>
+        <w:tc>
+          <w:tcPr/>
+          <w:p>
+            <w:pPr>
+              <w:pStyle w:val="Compact"/>
+            </w:pPr>
+            <w:r>
+              <w:rPr>
+                <w:rFonts w:ascii="Calibri" w:hAnsi="Calibri"/>
+                <w:sz w:val="20"/>
+              </w:rPr>
+              <w:t xml:space="preserve">Los criterios de información solo se pueden comparar entre órdenes sobre un mismo período (Lütkepohl, 2005, sec. 4.3), y así la deuda neta, la neta en libros y la bruta se estiman sobre los mismos trimestres.</w:t>
+            </w:r>
+          </w:p>
+        </w:tc>
+      </w:tr>
+      <w:tr>
+        <w:tc>
+          <w:tcPr/>
+          <w:p>
+            <w:pPr>
+              <w:pStyle w:val="Compact"/>
+            </w:pPr>
+            <w:r>
+              <w:rPr>
+                <w:rFonts w:ascii="Calibri" w:hAnsi="Calibri"/>
+                <w:sz w:val="20"/>
+              </w:rPr>
+              <w:t xml:space="preserve">12</w:t>
+            </w:r>
+          </w:p>
+        </w:tc>
+        <w:tc>
+          <w:tcPr/>
+          <w:p>
+            <w:pPr>
+              <w:pStyle w:val="Compact"/>
+            </w:pPr>
+            <w:r>
+              <w:rPr>
+                <w:rFonts w:ascii="Calibri" w:hAnsi="Calibri"/>
+                <w:sz w:val="20"/>
+              </w:rPr>
+              <w:t xml:space="preserve">H1b se contrasta a cinco años (2030), el horizonte de la métrica del FMI, y a diez años (2035).</w:t>
+            </w:r>
+          </w:p>
+        </w:tc>
+        <w:tc>
+          <w:tcPr/>
+          <w:p>
+            <w:pPr>
+              <w:pStyle w:val="Compact"/>
+            </w:pPr>
+            <w:r>
+              <w:rPr>
+                <w:rFonts w:ascii="Calibri" w:hAnsi="Calibri"/>
+                <w:sz w:val="20"/>
+              </w:rPr>
+              <w:t xml:space="preserve">El 3% del FMI se mide a cinco años; 2035 es el final del horizonte de la tesis.</w:t>
+            </w:r>
+          </w:p>
+        </w:tc>
+      </w:tr>
+      <w:tr>
+        <w:tc>
+          <w:tcPr/>
+          <w:p>
+            <w:pPr>
+              <w:pStyle w:val="Compact"/>
+            </w:pPr>
+            <w:r>
+              <w:rPr>
+                <w:rFonts w:ascii="Calibri" w:hAnsi="Calibri"/>
+                <w:sz w:val="20"/>
+              </w:rPr>
+              <w:t xml:space="preserve">13</w:t>
+            </w:r>
+          </w:p>
+        </w:tc>
+        <w:tc>
+          <w:tcPr/>
+          <w:p>
+            <w:pPr>
+              <w:pStyle w:val="Compact"/>
+            </w:pPr>
+            <w:r>
+              <w:rPr>
+                <w:rFonts w:ascii="Calibri" w:hAnsi="Calibri"/>
+                <w:sz w:val="20"/>
+              </w:rPr>
+              <w:t xml:space="preserve">El shock de la FED se mide de dos maneras: un desvío estándar (0,50 puntos) y el ciclo de 2022-2023 (5,25 puntos).</w:t>
+            </w:r>
+          </w:p>
+        </w:tc>
+        <w:tc>
+          <w:tcPr/>
+          <w:p>
+            <w:pPr>
+              <w:pStyle w:val="Compact"/>
+            </w:pPr>
+            <w:r>
+              <w:rPr>
+                <w:rFonts w:ascii="Calibri" w:hAnsi="Calibri"/>
+                <w:sz w:val="20"/>
+              </w:rPr>
+              <w:t xml:space="preserve">Convención de la literatura de VAR y episodio histórico reciente.</w:t>
+            </w:r>
+          </w:p>
+        </w:tc>
+      </w:tr>
+      <w:tr>
+        <w:tc>
+          <w:tcPr/>
+          <w:p>
+            <w:pPr>
+              <w:pStyle w:val="Compact"/>
+            </w:pPr>
+            <w:r>
+              <w:rPr>
+                <w:rFonts w:ascii="Calibri" w:hAnsi="Calibri"/>
+                <w:sz w:val="20"/>
+              </w:rPr>
+              <w:t xml:space="preserve">14</w:t>
+            </w:r>
+          </w:p>
+        </w:tc>
+        <w:tc>
+          <w:tcPr/>
+          <w:p>
+            <w:pPr>
+              <w:pStyle w:val="Compact"/>
+            </w:pPr>
+            <w:r>
+              <w:rPr>
+                <w:rFonts w:ascii="Calibri" w:hAnsi="Calibri"/>
+                <w:sz w:val="20"/>
+              </w:rPr>
+              <w:t xml:space="preserve">La especificación principal es el SVARX; los shocks a la manera del FMI se informan como comparación. La elección se fijó antes de ver los resultados.</w:t>
+            </w:r>
+          </w:p>
+        </w:tc>
+        <w:tc>
+          <w:tcPr/>
+          <w:p>
+            <w:pPr>
+              <w:pStyle w:val="Compact"/>
+            </w:pPr>
+            <w:r>
+              <w:rPr>
+                <w:rFonts w:ascii="Calibri" w:hAnsi="Calibri"/>
+                <w:sz w:val="20"/>
+              </w:rPr>
+              <w:t xml:space="preserve">Solo los shocks identificados permiten contrastar H1a (bloques de shocks) y H2 (shock externo).</w:t>
+            </w:r>
+          </w:p>
+        </w:tc>
+      </w:tr>
+      <w:tr>
+        <w:tc>
+          <w:tcPr/>
+          <w:p>
+            <w:pPr>
+              <w:pStyle w:val="Compact"/>
+            </w:pPr>
+            <w:r>
+              <w:rPr>
+                <w:rFonts w:ascii="Calibri" w:hAnsi="Calibri"/>
+                <w:sz w:val="20"/>
+              </w:rPr>
+              <w:t xml:space="preserve">15</w:t>
+            </w:r>
+          </w:p>
+        </w:tc>
+        <w:tc>
+          <w:tcPr/>
+          <w:p>
+            <w:pPr>
+              <w:pStyle w:val="Compact"/>
+            </w:pPr>
+            <w:r>
+              <w:rPr>
+                <w:rFonts w:ascii="Calibri" w:hAnsi="Calibri"/>
+                <w:sz w:val="20"/>
+              </w:rPr>
+              <w:t xml:space="preserve">El canal de tasas en pesos se informa como variante: el riesgo país también reprecia la deuda en pesos.</w:t>
+            </w:r>
+          </w:p>
+        </w:tc>
+        <w:tc>
+          <w:tcPr/>
+          <w:p>
+            <w:pPr>
+              <w:pStyle w:val="Compact"/>
+            </w:pPr>
+            <w:r>
+              <w:rPr>
+                <w:rFonts w:ascii="Calibri" w:hAnsi="Calibri"/>
+                <w:sz w:val="20"/>
+              </w:rPr>
+              <w:t xml:space="preserve">Tasa de interés del país (Neumeyer y Perri, 2005; Uribe y Yue, 2006). No hay una tasa en pesos homogénea para 1996-2025 que permita sumarla al VAR.</w:t>
+            </w:r>
+          </w:p>
+        </w:tc>
+      </w:tr>
     </w:tbl>
     <w:bookmarkEnd w:id="15"/>
-    <w:bookmarkStart w:id="23" w:name="etapas"/>
+    <w:bookmarkStart w:id="24" w:name="etapas"/>
     <w:p>
       <w:pPr>
         <w:pStyle w:val="Heading2"/>
@@ -2384,13 +2631,13 @@
         <w:t xml:space="preserve">.</w:t>
       </w:r>
     </w:p>
-    <w:bookmarkStart w:id="16" w:name="X448d40dca89f9f9c4f6217ad26cdb620dc83252"/>
+    <w:bookmarkStart w:id="16" w:name="X8e6682cd329c11d0be0fd84830bfe77f1960cf0"/>
     <w:p>
       <w:pPr>
         <w:pStyle w:val="Heading3"/>
       </w:pPr>
       <w:r>
-        <w:t xml:space="preserve">Etapa 1. Introducción (borrador listo para revisión del grupo)</w:t>
+        <w:t xml:space="preserve">Etapa 1. Introducción (hecha; en revisión del grupo)</w:t>
       </w:r>
     </w:p>
     <w:p>
@@ -2402,56 +2649,17 @@
         </w:numPr>
       </w:pPr>
       <w:r>
-        <w:t xml:space="preserve">Hecho: borrador corregido (</w:t>
-      </w:r>
-      <w:r>
-        <w:rPr>
-          <w:rStyle w:val="VerbatimChar"/>
-        </w:rPr>
-        <w:t xml:space="preserve">introduccion</w:t>
-      </w:r>
-      <w:r>
-        <w:t xml:space="preserve">). Corrige citas mal usadas (Reinhart et al.,</w:t>
-      </w:r>
-      <w:r>
-        <w:t xml:space="preserve"> </w:t>
-      </w:r>
-      <w:r>
-        <w:t xml:space="preserve">2003; Mendoza y Oviedo, 2007), actualiza la coyuntura con datos de la OPC de julio de 2026,</w:t>
-      </w:r>
-      <w:r>
-        <w:t xml:space="preserve"> </w:t>
-      </w:r>
-      <w:r>
-        <w:t xml:space="preserve">reescribe la pregunta, los objetivos y las hipótesis, y suma la Justificación con la Ley</w:t>
-      </w:r>
-      <w:r>
-        <w:t xml:space="preserve"> </w:t>
-      </w:r>
-      <w:r>
-        <w:t xml:space="preserve">27.612.</w:t>
-      </w:r>
-    </w:p>
-    <w:p>
-      <w:pPr>
-        <w:pStyle w:val="Compact"/>
-        <w:numPr>
-          <w:ilvl w:val="0"/>
-          <w:numId w:val="1005"/>
-        </w:numPr>
-      </w:pPr>
-      <w:r>
-        <w:t xml:space="preserve">Pendiente: definir el tamaño del shock de la FED (ver punto 6) y confirmar los datos de coyuntura marcados.</w:t>
+        <w:t xml:space="preserve">Borrador corregido, con la H1a de Santiago, H1b a cinco y diez años y el tamaño del shock de la FED definido.</w:t>
       </w:r>
     </w:p>
     <w:bookmarkEnd w:id="16"/>
-    <w:bookmarkStart w:id="17" w:name="X54a10ff3e6f155a28511cdc459424258071cfb3"/>
+    <w:bookmarkStart w:id="17" w:name="X21d30eca0d7e3f1d214a006535a93fa47abd3ed"/>
     <w:p>
       <w:pPr>
         <w:pStyle w:val="Heading3"/>
       </w:pPr>
       <w:r>
-        <w:t xml:space="preserve">Etapa 2. Antecedentes y área de vacancia (borrador listo para revisión del grupo)</w:t>
+        <w:t xml:space="preserve">Etapa 2. Antecedentes y área de vacancia (hecha; en revisión del grupo)</w:t>
       </w:r>
     </w:p>
     <w:p>
@@ -2463,70 +2671,39 @@
         </w:numPr>
       </w:pPr>
       <w:r>
-        <w:t xml:space="preserve">Hecho:</w:t>
+        <w:t xml:space="preserve">Ocho ejes y la vacancia en tres partes, con el perímetro del FMI verificado en su informe de 2025.</w:t>
+      </w:r>
+    </w:p>
+    <w:bookmarkEnd w:id="17"/>
+    <w:bookmarkStart w:id="18" w:name="etapa-3.-datos-hecha"/>
+    <w:p>
+      <w:pPr>
+        <w:pStyle w:val="Heading3"/>
+      </w:pPr>
+      <w:r>
+        <w:t xml:space="preserve">Etapa 3. Datos (hecha)</w:t>
       </w:r>
     </w:p>
     <w:p>
       <w:pPr>
         <w:pStyle w:val="Compact"/>
         <w:numPr>
-          <w:ilvl w:val="1"/>
+          <w:ilvl w:val="0"/>
           <w:numId w:val="1007"/>
         </w:numPr>
       </w:pPr>
       <w:r>
-        <w:t xml:space="preserve">los antecedentes de Santiago y los del texto LaTeX quedaron fusionados en ocho ejes, más la</w:t>
-      </w:r>
-      <w:r>
-        <w:t xml:space="preserve"> </w:t>
-      </w:r>
-      <w:r>
-        <w:t xml:space="preserve">vacancia (</w:t>
-      </w:r>
-      <w:r>
-        <w:rPr>
-          <w:rStyle w:val="VerbatimChar"/>
-        </w:rPr>
-        <w:t xml:space="preserve">antecedentes</w:t>
-      </w:r>
-      <w:r>
-        <w:t xml:space="preserve">);</w:t>
-      </w:r>
-    </w:p>
-    <w:p>
-      <w:pPr>
-        <w:pStyle w:val="Compact"/>
-        <w:numPr>
-          <w:ilvl w:val="1"/>
-          <w:numId w:val="1007"/>
-        </w:numPr>
-      </w:pPr>
-      <w:r>
-        <w:t xml:space="preserve">se verificó en el informe del FMI de 2025 (Informe de País N.° 25/95, anexo II) el perímetro</w:t>
-      </w:r>
-      <w:r>
-        <w:t xml:space="preserve"> </w:t>
-      </w:r>
-      <w:r>
-        <w:t xml:space="preserve">que usa ese organismo;</w:t>
-      </w:r>
-    </w:p>
-    <w:p>
-      <w:pPr>
-        <w:pStyle w:val="Compact"/>
-        <w:numPr>
-          <w:ilvl w:val="1"/>
-          <w:numId w:val="1007"/>
-        </w:numPr>
-      </w:pPr>
-      <w:r>
-        <w:t xml:space="preserve">Introducción y Antecedentes quedaron en un solo Word.</w:t>
-      </w:r>
-      <w:r>
-        <w:t xml:space="preserve"> </w:t>
-      </w:r>
-      <w:r>
-        <w:t xml:space="preserve">### Etapa 3. Datos (pendiente; es el siguiente paso técnico)</w:t>
+        <w:t xml:space="preserve">Series construidas desde fuentes primarias (MECON, BCRA, INDEC, FRED) y controladas contra el FMI (Capítulo 5).</w:t>
+      </w:r>
+    </w:p>
+    <w:bookmarkEnd w:id="18"/>
+    <w:bookmarkStart w:id="19" w:name="etapa-4.-metodología-hecha"/>
+    <w:p>
+      <w:pPr>
+        <w:pStyle w:val="Heading3"/>
+      </w:pPr>
+      <w:r>
+        <w:t xml:space="preserve">Etapa 4. Metodología (hecha)</w:t>
       </w:r>
     </w:p>
     <w:p>
@@ -2538,55 +2715,17 @@
         </w:numPr>
       </w:pPr>
       <w:r>
-        <w:t xml:space="preserve">Construir la deuda consolidada 1996-2025:</w:t>
-      </w:r>
-    </w:p>
-    <w:p>
-      <w:pPr>
-        <w:pStyle w:val="Compact"/>
-        <w:numPr>
-          <w:ilvl w:val="1"/>
-          <w:numId w:val="1009"/>
-        </w:numPr>
-      </w:pPr>
-      <w:r>
-        <w:t xml:space="preserve">bajar de la API del BCRA los pases (serie 1261) y las LEBAC (serie 1258) para 1996-2003;</w:t>
-      </w:r>
-      <w:r>
-        <w:t xml:space="preserve"> </w:t>
-      </w:r>
-      <w:r>
-        <w:t xml:space="preserve">las LEBAC empiezan en 2002, así que antes de ese año valen cero;</w:t>
-      </w:r>
-    </w:p>
-    <w:p>
-      <w:pPr>
-        <w:pStyle w:val="Compact"/>
-        <w:numPr>
-          <w:ilvl w:val="1"/>
-          <w:numId w:val="1009"/>
-        </w:numPr>
-      </w:pPr>
-      <w:r>
-        <w:t xml:space="preserve">empalmar el PIB nominal base 1993 con el base 2004;</w:t>
-      </w:r>
-    </w:p>
-    <w:p>
-      <w:pPr>
-        <w:pStyle w:val="Compact"/>
-        <w:numPr>
-          <w:ilvl w:val="1"/>
-          <w:numId w:val="1009"/>
-        </w:numPr>
-      </w:pPr>
-      <w:r>
-        <w:t xml:space="preserve">verificar que la deuda del SPNF y los pasivos del BCRA estén expresados sobre el mismo PIB</w:t>
-      </w:r>
-      <w:r>
-        <w:t xml:space="preserve"> </w:t>
-      </w:r>
-      <w:r>
-        <w:t xml:space="preserve">antes de sumarlos.</w:t>
+        <w:t xml:space="preserve">SVARX, identificación, ventana única, rezagos con regla AIC más estabilidad, canales de la FED, variantes y criterios de contraste (Capítulo 4).</w:t>
+      </w:r>
+    </w:p>
+    <w:bookmarkEnd w:id="19"/>
+    <w:bookmarkStart w:id="20" w:name="etapa-5.-estimación-hecha"/>
+    <w:p>
+      <w:pPr>
+        <w:pStyle w:val="Heading3"/>
+      </w:pPr>
+      <w:r>
+        <w:t xml:space="preserve">Etapa 5. Estimación (hecha)</w:t>
       </w:r>
     </w:p>
     <w:p>
@@ -2594,63 +2733,21 @@
         <w:pStyle w:val="Compact"/>
         <w:numPr>
           <w:ilvl w:val="0"/>
-          <w:numId w:val="1008"/>
+          <w:numId w:val="1009"/>
         </w:numPr>
       </w:pPr>
       <w:r>
-        <w:t xml:space="preserve">Recalcular la proporción de deuda en pesos para el perímetro consolidado. Hoy el código usa</w:t>
-      </w:r>
-      <w:r>
-        <w:t xml:space="preserve"> </w:t>
-      </w:r>
-      <w:r>
-        <w:t xml:space="preserve">46,3% para el SPNF solo.</w:t>
-      </w:r>
-    </w:p>
-    <w:p>
-      <w:pPr>
-        <w:pStyle w:val="Compact"/>
-        <w:numPr>
-          <w:ilvl w:val="0"/>
-          <w:numId w:val="1008"/>
-        </w:numPr>
-      </w:pPr>
-      <w:r>
-        <w:t xml:space="preserve">Bajar la tasa de la FED y la tasa sombra de Wu y Xia (que cubre los años de tasa cero) desde</w:t>
-      </w:r>
-      <w:r>
-        <w:t xml:space="preserve"> </w:t>
-      </w:r>
-      <w:r>
-        <w:t xml:space="preserve">FRED, y pasarlas a frecuencia trimestral.</w:t>
-      </w:r>
-    </w:p>
-    <w:p>
-      <w:pPr>
-        <w:pStyle w:val="Compact"/>
-        <w:numPr>
-          <w:ilvl w:val="0"/>
-          <w:numId w:val="1008"/>
-        </w:numPr>
-      </w:pPr>
-      <w:r>
-        <w:t xml:space="preserve">Validación: gráfico y valores de control de cada serie, revisados por el grupo antes de</w:t>
-      </w:r>
-      <w:r>
-        <w:t xml:space="preserve"> </w:t>
-      </w:r>
-      <w:r>
-        <w:t xml:space="preserve">seguir.</w:t>
-      </w:r>
-    </w:p>
-    <w:bookmarkEnd w:id="17"/>
-    <w:bookmarkStart w:id="18" w:name="etapa-4.-metodología-pendiente"/>
+        <w:t xml:space="preserve">Reacción fiscal 0,051 [0,020; 0,082]; respuestas a la FED no significativas por separado; diagnósticos informados (Capítulo 6).</w:t>
+      </w:r>
+    </w:p>
+    <w:bookmarkEnd w:id="20"/>
+    <w:bookmarkStart w:id="21" w:name="etapa-6.-simulación-hecha"/>
     <w:p>
       <w:pPr>
         <w:pStyle w:val="Heading3"/>
       </w:pPr>
       <w:r>
-        <w:t xml:space="preserve">Etapa 4. Metodología (pendiente)</w:t>
+        <w:t xml:space="preserve">Etapa 6. Simulación (hecha)</w:t>
       </w:r>
     </w:p>
     <w:p>
@@ -2662,78 +2759,17 @@
         </w:numPr>
       </w:pPr>
       <w:r>
-        <w:t xml:space="preserve">Reescribir el capítulo con el SVARX y la identificación.</w:t>
-      </w:r>
-    </w:p>
-    <w:p>
-      <w:pPr>
-        <w:pStyle w:val="Compact"/>
-        <w:numPr>
-          <w:ilvl w:val="0"/>
-          <w:numId w:val="1010"/>
-        </w:numPr>
-      </w:pPr>
-      <w:r>
-        <w:t xml:space="preserve">Definir el tamaño del shock de la FED con criterio justificado: un desvío estándar de la</w:t>
-      </w:r>
-      <w:r>
-        <w:t xml:space="preserve"> </w:t>
-      </w:r>
-      <w:r>
-        <w:t xml:space="preserve">serie, un episodio histórico como el de 2022-2023, o ambos.</w:t>
-      </w:r>
-    </w:p>
-    <w:p>
-      <w:pPr>
-        <w:pStyle w:val="Compact"/>
-        <w:numPr>
-          <w:ilvl w:val="0"/>
-          <w:numId w:val="1010"/>
-        </w:numPr>
-      </w:pPr>
-      <w:r>
-        <w:t xml:space="preserve">Escribir el criterio de H1b (contraste contra el FMI con intervalo de</w:t>
-      </w:r>
-      <w:r>
-        <w:t xml:space="preserve"> </w:t>
-      </w:r>
-      <w:r>
-        <w:rPr>
-          <w:i/>
-          <w:iCs/>
-        </w:rPr>
-        <w:t xml:space="preserve">bootstrap</w:t>
-      </w:r>
-      <w:r>
-        <w:t xml:space="preserve">) en el capítulo.</w:t>
-      </w:r>
-    </w:p>
-    <w:p>
-      <w:pPr>
-        <w:pStyle w:val="Compact"/>
-        <w:numPr>
-          <w:ilvl w:val="0"/>
-          <w:numId w:val="1010"/>
-        </w:numPr>
-      </w:pPr>
-      <w:r>
-        <w:t xml:space="preserve">Agregar diagnósticos de residuos: autocorrelación, heterocedasticidad, normalidad y</w:t>
-      </w:r>
-      <w:r>
-        <w:t xml:space="preserve"> </w:t>
-      </w:r>
-      <w:r>
-        <w:t xml:space="preserve">estabilidad.</w:t>
-      </w:r>
-    </w:p>
-    <w:bookmarkEnd w:id="18"/>
-    <w:bookmarkStart w:id="19" w:name="etapa-5.-estimación-pendiente"/>
+        <w:t xml:space="preserve">Escenario base y dos escenarios de la FED, robustez por perímetro, canal de tasas en pesos y shocks a la manera del FMI.</w:t>
+      </w:r>
+    </w:p>
+    <w:bookmarkEnd w:id="21"/>
+    <w:bookmarkStart w:id="22" w:name="Xc907a071765566996626b616efabd2797d61fd7"/>
     <w:p>
       <w:pPr>
         <w:pStyle w:val="Heading3"/>
       </w:pPr>
       <w:r>
-        <w:t xml:space="preserve">Etapa 5. Estimación (pendiente)</w:t>
+        <w:t xml:space="preserve">Etapa 7. Resultados, discusión y conclusiones (borrador listo para revisión del grupo)</w:t>
       </w:r>
     </w:p>
     <w:p>
@@ -2745,53 +2781,17 @@
         </w:numPr>
       </w:pPr>
       <w:r>
-        <w:t xml:space="preserve">Pruebas de raíz unitaria y de quiebres sobre la serie consolidada.</w:t>
-      </w:r>
-    </w:p>
-    <w:p>
-      <w:pPr>
-        <w:pStyle w:val="Compact"/>
-        <w:numPr>
-          <w:ilvl w:val="0"/>
-          <w:numId w:val="1011"/>
-        </w:numPr>
-      </w:pPr>
-      <w:r>
-        <w:t xml:space="preserve">SVARX con dummies en los quiebres que detecte el test de Bai-Perron.</w:t>
-      </w:r>
-    </w:p>
-    <w:p>
-      <w:pPr>
-        <w:pStyle w:val="Compact"/>
-        <w:numPr>
-          <w:ilvl w:val="0"/>
-          <w:numId w:val="1011"/>
-        </w:numPr>
-      </w:pPr>
-      <w:r>
-        <w:t xml:space="preserve">Respuestas al impulso ante un shock de la FED.</w:t>
-      </w:r>
-    </w:p>
-    <w:p>
-      <w:pPr>
-        <w:pStyle w:val="Compact"/>
-        <w:numPr>
-          <w:ilvl w:val="0"/>
-          <w:numId w:val="1011"/>
-        </w:numPr>
-      </w:pPr>
-      <w:r>
-        <w:t xml:space="preserve">Descomposición de varianza (H1a).</w:t>
-      </w:r>
-    </w:p>
-    <w:bookmarkEnd w:id="19"/>
-    <w:bookmarkStart w:id="20" w:name="etapa-6.-simulación-pendiente"/>
+        <w:t xml:space="preserve">H1a respaldada. H1b respaldada a cinco años (11,8% contra 3%); a diez años, 6,0% con el límite inferior en el umbral. H2 respaldada para un ciclo como el de 2022-2023, no para un shock de medio punto.</w:t>
+      </w:r>
+    </w:p>
+    <w:bookmarkEnd w:id="22"/>
+    <w:bookmarkStart w:id="23" w:name="etapa-8.-entrega-pendiente"/>
     <w:p>
       <w:pPr>
         <w:pStyle w:val="Heading3"/>
       </w:pPr>
       <w:r>
-        <w:t xml:space="preserve">Etapa 6. Simulación (pendiente)</w:t>
+        <w:t xml:space="preserve">Etapa 8. Entrega (pendiente)</w:t>
       </w:r>
     </w:p>
     <w:p>
@@ -2803,92 +2803,12 @@
         </w:numPr>
       </w:pPr>
       <w:r>
-        <w:t xml:space="preserve">Monte Carlo en el escenario base y con el shock de la FED.</w:t>
-      </w:r>
-    </w:p>
-    <w:p>
-      <w:pPr>
-        <w:pStyle w:val="Compact"/>
-        <w:numPr>
-          <w:ilvl w:val="0"/>
-          <w:numId w:val="1012"/>
-        </w:numPr>
-      </w:pPr>
-      <w:r>
-        <w:t xml:space="preserve">Métricas del FMI: probabilidad de no estabilización y ancho del abanico entre los</w:t>
-      </w:r>
-      <w:r>
-        <w:t xml:space="preserve"> </w:t>
-      </w:r>
-      <w:r>
-        <w:t xml:space="preserve">percentiles 5 y 95, medidos a cinco años y a 2035.</w:t>
-      </w:r>
-    </w:p>
-    <w:p>
-      <w:pPr>
-        <w:pStyle w:val="Compact"/>
-        <w:numPr>
-          <w:ilvl w:val="0"/>
-          <w:numId w:val="1012"/>
-        </w:numPr>
-      </w:pPr>
-      <w:r>
-        <w:t xml:space="preserve">Contraste de H1b y H2.</w:t>
-      </w:r>
-    </w:p>
-    <w:bookmarkEnd w:id="20"/>
-    <w:bookmarkStart w:id="21" w:name="X5b5e10ffb8ec09026463f48317a32f04e4fea2b"/>
-    <w:p>
-      <w:pPr>
-        <w:pStyle w:val="Heading3"/>
-      </w:pPr>
-      <w:r>
-        <w:t xml:space="preserve">Etapa 7. Resultados, discusión y conclusiones (pendiente)</w:t>
-      </w:r>
-    </w:p>
-    <w:p>
-      <w:pPr>
-        <w:pStyle w:val="Compact"/>
-        <w:numPr>
-          <w:ilvl w:val="0"/>
-          <w:numId w:val="1013"/>
-        </w:numPr>
-      </w:pPr>
-      <w:r>
-        <w:t xml:space="preserve">Si algún resultado contradice lo que hoy dice la tesis, se frena y se discute en el grupo</w:t>
-      </w:r>
-      <w:r>
-        <w:t xml:space="preserve"> </w:t>
-      </w:r>
-      <w:r>
-        <w:t xml:space="preserve">antes de escribirlo.</w:t>
-      </w:r>
-    </w:p>
-    <w:bookmarkEnd w:id="21"/>
-    <w:bookmarkStart w:id="22" w:name="etapa-8.-entrega-pendiente"/>
-    <w:p>
-      <w:pPr>
-        <w:pStyle w:val="Heading3"/>
-      </w:pPr>
-      <w:r>
-        <w:t xml:space="preserve">Etapa 8. Entrega (pendiente)</w:t>
-      </w:r>
-    </w:p>
-    <w:p>
-      <w:pPr>
-        <w:pStyle w:val="Compact"/>
-        <w:numPr>
-          <w:ilvl w:val="0"/>
-          <w:numId w:val="1014"/>
-        </w:numPr>
-      </w:pPr>
-      <w:r>
-        <w:t xml:space="preserve">Pasar todo al formato final y compilar.</w:t>
-      </w:r>
-    </w:p>
-    <w:bookmarkEnd w:id="22"/>
+        <w:t xml:space="preserve">Revisión del grupo y del director, y pasaje al formato final.</w:t>
+      </w:r>
+    </w:p>
     <w:bookmarkEnd w:id="23"/>
-    <w:bookmarkStart w:id="24" w:name="datos-pendientes-de-confirmar"/>
+    <w:bookmarkEnd w:id="24"/>
+    <w:bookmarkStart w:id="25" w:name="datos-pendientes-de-confirmar"/>
     <w:p>
       <w:pPr>
         <w:pStyle w:val="Heading2"/>
@@ -2995,22 +2915,22 @@
                 <w:rFonts w:ascii="Calibri" w:hAnsi="Calibri"/>
                 <w:sz w:val="20"/>
               </w:rPr>
-              <w:t xml:space="preserve">Fuente oficial de la colocación de diciembre de 2025 (USD 1.000 millones al 9,26%)</w:t>
-            </w:r>
-          </w:p>
-        </w:tc>
-        <w:tc>
-          <w:tcPr/>
-          <w:p>
-            <w:pPr>
-              <w:pStyle w:val="Compact"/>
-            </w:pPr>
-            <w:r>
-              <w:rPr>
-                <w:rFonts w:ascii="Calibri" w:hAnsi="Calibri"/>
-                <w:sz w:val="20"/>
-              </w:rPr>
-              <w:t xml:space="preserve">Introducción, contexto</w:t>
+              <w:t xml:space="preserve">Nivel de los pasivos remunerados del BCRA a fines de 2025</w:t>
+            </w:r>
+          </w:p>
+        </w:tc>
+        <w:tc>
+          <w:tcPr/>
+          <w:p>
+            <w:pPr>
+              <w:pStyle w:val="Compact"/>
+            </w:pPr>
+            <w:r>
+              <w:rPr>
+                <w:rFonts w:ascii="Calibri" w:hAnsi="Calibri"/>
+                <w:sz w:val="20"/>
+              </w:rPr>
+              <w:t xml:space="preserve">Introducción y vacancia</w:t>
             </w:r>
           </w:p>
         </w:tc>
@@ -3027,61 +2947,29 @@
                 <w:rFonts w:ascii="Calibri" w:hAnsi="Calibri"/>
                 <w:sz w:val="20"/>
               </w:rPr>
-              <w:t xml:space="preserve">Nivel de los pasivos remunerados del BCRA a fines de 2025</w:t>
-            </w:r>
-          </w:p>
-        </w:tc>
-        <w:tc>
-          <w:tcPr/>
-          <w:p>
-            <w:pPr>
-              <w:pStyle w:val="Compact"/>
-            </w:pPr>
-            <w:r>
-              <w:rPr>
-                <w:rFonts w:ascii="Calibri" w:hAnsi="Calibri"/>
-                <w:sz w:val="20"/>
-              </w:rPr>
-              <w:t xml:space="preserve">Introducción y vacancia</w:t>
-            </w:r>
-          </w:p>
-        </w:tc>
-      </w:tr>
-      <w:tr>
-        <w:tc>
-          <w:tcPr/>
-          <w:p>
-            <w:pPr>
-              <w:pStyle w:val="Compact"/>
-            </w:pPr>
-            <w:r>
-              <w:rPr>
-                <w:rFonts w:ascii="Calibri" w:hAnsi="Calibri"/>
-                <w:sz w:val="20"/>
-              </w:rPr>
-              <w:t xml:space="preserve">Denominador de los pasivos del BCRA: 9,5% en nuestra serie frente a 18,4% del FMI en 2023</w:t>
-            </w:r>
-          </w:p>
-        </w:tc>
-        <w:tc>
-          <w:tcPr/>
-          <w:p>
-            <w:pPr>
-              <w:pStyle w:val="Compact"/>
-            </w:pPr>
-            <w:r>
-              <w:rPr>
-                <w:rFonts w:ascii="Calibri" w:hAnsi="Calibri"/>
-                <w:sz w:val="20"/>
-              </w:rPr>
-              <w:t xml:space="preserve">Datos</w:t>
+              <w:t xml:space="preserve">Tenencias de títulos públicos del FGS (ANSES no permite la descarga automática; hay que bajarlas a mano)</w:t>
+            </w:r>
+          </w:p>
+        </w:tc>
+        <w:tc>
+          <w:tcPr/>
+          <w:p>
+            <w:pPr>
+              <w:pStyle w:val="Compact"/>
+            </w:pPr>
+            <w:r>
+              <w:rPr>
+                <w:rFonts w:ascii="Calibri" w:hAnsi="Calibri"/>
+                <w:sz w:val="20"/>
+              </w:rPr>
+              <w:t xml:space="preserve">Deuda neta (Capítulo 5)</w:t>
             </w:r>
           </w:p>
         </w:tc>
       </w:tr>
     </w:tbl>
-    <w:bookmarkEnd w:id="24"/>
-    <w:bookmarkStart w:id="25" w:name="decisiones-abiertas"/>
+    <w:bookmarkEnd w:id="25"/>
+    <w:bookmarkStart w:id="26" w:name="decisiones-abiertas"/>
     <w:p>
       <w:pPr>
         <w:pStyle w:val="Heading2"/>
@@ -3095,27 +2983,21 @@
         <w:pStyle w:val="Compact"/>
         <w:numPr>
           <w:ilvl w:val="0"/>
-          <w:numId w:val="1015"/>
+          <w:numId w:val="1013"/>
         </w:numPr>
       </w:pPr>
       <w:r>
-        <w:rPr>
-          <w:b/>
-          <w:bCs/>
-        </w:rPr>
-        <w:t xml:space="preserve">Tamaño del shock de la FED.</w:t>
-      </w:r>
-      <w:r>
-        <w:t xml:space="preserve"> </w:t>
-      </w:r>
-      <w:r>
-        <w:t xml:space="preserve">Hay dos criterios defendibles: un desvío estándar de la</w:t>
-      </w:r>
-      <w:r>
-        <w:t xml:space="preserve"> </w:t>
-      </w:r>
-      <w:r>
-        <w:t xml:space="preserve">serie o un episodio histórico. Se decide cuando esté la serie.</w:t>
+        <w:t xml:space="preserve">Ninguna de las que bloqueaban el trabajo. Las de tamaño del shock y horizonte quedaron resueltas (decisiones 12 y 13).</w:t>
+      </w:r>
+    </w:p>
+    <w:bookmarkEnd w:id="26"/>
+    <w:bookmarkStart w:id="27" w:name="referencias-de-este-documento"/>
+    <w:p>
+      <w:pPr>
+        <w:pStyle w:val="Heading2"/>
+      </w:pPr>
+      <w:r>
+        <w:t xml:space="preserve">Referencias de este documento</w:t>
       </w:r>
     </w:p>
     <w:p>
@@ -3123,45 +3005,7 @@
         <w:pStyle w:val="Compact"/>
         <w:numPr>
           <w:ilvl w:val="0"/>
-          <w:numId w:val="1015"/>
-        </w:numPr>
-      </w:pPr>
-      <w:r>
-        <w:rPr>
-          <w:b/>
-          <w:bCs/>
-        </w:rPr>
-        <w:t xml:space="preserve">Horizonte de las métricas.</w:t>
-      </w:r>
-      <w:r>
-        <w:t xml:space="preserve"> </w:t>
-      </w:r>
-      <w:r>
-        <w:t xml:space="preserve">A cinco años, como el FMI, a 2035, o ambos. La propuesta es</w:t>
-      </w:r>
-      <w:r>
-        <w:t xml:space="preserve"> </w:t>
-      </w:r>
-      <w:r>
-        <w:t xml:space="preserve">reportar los dos.</w:t>
-      </w:r>
-    </w:p>
-    <w:bookmarkEnd w:id="25"/>
-    <w:bookmarkStart w:id="26" w:name="referencias-de-este-documento"/>
-    <w:p>
-      <w:pPr>
-        <w:pStyle w:val="Heading2"/>
-      </w:pPr>
-      <w:r>
-        <w:t xml:space="preserve">Referencias de este documento</w:t>
-      </w:r>
-    </w:p>
-    <w:p>
-      <w:pPr>
-        <w:pStyle w:val="Compact"/>
-        <w:numPr>
-          <w:ilvl w:val="0"/>
-          <w:numId w:val="1016"/>
+          <w:numId w:val="1014"/>
         </w:numPr>
       </w:pPr>
       <w:r>
@@ -3203,7 +3047,7 @@
         <w:pStyle w:val="Compact"/>
         <w:numPr>
           <w:ilvl w:val="0"/>
-          <w:numId w:val="1016"/>
+          <w:numId w:val="1014"/>
         </w:numPr>
       </w:pPr>
       <w:r>
@@ -3245,7 +3089,7 @@
         <w:pStyle w:val="Compact"/>
         <w:numPr>
           <w:ilvl w:val="0"/>
-          <w:numId w:val="1016"/>
+          <w:numId w:val="1014"/>
         </w:numPr>
       </w:pPr>
       <w:r>
@@ -3287,7 +3131,7 @@
         <w:pStyle w:val="Compact"/>
         <w:numPr>
           <w:ilvl w:val="0"/>
-          <w:numId w:val="1016"/>
+          <w:numId w:val="1014"/>
         </w:numPr>
       </w:pPr>
       <w:r>
@@ -3307,8 +3151,8 @@
         <w:t xml:space="preserve">.</w:t>
       </w:r>
     </w:p>
-    <w:bookmarkEnd w:id="26"/>
     <w:bookmarkEnd w:id="27"/>
+    <w:bookmarkEnd w:id="28"/>
     <w:sectPr>
       <w:footnotePr>
         <w:numRestart w:val="eachSect"/>
@@ -3686,34 +3530,7 @@
     <w:abstractNumId w:val="991"/>
   </w:num>
   <w:num w:numId="1008">
-    <w:abstractNumId w:val="99411"/>
-    <w:lvlOverride w:ilvl="0">
-      <w:startOverride w:val="1"/>
-    </w:lvlOverride>
-    <w:lvlOverride w:ilvl="1">
-      <w:startOverride w:val="1"/>
-    </w:lvlOverride>
-    <w:lvlOverride w:ilvl="2">
-      <w:startOverride w:val="1"/>
-    </w:lvlOverride>
-    <w:lvlOverride w:ilvl="3">
-      <w:startOverride w:val="1"/>
-    </w:lvlOverride>
-    <w:lvlOverride w:ilvl="4">
-      <w:startOverride w:val="1"/>
-    </w:lvlOverride>
-    <w:lvlOverride w:ilvl="5">
-      <w:startOverride w:val="1"/>
-    </w:lvlOverride>
-    <w:lvlOverride w:ilvl="6">
-      <w:startOverride w:val="1"/>
-    </w:lvlOverride>
-    <w:lvlOverride w:ilvl="7">
-      <w:startOverride w:val="1"/>
-    </w:lvlOverride>
-    <w:lvlOverride w:ilvl="8">
-      <w:startOverride w:val="1"/>
-    </w:lvlOverride>
+    <w:abstractNumId w:val="991"/>
   </w:num>
   <w:num w:numId="1009">
     <w:abstractNumId w:val="991"/>
@@ -3731,39 +3548,6 @@
     <w:abstractNumId w:val="991"/>
   </w:num>
   <w:num w:numId="1014">
-    <w:abstractNumId w:val="991"/>
-  </w:num>
-  <w:num w:numId="1015">
-    <w:abstractNumId w:val="99411"/>
-    <w:lvlOverride w:ilvl="0">
-      <w:startOverride w:val="1"/>
-    </w:lvlOverride>
-    <w:lvlOverride w:ilvl="1">
-      <w:startOverride w:val="1"/>
-    </w:lvlOverride>
-    <w:lvlOverride w:ilvl="2">
-      <w:startOverride w:val="1"/>
-    </w:lvlOverride>
-    <w:lvlOverride w:ilvl="3">
-      <w:startOverride w:val="1"/>
-    </w:lvlOverride>
-    <w:lvlOverride w:ilvl="4">
-      <w:startOverride w:val="1"/>
-    </w:lvlOverride>
-    <w:lvlOverride w:ilvl="5">
-      <w:startOverride w:val="1"/>
-    </w:lvlOverride>
-    <w:lvlOverride w:ilvl="6">
-      <w:startOverride w:val="1"/>
-    </w:lvlOverride>
-    <w:lvlOverride w:ilvl="7">
-      <w:startOverride w:val="1"/>
-    </w:lvlOverride>
-    <w:lvlOverride w:ilvl="8">
-      <w:startOverride w:val="1"/>
-    </w:lvlOverride>
-  </w:num>
-  <w:num w:numId="1016">
     <w:abstractNumId w:val="991"/>
   </w:num>
 </w:numbering>

</xml_diff>

<commit_message>
docs(tesis): LaTeX sincronizado con los borradores, citas verificadas y coyuntura confirmada
- generar_latex.py: capitulos, resumen y referencias desde los .md; PDF de 61 paginas sin errores
- Tesis.tex: periodo 1996-2025 en el titulo, Times del sistema (Unicode), sin biber, acronimos nuevos
- Resumen nuevo y figura 6.1 (grafico de abanico) en el Word y en el PDF
- Siete citas del marco verificadas contra el texto completo; correcciones de atribucion
- Coyuntura: AN29 confirmado, sin emision bajo ley de Nueva York en 2026, LEFI en cero a fin de 2025
- Plan de labor: pendiente de FGS con fuentes y nuevo pendiente sobre las LEFI

Co-Authored-By: Claude Opus 5.5 <noreply@anthropic.com>
</commit_message>
<xml_diff>
--- a/tesis_oficial_borradores/para_el_grupo/Plan_de_labor.docx
+++ b/tesis_oficial_borradores/para_el_grupo/Plan_de_labor.docx
@@ -2883,22 +2883,22 @@
                 <w:rFonts w:ascii="Calibri" w:hAnsi="Calibri"/>
                 <w:sz w:val="20"/>
               </w:rPr>
-              <w:t xml:space="preserve">Si hubo emisión de deuda bajo ley de Nueva York en 2026</w:t>
-            </w:r>
-          </w:p>
-        </w:tc>
-        <w:tc>
-          <w:tcPr/>
-          <w:p>
-            <w:pPr>
-              <w:pStyle w:val="Compact"/>
-            </w:pPr>
-            <w:r>
-              <w:rPr>
-                <w:rFonts w:ascii="Calibri" w:hAnsi="Calibri"/>
-                <w:sz w:val="20"/>
-              </w:rPr>
-              <w:t xml:space="preserve">Introducción, contexto</w:t>
+              <w:t xml:space="preserve">Tenencias de títulos públicos del FGS (ANSES no permite la descarga automática; hay que bajarlas a mano). Fuente: Informes Estadísticos Mensuales en anses.gob.ar; sustituto: deuda en poder de Agencias del Sector Público, informes trimestrales de la Secretaría de Finanzas</w:t>
+            </w:r>
+          </w:p>
+        </w:tc>
+        <w:tc>
+          <w:tcPr/>
+          <w:p>
+            <w:pPr>
+              <w:pStyle w:val="Compact"/>
+            </w:pPr>
+            <w:r>
+              <w:rPr>
+                <w:rFonts w:ascii="Calibri" w:hAnsi="Calibri"/>
+                <w:sz w:val="20"/>
+              </w:rPr>
+              <w:t xml:space="preserve">Deuda neta (Capítulo 5)</w:t>
             </w:r>
           </w:p>
         </w:tc>
@@ -2915,54 +2915,22 @@
                 <w:rFonts w:ascii="Calibri" w:hAnsi="Calibri"/>
                 <w:sz w:val="20"/>
               </w:rPr>
-              <w:t xml:space="preserve">Nivel de los pasivos remunerados del BCRA a fines de 2025</w:t>
-            </w:r>
-          </w:p>
-        </w:tc>
-        <w:tc>
-          <w:tcPr/>
-          <w:p>
-            <w:pPr>
-              <w:pStyle w:val="Compact"/>
-            </w:pPr>
-            <w:r>
-              <w:rPr>
-                <w:rFonts w:ascii="Calibri" w:hAnsi="Calibri"/>
-                <w:sz w:val="20"/>
-              </w:rPr>
-              <w:t xml:space="preserve">Introducción y vacancia</w:t>
-            </w:r>
-          </w:p>
-        </w:tc>
-      </w:tr>
-      <w:tr>
-        <w:tc>
-          <w:tcPr/>
-          <w:p>
-            <w:pPr>
-              <w:pStyle w:val="Compact"/>
-            </w:pPr>
-            <w:r>
-              <w:rPr>
-                <w:rFonts w:ascii="Calibri" w:hAnsi="Calibri"/>
-                <w:sz w:val="20"/>
-              </w:rPr>
-              <w:t xml:space="preserve">Tenencias de títulos públicos del FGS (ANSES no permite la descarga automática; hay que bajarlas a mano)</w:t>
-            </w:r>
-          </w:p>
-        </w:tc>
-        <w:tc>
-          <w:tcPr/>
-          <w:p>
-            <w:pPr>
-              <w:pStyle w:val="Compact"/>
-            </w:pPr>
-            <w:r>
-              <w:rPr>
-                <w:rFonts w:ascii="Calibri" w:hAnsi="Calibri"/>
-                <w:sz w:val="20"/>
-              </w:rPr>
-              <w:t xml:space="preserve">Deuda neta (Capítulo 5)</w:t>
+              <w:t xml:space="preserve">Si las LEFI (julio de 2024 a julio de 2025; 11,1 billones de pesos en diciembre de 2024, según el Informe Monetario Mensual del BCRA) están en la deuda del Tesoro que usamos. La serie de pasivos del BCRA no las incluye; si tampoco están en la deuda del SPNF, faltan en la consolidada esos trimestres</w:t>
+            </w:r>
+          </w:p>
+        </w:tc>
+        <w:tc>
+          <w:tcPr/>
+          <w:p>
+            <w:pPr>
+              <w:pStyle w:val="Compact"/>
+            </w:pPr>
+            <w:r>
+              <w:rPr>
+                <w:rFonts w:ascii="Calibri" w:hAnsi="Calibri"/>
+                <w:sz w:val="20"/>
+              </w:rPr>
+              <w:t xml:space="preserve">Deuda consolidada (Capítulo 5)</w:t>
             </w:r>
           </w:p>
         </w:tc>

</xml_diff>

<commit_message>
feat(tesis): figuras, apendice estadistico y robustez de identificacion
- figuras_tesis.py: 8 figuras nuevas (deuda 1996-2025, variables, FED, respuestas al impulso,
  varianza por bloque, probabilidades por especificacion, abanico SVARX vs FMI, impulsores)
- apendice_tablas.py: apendice generado desde resultados (rezagos, diagnosticos, matriz S,
  ecuacion fiscal, simulacion completa)
- LaTeX: indice de figuras, apendice, figuras cerca del texto, titulos cortos; 71 paginas
- fase24 guarda las respuestas a la FED en todos los horizontes; texto de 6.1 corregido
  (3 de 84 respuestas excluyen el cero)
- fase25 --identificacion cholesky_fiscal_primero: H1a no es robusta a ese orden (pendiente)
- Agencias del Sector Publico (Finanzas) 2004-2025; FGS bloqueado por ANSES, queda manual
- Plan de labor: seccion de lo que falta, con links y decisiones abiertas

Co-Authored-By: Claude Opus 5.5 <noreply@anthropic.com>
</commit_message>
<xml_diff>
--- a/tesis_oficial_borradores/para_el_grupo/Plan_de_labor.docx
+++ b/tesis_oficial_borradores/para_el_grupo/Plan_de_labor.docx
@@ -2,7 +2,7 @@
 <file path=word/document.xml><?xml version="1.0" encoding="utf-8"?>
 <w:document xmlns:w="http://schemas.openxmlformats.org/wordprocessingml/2006/main" xmlns:m="http://schemas.openxmlformats.org/officeDocument/2006/math" xmlns:r="http://schemas.openxmlformats.org/officeDocument/2006/relationships" xmlns:o="urn:schemas-microsoft-com:office:office" xmlns:v="urn:schemas-microsoft-com:vml" xmlns:w10="urn:schemas-microsoft-com:office:word" xmlns:a="http://schemas.openxmlformats.org/drawingml/2006/main" xmlns:pic="http://schemas.openxmlformats.org/drawingml/2006/picture" xmlns:wp="http://schemas.openxmlformats.org/drawingml/2006/wordprocessingDrawing">
   <w:body>
-    <w:bookmarkStart w:id="28" w:name="plan-de-labor-de-la-tesis"/>
+    <w:bookmarkStart w:id="31" w:name="plan-de-labor-de-la-tesis"/>
     <w:p>
       <w:pPr>
         <w:pStyle w:val="Heading1"/>
@@ -2808,13 +2808,435 @@
     </w:p>
     <w:bookmarkEnd w:id="23"/>
     <w:bookmarkEnd w:id="24"/>
-    <w:bookmarkStart w:id="25" w:name="datos-pendientes-de-confirmar"/>
+    <w:bookmarkStart w:id="29" w:name="Xa8e40bf0238b7256ac06a4dd328c61f94733314"/>
     <w:p>
       <w:pPr>
         <w:pStyle w:val="Heading2"/>
       </w:pPr>
       <w:r>
-        <w:t xml:space="preserve">5. Datos pendientes de confirmar</w:t>
+        <w:t xml:space="preserve">5. Qué falta: tareas, verificaciones y decisiones (actualizado el 11/10/2026)</w:t>
+      </w:r>
+    </w:p>
+    <w:bookmarkStart w:id="25" w:name="datos-que-hay-que-bajar-o-confirmar"/>
+    <w:p>
+      <w:pPr>
+        <w:pStyle w:val="Heading3"/>
+      </w:pPr>
+      <w:r>
+        <w:t xml:space="preserve">5.1 Datos que hay que bajar o confirmar</w:t>
+      </w:r>
+    </w:p>
+    <w:tbl>
+      <w:tblPr>
+        <w:tblStyle w:val="Table"/>
+        <w:tblW w:type="pct" w:w="5000"/>
+        <w:tblLayout w:type="fixed"/>
+        <w:tblLook w:firstRow="1" w:lastRow="0" w:firstColumn="0" w:lastColumn="0" w:noHBand="0" w:noVBand="0" w:val="0020"/>
+        <w:tblBorders>
+          <w:top w:val="single" w:sz="4" w:color="808080"/>
+          <w:left w:val="single" w:sz="4" w:color="808080"/>
+          <w:bottom w:val="single" w:sz="4" w:color="808080"/>
+          <w:right w:val="single" w:sz="4" w:color="808080"/>
+          <w:insideH w:val="single" w:sz="4" w:color="808080"/>
+          <w:insideV w:val="single" w:sz="4" w:color="808080"/>
+        </w:tblBorders>
+      </w:tblPr>
+      <w:tblGrid>
+        <w:gridCol w:w="1980"/>
+        <w:gridCol w:w="1980"/>
+        <w:gridCol w:w="1980"/>
+        <w:gridCol w:w="1980"/>
+      </w:tblGrid>
+      <w:tr>
+        <w:trPr>
+          <w:tblHeader w:val="on"/>
+        </w:trPr>
+        <w:tc>
+          <w:tcPr/>
+          <w:p>
+            <w:pPr>
+              <w:pStyle w:val="Compact"/>
+            </w:pPr>
+            <w:r>
+              <w:rPr>
+                <w:rFonts w:ascii="Calibri" w:hAnsi="Calibri"/>
+                <w:sz w:val="20"/>
+              </w:rPr>
+              <w:t xml:space="preserve">Qué</w:t>
+            </w:r>
+          </w:p>
+        </w:tc>
+        <w:tc>
+          <w:tcPr/>
+          <w:p>
+            <w:pPr>
+              <w:pStyle w:val="Compact"/>
+            </w:pPr>
+            <w:r>
+              <w:rPr>
+                <w:rFonts w:ascii="Calibri" w:hAnsi="Calibri"/>
+                <w:sz w:val="20"/>
+              </w:rPr>
+              <w:t xml:space="preserve">Por qué importa</w:t>
+            </w:r>
+          </w:p>
+        </w:tc>
+        <w:tc>
+          <w:tcPr/>
+          <w:p>
+            <w:pPr>
+              <w:pStyle w:val="Compact"/>
+            </w:pPr>
+            <w:r>
+              <w:rPr>
+                <w:rFonts w:ascii="Calibri" w:hAnsi="Calibri"/>
+                <w:sz w:val="20"/>
+              </w:rPr>
+              <w:t xml:space="preserve">Cómo se resuelve</w:t>
+            </w:r>
+          </w:p>
+        </w:tc>
+        <w:tc>
+          <w:tcPr/>
+          <w:p>
+            <w:pPr>
+              <w:pStyle w:val="Compact"/>
+            </w:pPr>
+            <w:r>
+              <w:rPr>
+                <w:rFonts w:ascii="Calibri" w:hAnsi="Calibri"/>
+                <w:sz w:val="20"/>
+              </w:rPr>
+              <w:t xml:space="preserve">Estado</w:t>
+            </w:r>
+          </w:p>
+        </w:tc>
+      </w:tr>
+      <w:tr>
+        <w:tc>
+          <w:tcPr/>
+          <w:p>
+            <w:pPr>
+              <w:pStyle w:val="Compact"/>
+            </w:pPr>
+            <w:r>
+              <w:rPr>
+                <w:rFonts w:ascii="Calibri" w:hAnsi="Calibri"/>
+                <w:sz w:val="20"/>
+              </w:rPr>
+              <w:t xml:space="preserve">Títulos públicos en cartera del FGS (ANSES), 2008-2025</w:t>
+            </w:r>
+          </w:p>
+        </w:tc>
+        <w:tc>
+          <w:tcPr/>
+          <w:p>
+            <w:pPr>
+              <w:pStyle w:val="Compact"/>
+            </w:pPr>
+            <w:r>
+              <w:rPr>
+                <w:rFonts w:ascii="Calibri" w:hAnsi="Calibri"/>
+                <w:sz w:val="20"/>
+              </w:rPr>
+              <w:t xml:space="preserve">La deuda neta no descuenta la deuda del Tesoro en manos del FGS. Por eso queda unos 8 a 10 puntos del PIB por encima de la consolidada del FMI (119,0 contra 110,8 en 2023; 61,1 contra 51,5 en 2024). Según una nota de prensa no verificada, la cartera de títulos del FGS rondaba los USD 44.000 millones en octubre de 2024 (cerca de 7,7% del PIB): del orden de la brecha.</w:t>
+            </w:r>
+          </w:p>
+        </w:tc>
+        <w:tc>
+          <w:tcPr/>
+          <w:p>
+            <w:pPr>
+              <w:pStyle w:val="Compact"/>
+            </w:pPr>
+            <w:r>
+              <w:rPr>
+                <w:rFonts w:ascii="Calibri" w:hAnsi="Calibri"/>
+                <w:sz w:val="20"/>
+              </w:rPr>
+              <w:t xml:space="preserve">ANSES bloquea la descarga automática (protección anti-bots); hay que bajar los PDF a mano desde el navegador y guardarlos en</w:t>
+            </w:r>
+            <w:r>
+              <w:rPr>
+                <w:rFonts w:ascii="Calibri" w:hAnsi="Calibri"/>
+                <w:sz w:val="20"/>
+              </w:rPr>
+              <w:t xml:space="preserve"> </w:t>
+            </w:r>
+            <w:r>
+              <w:rPr>
+                <w:rStyle w:val="VerbatimChar"/>
+                <w:rFonts w:ascii="Calibri" w:hAnsi="Calibri"/>
+                <w:sz w:val="20"/>
+              </w:rPr>
+              <w:t xml:space="preserve">datos/crudos/fgs/</w:t>
+            </w:r>
+            <w:r>
+              <w:rPr>
+                <w:rFonts w:ascii="Calibri" w:hAnsi="Calibri"/>
+                <w:sz w:val="20"/>
+              </w:rPr>
+              <w:t xml:space="preserve">. Archivos: Informe Estadístico Mensual de enero de 2026 (https://www.anses.gob.ar/sites/default/files/archivo/2026-03/IEM-FGS-2026-01.pdf), Anuario 2024 (https://www.anses.gob.ar/sites/default/files/inline-files/Anuario%202024.pdf), Consejo del FGS de diciembre de 2025 (https://www.anses.gob.ar/sites/default/files/archivo/2026-02/Consejo%20FGS-Diciembre-2025.pdf) y, para años anteriores, los anuarios e informes de la página del FGS (https://www.anses.gob.ar/fgs-fondo-de-garantia-de-sustentabilidad). De cada uno se toma la fila</w:t>
+            </w:r>
+            <w:r>
+              <w:rPr>
+                <w:rFonts w:ascii="Calibri" w:hAnsi="Calibri"/>
+                <w:sz w:val="20"/>
+              </w:rPr>
+              <w:t xml:space="preserve"> </w:t>
+            </w:r>
+            <w:r>
+              <w:rPr>
+                <w:rFonts w:ascii="Calibri" w:hAnsi="Calibri"/>
+                <w:sz w:val="20"/>
+              </w:rPr>
+              <w:t xml:space="preserve">“Títulos Públicos Nacionales”</w:t>
+            </w:r>
+            <w:r>
+              <w:rPr>
+                <w:rFonts w:ascii="Calibri" w:hAnsi="Calibri"/>
+                <w:sz w:val="20"/>
+              </w:rPr>
+              <w:t xml:space="preserve"> </w:t>
+            </w:r>
+            <w:r>
+              <w:rPr>
+                <w:rFonts w:ascii="Calibri" w:hAnsi="Calibri"/>
+                <w:sz w:val="20"/>
+              </w:rPr>
+              <w:t xml:space="preserve">al cierre de cada año o trimestre. El script</w:t>
+            </w:r>
+            <w:r>
+              <w:rPr>
+                <w:rFonts w:ascii="Calibri" w:hAnsi="Calibri"/>
+                <w:sz w:val="20"/>
+              </w:rPr>
+              <w:t xml:space="preserve"> </w:t>
+            </w:r>
+            <w:r>
+              <w:rPr>
+                <w:rStyle w:val="VerbatimChar"/>
+                <w:rFonts w:ascii="Calibri" w:hAnsi="Calibri"/>
+                <w:sz w:val="20"/>
+              </w:rPr>
+              <w:t xml:space="preserve">codigo/ingesta_datos/construir_tenencias_fgs.py</w:t>
+            </w:r>
+            <w:r>
+              <w:rPr>
+                <w:rFonts w:ascii="Calibri" w:hAnsi="Calibri"/>
+                <w:sz w:val="20"/>
+              </w:rPr>
+              <w:t xml:space="preserve"> </w:t>
+            </w:r>
+            <w:r>
+              <w:rPr>
+                <w:rFonts w:ascii="Calibri" w:hAnsi="Calibri"/>
+                <w:sz w:val="20"/>
+              </w:rPr>
+              <w:t xml:space="preserve">ya está listo para leerlos.</w:t>
+            </w:r>
+          </w:p>
+        </w:tc>
+        <w:tc>
+          <w:tcPr/>
+          <w:p>
+            <w:pPr>
+              <w:pStyle w:val="Compact"/>
+            </w:pPr>
+            <w:r>
+              <w:rPr>
+                <w:rFonts w:ascii="Calibri" w:hAnsi="Calibri"/>
+                <w:sz w:val="20"/>
+              </w:rPr>
+              <w:t xml:space="preserve">Pendiente: bajar a mano</w:t>
+            </w:r>
+          </w:p>
+        </w:tc>
+      </w:tr>
+      <w:tr>
+        <w:tc>
+          <w:tcPr/>
+          <w:p>
+            <w:pPr>
+              <w:pStyle w:val="Compact"/>
+            </w:pPr>
+            <w:r>
+              <w:rPr>
+                <w:rFonts w:ascii="Calibri" w:hAnsi="Calibri"/>
+                <w:sz w:val="20"/>
+              </w:rPr>
+              <w:t xml:space="preserve">Deuda en manos de Agencias del Sector Público (Secretaría de Finanzas)</w:t>
+            </w:r>
+          </w:p>
+        </w:tc>
+        <w:tc>
+          <w:tcPr/>
+          <w:p>
+            <w:pPr>
+              <w:pStyle w:val="Compact"/>
+            </w:pPr>
+            <w:r>
+              <w:rPr>
+                <w:rFonts w:ascii="Calibri" w:hAnsi="Calibri"/>
+                <w:sz w:val="20"/>
+              </w:rPr>
+              <w:t xml:space="preserve">Sirve como dato descriptivo de la deuda intra-sector público. No se usa para restar, porque incluye otras entidades y duplicaría parte de lo que ya se consolida.</w:t>
+            </w:r>
+          </w:p>
+        </w:tc>
+        <w:tc>
+          <w:tcPr/>
+          <w:p>
+            <w:pPr>
+              <w:pStyle w:val="Compact"/>
+            </w:pPr>
+            <w:r>
+              <w:rPr>
+                <w:rFonts w:ascii="Calibri" w:hAnsi="Calibri"/>
+                <w:sz w:val="20"/>
+              </w:rPr>
+              <w:t xml:space="preserve">Ya está en</w:t>
+            </w:r>
+            <w:r>
+              <w:rPr>
+                <w:rFonts w:ascii="Calibri" w:hAnsi="Calibri"/>
+                <w:sz w:val="20"/>
+              </w:rPr>
+              <w:t xml:space="preserve"> </w:t>
+            </w:r>
+            <w:r>
+              <w:rPr>
+                <w:rStyle w:val="VerbatimChar"/>
+                <w:rFonts w:ascii="Calibri" w:hAnsi="Calibri"/>
+                <w:sz w:val="20"/>
+              </w:rPr>
+              <w:t xml:space="preserve">datos/procesados/tenencias_fgs_1996_2025.csv</w:t>
+            </w:r>
+            <w:r>
+              <w:rPr>
+                <w:rFonts w:ascii="Calibri" w:hAnsi="Calibri"/>
+                <w:sz w:val="20"/>
+              </w:rPr>
+              <w:t xml:space="preserve"> </w:t>
+            </w:r>
+            <w:r>
+              <w:rPr>
+                <w:rFonts w:ascii="Calibri" w:hAnsi="Calibri"/>
+                <w:sz w:val="20"/>
+              </w:rPr>
+              <w:t xml:space="preserve">(trimestral 2021-2025; anual en % del PIB 2004-2025), con los PDF de Finanzas en</w:t>
+            </w:r>
+            <w:r>
+              <w:rPr>
+                <w:rFonts w:ascii="Calibri" w:hAnsi="Calibri"/>
+                <w:sz w:val="20"/>
+              </w:rPr>
+              <w:t xml:space="preserve"> </w:t>
+            </w:r>
+            <w:r>
+              <w:rPr>
+                <w:rStyle w:val="VerbatimChar"/>
+                <w:rFonts w:ascii="Calibri" w:hAnsi="Calibri"/>
+                <w:sz w:val="20"/>
+              </w:rPr>
+              <w:t xml:space="preserve">datos/crudos/fgs/</w:t>
+            </w:r>
+            <w:r>
+              <w:rPr>
+                <w:rFonts w:ascii="Calibri" w:hAnsi="Calibri"/>
+                <w:sz w:val="20"/>
+              </w:rPr>
+              <w:t xml:space="preserve">.</w:t>
+            </w:r>
+          </w:p>
+        </w:tc>
+        <w:tc>
+          <w:tcPr/>
+          <w:p>
+            <w:pPr>
+              <w:pStyle w:val="Compact"/>
+            </w:pPr>
+            <w:r>
+              <w:rPr>
+                <w:rFonts w:ascii="Calibri" w:hAnsi="Calibri"/>
+                <w:sz w:val="20"/>
+              </w:rPr>
+              <w:t xml:space="preserve">Hecho</w:t>
+            </w:r>
+          </w:p>
+        </w:tc>
+      </w:tr>
+      <w:tr>
+        <w:tc>
+          <w:tcPr/>
+          <w:p>
+            <w:pPr>
+              <w:pStyle w:val="Compact"/>
+            </w:pPr>
+            <w:r>
+              <w:rPr>
+                <w:rFonts w:ascii="Calibri" w:hAnsi="Calibri"/>
+                <w:sz w:val="20"/>
+              </w:rPr>
+              <w:t xml:space="preserve">LEFI entre julio de 2024 y julio de 2025 (11,1 billones de pesos en diciembre de 2024, según el BCRA)</w:t>
+            </w:r>
+          </w:p>
+        </w:tc>
+        <w:tc>
+          <w:tcPr/>
+          <w:p>
+            <w:pPr>
+              <w:pStyle w:val="Compact"/>
+            </w:pPr>
+            <w:r>
+              <w:rPr>
+                <w:rFonts w:ascii="Calibri" w:hAnsi="Calibri"/>
+                <w:sz w:val="20"/>
+              </w:rPr>
+              <w:t xml:space="preserve">La serie de pasivos del BCRA no las incluye. Si tampoco están en la deuda del Tesoro que usamos, faltan en la consolidada esos trimestres, unos 2 puntos del PIB a fines de 2024. No afectan el punto de partida de diciembre de 2025, porque para entonces estaban en cero.</w:t>
+            </w:r>
+          </w:p>
+        </w:tc>
+        <w:tc>
+          <w:tcPr/>
+          <w:p>
+            <w:pPr>
+              <w:pStyle w:val="Compact"/>
+            </w:pPr>
+            <w:r>
+              <w:rPr>
+                <w:rFonts w:ascii="Calibri" w:hAnsi="Calibri"/>
+                <w:sz w:val="20"/>
+              </w:rPr>
+              <w:t xml:space="preserve">Revisar en los informes trimestrales de la Secretaría de Finanzas si las LEFI se cuentan como deuda bruta de la Administración Central. Si no, sumarlas a los pasivos consolidados de esos trimestres y reestimar.</w:t>
+            </w:r>
+          </w:p>
+        </w:tc>
+        <w:tc>
+          <w:tcPr/>
+          <w:p>
+            <w:pPr>
+              <w:pStyle w:val="Compact"/>
+            </w:pPr>
+            <w:r>
+              <w:rPr>
+                <w:rFonts w:ascii="Calibri" w:hAnsi="Calibri"/>
+                <w:sz w:val="20"/>
+              </w:rPr>
+              <w:t xml:space="preserve">Pendiente</w:t>
+            </w:r>
+          </w:p>
+        </w:tc>
+      </w:tr>
+    </w:tbl>
+    <w:bookmarkEnd w:id="25"/>
+    <w:bookmarkStart w:id="26" w:name="verificaciones-de-citas"/>
+    <w:p>
+      <w:pPr>
+        <w:pStyle w:val="Heading3"/>
+      </w:pPr>
+      <w:r>
+        <w:t xml:space="preserve">5.2 Verificaciones de citas</w:t>
       </w:r>
     </w:p>
     <w:tbl>
@@ -2866,7 +3288,7 @@
                 <w:rFonts w:ascii="Calibri" w:hAnsi="Calibri"/>
                 <w:sz w:val="20"/>
               </w:rPr>
-              <w:t xml:space="preserve">Dónde se usa</w:t>
+              <w:t xml:space="preserve">Estado</w:t>
             </w:r>
           </w:p>
         </w:tc>
@@ -2883,22 +3305,22 @@
                 <w:rFonts w:ascii="Calibri" w:hAnsi="Calibri"/>
                 <w:sz w:val="20"/>
               </w:rPr>
-              <w:t xml:space="preserve">Tenencias de títulos públicos del FGS (ANSES no permite la descarga automática; hay que bajarlas a mano). Fuente: Informes Estadísticos Mensuales en anses.gob.ar; sustituto: deuda en poder de Agencias del Sector Público, informes trimestrales de la Secretaría de Finanzas</w:t>
-            </w:r>
-          </w:p>
-        </w:tc>
-        <w:tc>
-          <w:tcPr/>
-          <w:p>
-            <w:pPr>
-              <w:pStyle w:val="Compact"/>
-            </w:pPr>
-            <w:r>
-              <w:rPr>
-                <w:rFonts w:ascii="Calibri" w:hAnsi="Calibri"/>
-                <w:sz w:val="20"/>
-              </w:rPr>
-              <w:t xml:space="preserve">Deuda neta (Capítulo 5)</w:t>
+              <w:t xml:space="preserve">Braun y Joy (1968), restricción externa</w:t>
+            </w:r>
+          </w:p>
+        </w:tc>
+        <w:tc>
+          <w:tcPr/>
+          <w:p>
+            <w:pPr>
+              <w:pStyle w:val="Compact"/>
+            </w:pPr>
+            <w:r>
+              <w:rPr>
+                <w:rFonts w:ascii="Calibri" w:hAnsi="Calibri"/>
+                <w:sz w:val="20"/>
+              </w:rPr>
+              <w:t xml:space="preserve">No hay copia abierta (Oxford y JSTOR). Si alguien tiene acceso por la facultad, se verifica contra el original; si no, se cita a través de la fuente secundaria (Katz y Kosacoff, CEPAL) indicándolo.</w:t>
             </w:r>
           </w:p>
         </w:tc>
@@ -2915,35 +3337,89 @@
                 <w:rFonts w:ascii="Calibri" w:hAnsi="Calibri"/>
                 <w:sz w:val="20"/>
               </w:rPr>
-              <w:t xml:space="preserve">Si las LEFI (julio de 2024 a julio de 2025; 11,1 billones de pesos en diciembre de 2024, según el Informe Monetario Mensual del BCRA) están en la deuda del Tesoro que usamos. La serie de pasivos del BCRA no las incluye; si tampoco están en la deuda del SPNF, faltan en la consolidada esos trimestres</w:t>
-            </w:r>
-          </w:p>
-        </w:tc>
-        <w:tc>
-          <w:tcPr/>
-          <w:p>
-            <w:pPr>
-              <w:pStyle w:val="Compact"/>
-            </w:pPr>
-            <w:r>
-              <w:rPr>
-                <w:rFonts w:ascii="Calibri" w:hAnsi="Calibri"/>
-                <w:sz w:val="20"/>
-              </w:rPr>
-              <w:t xml:space="preserve">Deuda consolidada (Capítulo 5)</w:t>
+              <w:t xml:space="preserve">Adler, Djigbenou y Sosa (2016)</w:t>
+            </w:r>
+          </w:p>
+        </w:tc>
+        <w:tc>
+          <w:tcPr/>
+          <w:p>
+            <w:pPr>
+              <w:pStyle w:val="Compact"/>
+            </w:pPr>
+            <w:r>
+              <w:rPr>
+                <w:rFonts w:ascii="Calibri" w:hAnsi="Calibri"/>
+                <w:sz w:val="20"/>
+              </w:rPr>
+              <w:t xml:space="preserve">Se verificó sobre el documento de trabajo del FMI (WP/14/60), no sobre la versión de la revista. Conviene leer la versión publicada si el tribunal lo exige.</w:t>
+            </w:r>
+          </w:p>
+        </w:tc>
+      </w:tr>
+      <w:tr>
+        <w:tc>
+          <w:tcPr/>
+          <w:p>
+            <w:pPr>
+              <w:pStyle w:val="Compact"/>
+            </w:pPr>
+            <w:r>
+              <w:rPr>
+                <w:rFonts w:ascii="Calibri" w:hAnsi="Calibri"/>
+                <w:sz w:val="20"/>
+              </w:rPr>
+              <w:t xml:space="preserve">Las otras siete citas del marco teórico</w:t>
+            </w:r>
+          </w:p>
+        </w:tc>
+        <w:tc>
+          <w:tcPr/>
+          <w:p>
+            <w:pPr>
+              <w:pStyle w:val="Compact"/>
+            </w:pPr>
+            <w:r>
+              <w:rPr>
+                <w:rFonts w:ascii="Calibri" w:hAnsi="Calibri"/>
+                <w:sz w:val="20"/>
+              </w:rPr>
+              <w:t xml:space="preserve">Verificadas contra el texto completo, con página (ver</w:t>
+            </w:r>
+            <w:r>
+              <w:rPr>
+                <w:rFonts w:ascii="Calibri" w:hAnsi="Calibri"/>
+                <w:sz w:val="20"/>
+              </w:rPr>
+              <w:t xml:space="preserve"> </w:t>
+            </w:r>
+            <w:r>
+              <w:rPr>
+                <w:rStyle w:val="VerbatimChar"/>
+                <w:rFonts w:ascii="Calibri" w:hAnsi="Calibri"/>
+                <w:sz w:val="20"/>
+              </w:rPr>
+              <w:t xml:space="preserve">verificacion_citas_marco.md</w:t>
+            </w:r>
+            <w:r>
+              <w:rPr>
+                <w:rFonts w:ascii="Calibri" w:hAnsi="Calibri"/>
+                <w:sz w:val="20"/>
+              </w:rPr>
+              <w:t xml:space="preserve">).</w:t>
             </w:r>
           </w:p>
         </w:tc>
       </w:tr>
     </w:tbl>
-    <w:bookmarkEnd w:id="25"/>
-    <w:bookmarkStart w:id="26" w:name="decisiones-abiertas"/>
-    <w:p>
-      <w:pPr>
-        <w:pStyle w:val="Heading2"/>
-      </w:pPr>
-      <w:r>
-        <w:t xml:space="preserve">6. Decisiones abiertas</w:t>
+    <w:bookmarkEnd w:id="26"/>
+    <w:bookmarkStart w:id="27" w:name="decisiones-abiertas-para-el-grupo"/>
+    <w:p>
+      <w:pPr>
+        <w:pStyle w:val="Heading3"/>
+      </w:pPr>
+      <w:r>
+        <w:t xml:space="preserve">5.3 Decisiones abiertas para el grupo</w:t>
       </w:r>
     </w:p>
     <w:p>
@@ -2955,17 +3431,49 @@
         </w:numPr>
       </w:pPr>
       <w:r>
-        <w:t xml:space="preserve">Ninguna de las que bloqueaban el trabajo. Las de tamaño del shock y horizonte quedaron resueltas (decisiones 12 y 13).</w:t>
-      </w:r>
-    </w:p>
-    <w:bookmarkEnd w:id="26"/>
-    <w:bookmarkStart w:id="27" w:name="referencias-de-este-documento"/>
-    <w:p>
-      <w:pPr>
-        <w:pStyle w:val="Heading2"/>
-      </w:pPr>
-      <w:r>
-        <w:t xml:space="preserve">Referencias de este documento</w:t>
+        <w:rPr>
+          <w:b/>
+          <w:bCs/>
+        </w:rPr>
+        <w:t xml:space="preserve">Robustez de H1a a la identificación.</w:t>
+      </w:r>
+      <w:r>
+        <w:t xml:space="preserve"> </w:t>
+      </w:r>
+      <w:r>
+        <w:t xml:space="preserve">Con la identificación principal (Blanchard y Perotti para el shock fiscal), los shocks no fiscales superan al fiscal en el 99% de las réplicas, con un intervalo de 90% de [17,5; 93,0]. Con una identificación de Cholesky que ordena el shock fiscal primero, se le atribuye a lo fiscal toda la covarianza contemporánea con las demás variables; es el ordenamiento más favorable a lo fiscal. Con ese ordenamiento, la participación fiscal sube a 33%, la cambiaria y de riesgo queda en 59%, y lo no fiscal supera a lo fiscal en el 78% de las réplicas. Pero el intervalo de la diferencia, [-43; 87], incluye el cero. H1b y H2 no cambian. Hay que decidir cómo se presenta: la propuesta es informarlo en la sección de robustez y en las limitaciones, y decir que H1a depende de identificar el shock fiscal con la elasticidad de Blanchard y Perotti, que es la que justifica la sección 4.4. No se escribió todavía en la tesis.</w:t>
+      </w:r>
+    </w:p>
+    <w:p>
+      <w:pPr>
+        <w:pStyle w:val="Compact"/>
+        <w:numPr>
+          <w:ilvl w:val="0"/>
+          <w:numId w:val="1013"/>
+        </w:numPr>
+      </w:pPr>
+      <w:r>
+        <w:rPr>
+          <w:b/>
+          <w:bCs/>
+        </w:rPr>
+        <w:t xml:space="preserve">Deuda neta con o sin FGS.</w:t>
+      </w:r>
+      <w:r>
+        <w:t xml:space="preserve"> </w:t>
+      </w:r>
+      <w:r>
+        <w:t xml:space="preserve">Cuando esté la serie del FGS, hay que definir si la deuda neta sin el FGS pasa a ser la especificación principal, porque es la más parecida a la del FMI, o si queda como robustez. En los dos casos hay que reestimar y volver a simular.</w:t>
+      </w:r>
+    </w:p>
+    <w:bookmarkEnd w:id="27"/>
+    <w:bookmarkStart w:id="28" w:name="otras-tareas"/>
+    <w:p>
+      <w:pPr>
+        <w:pStyle w:val="Heading3"/>
+      </w:pPr>
+      <w:r>
+        <w:t xml:space="preserve">5.4 Otras tareas</w:t>
       </w:r>
     </w:p>
     <w:p>
@@ -2977,6 +3485,68 @@
         </w:numPr>
       </w:pPr>
       <w:r>
+        <w:t xml:space="preserve">Revisión del texto completo por el grupo y por Pablo.</w:t>
+      </w:r>
+    </w:p>
+    <w:p>
+      <w:pPr>
+        <w:pStyle w:val="Compact"/>
+        <w:numPr>
+          <w:ilvl w:val="0"/>
+          <w:numId w:val="1014"/>
+        </w:numPr>
+      </w:pPr>
+      <w:r>
+        <w:t xml:space="preserve">Confirmar en el reglamento de tesis de la FCE si hace falta un resumen en inglés y una extensión máxima.</w:t>
+      </w:r>
+    </w:p>
+    <w:p>
+      <w:pPr>
+        <w:pStyle w:val="Compact"/>
+        <w:numPr>
+          <w:ilvl w:val="0"/>
+          <w:numId w:val="1014"/>
+        </w:numPr>
+      </w:pPr>
+      <w:r>
+        <w:t xml:space="preserve">Hecho: se borraron de</w:t>
+      </w:r>
+      <w:r>
+        <w:t xml:space="preserve"> </w:t>
+      </w:r>
+      <w:r>
+        <w:rPr>
+          <w:rStyle w:val="VerbatimChar"/>
+        </w:rPr>
+        <w:t xml:space="preserve">tesis/figuras/</w:t>
+      </w:r>
+      <w:r>
+        <w:t xml:space="preserve"> </w:t>
+      </w:r>
+      <w:r>
+        <w:t xml:space="preserve">las figuras de los modelos viejos que ya no usaba ningún capítulo (quedan en el historial de git).</w:t>
+      </w:r>
+    </w:p>
+    <w:bookmarkEnd w:id="28"/>
+    <w:bookmarkEnd w:id="29"/>
+    <w:bookmarkStart w:id="30" w:name="referencias-de-este-documento"/>
+    <w:p>
+      <w:pPr>
+        <w:pStyle w:val="Heading2"/>
+      </w:pPr>
+      <w:r>
+        <w:t xml:space="preserve">Referencias de este documento</w:t>
+      </w:r>
+    </w:p>
+    <w:p>
+      <w:pPr>
+        <w:pStyle w:val="Compact"/>
+        <w:numPr>
+          <w:ilvl w:val="0"/>
+          <w:numId w:val="1015"/>
+        </w:numPr>
+      </w:pPr>
+      <w:r>
         <w:t xml:space="preserve">Fondo Monetario Internacional. (2021).</w:t>
       </w:r>
       <w:r>
@@ -3015,7 +3585,7 @@
         <w:pStyle w:val="Compact"/>
         <w:numPr>
           <w:ilvl w:val="0"/>
-          <w:numId w:val="1014"/>
+          <w:numId w:val="1015"/>
         </w:numPr>
       </w:pPr>
       <w:r>
@@ -3057,7 +3627,7 @@
         <w:pStyle w:val="Compact"/>
         <w:numPr>
           <w:ilvl w:val="0"/>
-          <w:numId w:val="1014"/>
+          <w:numId w:val="1015"/>
         </w:numPr>
       </w:pPr>
       <w:r>
@@ -3099,7 +3669,7 @@
         <w:pStyle w:val="Compact"/>
         <w:numPr>
           <w:ilvl w:val="0"/>
-          <w:numId w:val="1014"/>
+          <w:numId w:val="1015"/>
         </w:numPr>
       </w:pPr>
       <w:r>
@@ -3119,8 +3689,8 @@
         <w:t xml:space="preserve">.</w:t>
       </w:r>
     </w:p>
-    <w:bookmarkEnd w:id="27"/>
-    <w:bookmarkEnd w:id="28"/>
+    <w:bookmarkEnd w:id="30"/>
+    <w:bookmarkEnd w:id="31"/>
     <w:sectPr>
       <w:footnotePr>
         <w:numRestart w:val="eachSect"/>
@@ -3513,9 +4083,39 @@
     <w:abstractNumId w:val="991"/>
   </w:num>
   <w:num w:numId="1013">
+    <w:abstractNumId w:val="99411"/>
+    <w:lvlOverride w:ilvl="0">
+      <w:startOverride w:val="1"/>
+    </w:lvlOverride>
+    <w:lvlOverride w:ilvl="1">
+      <w:startOverride w:val="1"/>
+    </w:lvlOverride>
+    <w:lvlOverride w:ilvl="2">
+      <w:startOverride w:val="1"/>
+    </w:lvlOverride>
+    <w:lvlOverride w:ilvl="3">
+      <w:startOverride w:val="1"/>
+    </w:lvlOverride>
+    <w:lvlOverride w:ilvl="4">
+      <w:startOverride w:val="1"/>
+    </w:lvlOverride>
+    <w:lvlOverride w:ilvl="5">
+      <w:startOverride w:val="1"/>
+    </w:lvlOverride>
+    <w:lvlOverride w:ilvl="6">
+      <w:startOverride w:val="1"/>
+    </w:lvlOverride>
+    <w:lvlOverride w:ilvl="7">
+      <w:startOverride w:val="1"/>
+    </w:lvlOverride>
+    <w:lvlOverride w:ilvl="8">
+      <w:startOverride w:val="1"/>
+    </w:lvlOverride>
+  </w:num>
+  <w:num w:numId="1014">
     <w:abstractNumId w:val="991"/>
   </w:num>
-  <w:num w:numId="1014">
+  <w:num w:numId="1015">
     <w:abstractNumId w:val="991"/>
   </w:num>
 </w:numbering>

</xml_diff>

<commit_message>
feat(tesis): retroalimentacion deuda-EMBI, propuestas de Santiago y comentarios de Pablo, guia de defensa
- fase24: bootstrap de la respuesta de cada variable a la deuda rezagada (EMBI +22 pb [11; 41])
- fase25: --sin-retroalimentacion (arquitectura A de Paez) y --identificacion cholesky_santiago
- Resultados 6.1 y 6.6: retroalimentacion de la deuda y contraste sin ella
- Comentarios de Pablo (15/9): cierre de Antecedentes (por que metodologia y variables),
  conector de la Introduccion; se saca "ventana unica" (decision del 18/9)
- Conclusiones: lineas futuras (panel Argentina-Chile, shocks FED de alta frecuencia, TI)
- guia_de_defensa.md y Guia_de_defensa.docx: paso a paso, criticas y respuestas

Co-Authored-By: Claude Opus 5.5 <noreply@anthropic.com>
</commit_message>
<xml_diff>
--- a/tesis_oficial_borradores/para_el_grupo/Plan_de_labor.docx
+++ b/tesis_oficial_borradores/para_el_grupo/Plan_de_labor.docx
@@ -2362,7 +2362,7 @@
                 <w:rFonts w:ascii="Calibri" w:hAnsi="Calibri"/>
                 <w:sz w:val="20"/>
               </w:rPr>
-              <w:t xml:space="preserve">Ventana única: todas las especificaciones se estiman sobre la misma muestra efectiva, 1998T2-2025T4, y los primeros trimestres de 1996-1998 se usan como condiciones iniciales de los rezagos.</w:t>
+              <w:t xml:space="preserve">Una sola muestra de estimación: todas las especificaciones se estiman sobre la misma muestra efectiva, 1998T2-2025T4, y los primeros trimestres de 1996-1998 se usan como condiciones iniciales de los rezagos.</w:t>
             </w:r>
           </w:p>
         </w:tc>
@@ -2715,7 +2715,7 @@
         </w:numPr>
       </w:pPr>
       <w:r>
-        <w:t xml:space="preserve">SVARX, identificación, ventana única, rezagos con regla AIC más estabilidad, canales de la FED, variantes y criterios de contraste (Capítulo 4).</w:t>
+        <w:t xml:space="preserve">SVARX, identificación, muestra de estimación común, rezagos con regla AIC más estabilidad, canales de la FED, variantes y criterios de contraste (Capítulo 4).</w:t>
       </w:r>
     </w:p>
     <w:bookmarkEnd w:id="19"/>
@@ -3424,7 +3424,6 @@
     </w:p>
     <w:p>
       <w:pPr>
-        <w:pStyle w:val="Compact"/>
         <w:numPr>
           <w:ilvl w:val="0"/>
           <w:numId w:val="1013"/>
@@ -3441,12 +3440,11 @@
         <w:t xml:space="preserve"> </w:t>
       </w:r>
       <w:r>
-        <w:t xml:space="preserve">Con la identificación principal (Blanchard y Perotti para el shock fiscal), los shocks no fiscales superan al fiscal en el 99% de las réplicas, con un intervalo de 90% de [17,5; 93,0]. Con una identificación de Cholesky que ordena el shock fiscal primero, se le atribuye a lo fiscal toda la covarianza contemporánea con las demás variables; es el ordenamiento más favorable a lo fiscal. Con ese ordenamiento, la participación fiscal sube a 33%, la cambiaria y de riesgo queda en 59%, y lo no fiscal supera a lo fiscal en el 78% de las réplicas. Pero el intervalo de la diferencia, [-43; 87], incluye el cero. H1b y H2 no cambian. Hay que decidir cómo se presenta: la propuesta es informarlo en la sección de robustez y en las limitaciones, y decir que H1a depende de identificar el shock fiscal con la elasticidad de Blanchard y Perotti, que es la que justifica la sección 4.4. No se escribió todavía en la tesis.</w:t>
-      </w:r>
-    </w:p>
-    <w:p>
-      <w:pPr>
-        <w:pStyle w:val="Compact"/>
+        <w:t xml:space="preserve">Con la identificación principal (Blanchard y Perotti para el shock fiscal), los shocks no fiscales superan al fiscal en el 99% de las réplicas, con un intervalo de 90% de [17,5; 93,0]. Con una identificación de Cholesky que ordena el shock fiscal primero, se le atribuye a lo fiscal toda la covarianza contemporánea con las demás variables; es el ordenamiento más favorable a lo fiscal. Con ese ordenamiento, la participación fiscal sube a 33%, la cambiaria y de riesgo queda en 59%, y lo no fiscal supera a lo fiscal en el 78% de las réplicas. Pero el intervalo de la diferencia, [-43; 87], incluye el cero. H1b y H2 no cambian. Con el orden de Cholesky que propuso Santiago en su metodología (crecimiento, TCRM, EMBI+, resultado primario), H1a queda más respaldada: 79 puntos de diferencia, con un intervalo de [38; 96]. Hay que decidir cómo se presenta: la propuesta es informarlo en la sección de robustez y en las limitaciones, y decir que H1a depende de identificar el shock fiscal con la elasticidad de Blanchard y Perotti, que es la que justifica la sección 4.4. No se escribió todavía en la tesis.</w:t>
+      </w:r>
+    </w:p>
+    <w:p>
+      <w:pPr>
         <w:numPr>
           <w:ilvl w:val="0"/>
           <w:numId w:val="1013"/>
@@ -3466,6 +3464,27 @@
         <w:t xml:space="preserve">Cuando esté la serie del FGS, hay que definir si la deuda neta sin el FGS pasa a ser la especificación principal, porque es la más parecida a la del FMI, o si queda como robustez. En los dos casos hay que reestimar y volver a simular.</w:t>
       </w:r>
     </w:p>
+    <w:p>
+      <w:pPr>
+        <w:numPr>
+          <w:ilvl w:val="0"/>
+          <w:numId w:val="1013"/>
+        </w:numPr>
+      </w:pPr>
+      <w:r>
+        <w:rPr>
+          <w:b/>
+          <w:bCs/>
+        </w:rPr>
+        <w:t xml:space="preserve">Propuestas del grupo ya incorporadas el 11/10.</w:t>
+      </w:r>
+      <w:r>
+        <w:t xml:space="preserve"> </w:t>
+      </w:r>
+      <w:r>
+        <w:t xml:space="preserve">Por un lado, la retroalimentación entre la deuda y las variables (arquitectura B de Santiago): un punto más de deuda sube el EMBI+ 22 puntos básicos [11; 41], y está en la sección 6.1. Por otro, el contraste sin retroalimentación (arquitectura A), en la sección 6.6. Se repuso además en las líneas futuras el panel Argentina-Chile (decisión del 17/9), y se sumaron los shocks de la FED de alta frecuencia y los términos de intercambio que proponía Santiago.</w:t>
+      </w:r>
+    </w:p>
     <w:bookmarkEnd w:id="27"/>
     <w:bookmarkStart w:id="28" w:name="otras-tareas"/>
     <w:p>
@@ -3497,7 +3516,7 @@
         </w:numPr>
       </w:pPr>
       <w:r>
-        <w:t xml:space="preserve">Confirmar en el reglamento de tesis de la FCE si hace falta un resumen en inglés y una extensión máxima.</w:t>
+        <w:t xml:space="preserve">Confirmado: no se pide resumen en inglés y la extensión tiene que ser corta. Candidato a recortar: el capítulo de Datos, llevando el detalle de construcción al apéndice.</w:t>
       </w:r>
     </w:p>
     <w:p>

</xml_diff>

<commit_message>
fix(tesis): correcciones de la revision adversarial (simulacion, inferencia y texto)
- Identidad con la inflacion relativa del FMI (reproduce su senda, control automatico)
- Retroalimentacion sobre el desvio acumulado; bootstrap que regenera la deuda; Kilian (1998)
- Estimacion central con 20.000 trayectorias; horizonte 2031; senda FED 2022-2025
- H1a con contraste de suficiencia; 18 robusteces; Resultados, Discusion, Conclusiones y Resumen
- Texto: 40 correcciones del jurado, citas y referencias, cursivas en terminos en ingles
- Guia de defensa y plan actualizados

Co-Authored-By: Claude Opus 5.5 <noreply@anthropic.com>
</commit_message>
<xml_diff>
--- a/tesis_oficial_borradores/para_el_grupo/Plan_de_labor.docx
+++ b/tesis_oficial_borradores/para_el_grupo/Plan_de_labor.docx
@@ -2781,7 +2781,7 @@
         </w:numPr>
       </w:pPr>
       <w:r>
-        <w:t xml:space="preserve">H1a respaldada en la especificación principal (no fiscal menos fiscal: 58 [13; 92]); no se sostiene con la deuda bruta ni con Cholesky con el fiscal primero. H1b respaldada a cinco años (11,5% contra 1%) y a diez años (6,6%, límite inferior 3,3%, contra menos de 3%). H2 respaldada para un ciclo como el de 2022-2023 (+9,5 puntos de probabilidad), no para un shock de medio punto.</w:t>
+        <w:t xml:space="preserve">Resultados corregidos tras la revisión adversarial del 11/10 (inflación relativa del FMI en la identidad, retroalimentación sobre el desvío acumulado, corrección de sesgo de Kilian, deuda regenerada en el bootstrap, horizonte 2031, senda real de la FED 2022-2025). H1b respaldada y robusta: 25,2% en 2031 [19,0; 27,7] contra 1%, y 22,3% en 2035 contra menos de 3%, en las 18 especificaciones. H1a respaldada por suficiencia: hace falta un superávit de 7,0% del PIB, el doble del máximo histórico (3,6%); la descomposición de la varianza no es robusta. H2 respaldada de manera débil: +13 puntos de probabilidad en 2035 [1; 25], que no se sostienen con Bonferroni.</w:t>
       </w:r>
     </w:p>
     <w:bookmarkEnd w:id="22"/>
@@ -3178,52 +3178,52 @@
                 <w:rFonts w:ascii="Calibri" w:hAnsi="Calibri"/>
                 <w:sz w:val="20"/>
               </w:rPr>
-              <w:t xml:space="preserve">LEFI entre julio de 2024 y julio de 2025 (11,1 billones de pesos en diciembre de 2024, según el BCRA)</w:t>
-            </w:r>
-          </w:p>
-        </w:tc>
-        <w:tc>
-          <w:tcPr/>
-          <w:p>
-            <w:pPr>
-              <w:pStyle w:val="Compact"/>
-            </w:pPr>
-            <w:r>
-              <w:rPr>
-                <w:rFonts w:ascii="Calibri" w:hAnsi="Calibri"/>
-                <w:sz w:val="20"/>
-              </w:rPr>
-              <w:t xml:space="preserve">La serie de pasivos del BCRA no las incluye. Si tampoco están en la deuda del Tesoro que usamos, faltan en la consolidada esos trimestres, unos 2 puntos del PIB a fines de 2024. No afectan el punto de partida de diciembre de 2025, porque para entonces estaban en cero.</w:t>
-            </w:r>
-          </w:p>
-        </w:tc>
-        <w:tc>
-          <w:tcPr/>
-          <w:p>
-            <w:pPr>
-              <w:pStyle w:val="Compact"/>
-            </w:pPr>
-            <w:r>
-              <w:rPr>
-                <w:rFonts w:ascii="Calibri" w:hAnsi="Calibri"/>
-                <w:sz w:val="20"/>
-              </w:rPr>
-              <w:t xml:space="preserve">Revisar en los informes trimestrales de la Secretaría de Finanzas si las LEFI se cuentan como deuda bruta de la Administración Central. Si no, sumarlas a los pasivos consolidados de esos trimestres y reestimar.</w:t>
-            </w:r>
-          </w:p>
-        </w:tc>
-        <w:tc>
-          <w:tcPr/>
-          <w:p>
-            <w:pPr>
-              <w:pStyle w:val="Compact"/>
-            </w:pPr>
-            <w:r>
-              <w:rPr>
-                <w:rFonts w:ascii="Calibri" w:hAnsi="Calibri"/>
-                <w:sz w:val="20"/>
-              </w:rPr>
-              <w:t xml:space="preserve">Pendiente</w:t>
+              <w:t xml:space="preserve">LEFI entre julio de 2024 y julio de 2025</w:t>
+            </w:r>
+          </w:p>
+        </w:tc>
+        <w:tc>
+          <w:tcPr/>
+          <w:p>
+            <w:pPr>
+              <w:pStyle w:val="Compact"/>
+            </w:pPr>
+            <w:r>
+              <w:rPr>
+                <w:rFonts w:ascii="Calibri" w:hAnsi="Calibri"/>
+                <w:sz w:val="20"/>
+              </w:rPr>
+              <w:t xml:space="preserve">Si no estaban en la deuda del Tesoro, faltaban en la consolidada.</w:t>
+            </w:r>
+          </w:p>
+        </w:tc>
+        <w:tc>
+          <w:tcPr/>
+          <w:p>
+            <w:pPr>
+              <w:pStyle w:val="Compact"/>
+            </w:pPr>
+            <w:r>
+              <w:rPr>
+                <w:rFonts w:ascii="Calibri" w:hAnsi="Calibri"/>
+                <w:sz w:val="20"/>
+              </w:rPr>
+              <w:t xml:space="preserve">Verificado en el Informe de Deuda del MECON al 31/12/2024 (hoja A.1.7): la LeFi/$/TNAPM/17-07-2025 figura en el stock de títulos y letras del Tesoro en moneda nacional, por 23,0 billones de pesos. Está en la deuda bruta, y la parte en poder del BCRA se resta como tenencia del BCRA. No falta nada.</w:t>
+            </w:r>
+          </w:p>
+        </w:tc>
+        <w:tc>
+          <w:tcPr/>
+          <w:p>
+            <w:pPr>
+              <w:pStyle w:val="Compact"/>
+            </w:pPr>
+            <w:r>
+              <w:rPr>
+                <w:rFonts w:ascii="Calibri" w:hAnsi="Calibri"/>
+                <w:sz w:val="20"/>
+              </w:rPr>
+              <w:t xml:space="preserve">Resuelto</w:t>
             </w:r>
           </w:p>
         </w:tc>
@@ -3434,13 +3434,13 @@
           <w:b/>
           <w:bCs/>
         </w:rPr>
-        <w:t xml:space="preserve">Robustez de H1a a la identificación y al perímetro.</w:t>
+        <w:t xml:space="preserve">Criterio de H1a (decidido el 11/10, para revisar con el grupo).</w:t>
       </w:r>
       <w:r>
         <w:t xml:space="preserve"> </w:t>
       </w:r>
       <w:r>
-        <w:t xml:space="preserve">Con la identificación principal (Blanchard y Perotti para el shock fiscal), los shocks no fiscales superan al fiscal por 58 puntos, con un intervalo de 90% de [13; 92]. Con el orden de Cholesky que propuso Santiago (crecimiento, TCRM, EMBI+, resultado primario), el respaldo es mayor: 78 [35; 96]. Hay dos especificaciones en que el intervalo incluye el cero: Cholesky con el shock fiscal primero, que es el orden más favorable a lo fiscal (33 [-48; 87]; 77% de las réplicas con lo no fiscal por encima), y la deuda bruta (53 [-7; 94]; 92% de las réplicas por encima). H1b y H2 no cambian en ninguna. Resuelto el 11/10: las dos están escritas en Robustez (6.6) y en Limitaciones (7.5), con la conclusión de que H1a depende de identificar el shock fiscal con la elasticidad de Blanchard y Perotti (sección 4.4).</w:t>
+        <w:t xml:space="preserve">La descomposición de la varianza no mide si el superávit alcanza, y con las correcciones no es significativa ni robusta. El criterio principal pasa a ser el contraste de suficiencia: el superávit que haría falta para llevar la probabilidad de no estabilización al 1% del FMI, comparado con el máximo histórico del Sector Público Nacional. La varianza se sigue informando. Conviene que Santiago y Pablo lo validen, porque es un cambio de criterio.</w:t>
       </w:r>
     </w:p>
     <w:p>

</xml_diff>

<commit_message>
feat(tesis): modelo rehecho tras la revision adversarial y tesis reescrita
- Perimetro principal: deuda federal bruta (el del FMI), con su punto de
  partida, escenario y metrica; la consolidada con el BCRA es extension
- Datos desde 1999 (sin valores transcriptos del EMBI), muestra 2000T3-2025T4
- Rezagos: Schwarz (Ivanov y Kilian, 2005) y adecuacion de residuos: 2
- Resultado primario con la definicion de cada perimetro
- VIX y FED estocasticos; remuestreo en bloques de dos anios
- Inferencia: MCO, bootstrap de bloques recursivo (Bruggemann et al., 2016)
  e intervalos de Hall; numeros aleatorios comunes; Kilian como robustez
- Identidad: flujos del FMI escalados por moneda, metrica con ajuste
  stock-flujo, crecimiento anual por nivel promedio
- H1a con su criterio original; titulo nuevo; pruebas pytest; hoja de numeros

Co-Authored-By: Claude Opus 5.5 <noreply@anthropic.com>
</commit_message>
<xml_diff>
--- a/tesis_oficial_borradores/para_el_grupo/Plan_de_labor.docx
+++ b/tesis_oficial_borradores/para_el_grupo/Plan_de_labor.docx
@@ -128,7 +128,7 @@
         <w:t xml:space="preserve"> </w:t>
       </w:r>
       <w:r>
-        <w:t xml:space="preserve">La solvencia intertemporal de la deuda consolidada argentina post-2025: proyecciones a partir de sus determinantes macroeconómicos (1996-2025).</w:t>
+        <w:t xml:space="preserve">Probabilidad de no estabilización de la deuda pública argentina, 2026-2035: un modelo SVARX con determinantes macroeconómicos y política monetaria de Estados Unidos.</w:t>
       </w:r>
     </w:p>
     <w:p>
@@ -146,7 +146,7 @@
         <w:t xml:space="preserve"> </w:t>
       </w:r>
       <w:r>
-        <w:t xml:space="preserve">deuda pública consolidada; sostenibilidad de la deuda; vectores autorregresivos estructurales; simulación de Monte Carlo; política monetaria de Estados Unidos.</w:t>
+        <w:t xml:space="preserve">deuda pública; sostenibilidad de la deuda; vectores autorregresivos estructurales; simulación de Monte Carlo; política monetaria de Estados Unidos.</w:t>
       </w:r>
     </w:p>
     <w:p>
@@ -186,7 +186,7 @@
         <w:t xml:space="preserve"> </w:t>
       </w:r>
       <w:r>
-        <w:t xml:space="preserve">de 2001 y la reestructuración de 2020. El proyecto se pregunta si ese superávit alcanza para estabilizar la deuda pública o si el crecimiento, el tipo de cambio real y el riesgo país la condicionan más que el esfuerzo fiscal. La deuda se mide en forma consolidada: la del Tesoro nacional más los pasivos remunerados del Banco Central de la República Argentina (BCRA). Se estimará un modelo de vectores autorregresivos estructural con variables exógenas (SVARX) con datos trimestrales de 1996 a 2025. El crecimiento, el resultado primario, el riesgo país y el tipo de cambio real serán las variables endógenas; la tasa de la Reserva Federal de los Estados Unidos (FED) y la volatilidad financiera global, las exógenas. Los</w:t>
+        <w:t xml:space="preserve">de 2001 y la reestructuración de 2020. El proyecto se pregunta si ese superávit alcanza para estabilizar la deuda pública o si el crecimiento, el tipo de cambio real y el riesgo país la condicionan más que el esfuerzo fiscal. La deuda principal será la bruta del gobierno federal, perímetro del análisis de sostenibilidad del Fondo Monetario Internacional (FMI); como extensión, la consolidada con el Banco Central de la República Argentina (BCRA). Se estimará un modelo de vectores autorregresivos estructural con variables exógenas (SVARX) con datos trimestrales de 1999 a 2025. El resultado primario, el crecimiento, el riesgo país y el tipo de cambio real serán las variables endógenas, y la deuda rezagada entrará en todas las ecuaciones. La tasa de la Reserva Federal de los Estados Unidos (FED) y la volatilidad financiera global serán exógenas. Los</w:t>
       </w:r>
       <w:r>
         <w:t xml:space="preserve"> </w:t>
@@ -208,7 +208,23 @@
         <w:t xml:space="preserve"> </w:t>
       </w:r>
       <w:r>
-        <w:t xml:space="preserve">del modelo alimentarán una simulación de Monte Carlo de la deuda entre 2026 y 2035 sobre el escenario base del Fondo Monetario Internacional (FMI). El resultado será la probabilidad de que la deuda no se estabilice, medida con el criterio del FMI, y su cambio ante un endurecimiento de la política monetaria de la FED. El estudio es cuantitativo, explicativo y longitudinal, y trabaja con datos secundarios. Se espera aportar una medida probabilística del riesgo de la deuda consolidada construida con el escenario y la métrica del FMI.</w:t>
+        <w:t xml:space="preserve">del modelo alimentarán una simulación de Monte Carlo de la deuda entre 2026 y 2035 sobre el escenario base del FMI, con su punto de partida y su métrica. Se obtendrá la probabilidad de que la deuda no se estabilice, comparable con la del FMI, la contribución de cada grupo de</w:t>
+      </w:r>
+      <w:r>
+        <w:t xml:space="preserve"> </w:t>
+      </w:r>
+      <w:r>
+        <w:rPr>
+          <w:i/>
+          <w:iCs/>
+        </w:rPr>
+        <w:t xml:space="preserve">shocks</w:t>
+      </w:r>
+      <w:r>
+        <w:t xml:space="preserve"> </w:t>
+      </w:r>
+      <w:r>
+        <w:t xml:space="preserve">a su varianza y el efecto de un endurecimiento de la política monetaria de la FED. El estudio es cuantitativo, explicativo y longitudinal, y trabaja con datos secundarios.</w:t>
       </w:r>
     </w:p>
     <w:bookmarkEnd w:id="11"/>
@@ -235,7 +251,7 @@
         <w:pStyle w:val="FirstParagraph"/>
       </w:pPr>
       <w:r>
-        <w:t xml:space="preserve">La sostenibilidad de la deuda pública consolidada argentina (Tesoro nacional y BCRA) y sus determinantes macroeconómicos, 1996-2035.</w:t>
+        <w:t xml:space="preserve">La sostenibilidad de la deuda pública argentina y sus determinantes macroeconómicos: estimación con datos de 1999-2025 y proyección para 2026-2035.</w:t>
       </w:r>
     </w:p>
     <w:bookmarkEnd w:id="12"/>
@@ -335,7 +351,7 @@
         <w:t xml:space="preserve"> </w:t>
       </w:r>
       <w:r>
-        <w:t xml:space="preserve">En la literatura revisada no se encontró un trabajo que cubra de manera conjunta tres aspectos para el caso argentino. No se encontró una estimación con</w:t>
+        <w:t xml:space="preserve">En la literatura revisada no se encontró un trabajo que cubra de manera conjunta tres aspectos para el caso argentino. El primero es una probabilidad de no estabilización calculada con</w:t>
       </w:r>
       <w:r>
         <w:t xml:space="preserve"> </w:t>
@@ -351,7 +367,33 @@
         <w:t xml:space="preserve"> </w:t>
       </w:r>
       <w:r>
-        <w:t xml:space="preserve">identificados: los trabajos revisados que los identifican lo hacen sobre paneles de países, y los que estudian la deuda argentina no los identifican. Tampoco se encontró una traducción del efecto de la política monetaria de Estados Unidos en un cambio de la probabilidad de que la deuda argentina no se estabilice. Y aunque el FMI (2021) admite incluir los pasivos del banco central en la deuda pública, en su análisis de la Argentina usa la deuda bruta del gobierno federal; la deuda consolidada con el BCRA aparece solo como un cuadro de stocks</w:t>
+        <w:t xml:space="preserve">identificados sobre el mismo perímetro, el mismo escenario y la misma métrica que usa el FMI: los trabajos revisados que identifican</w:t>
+      </w:r>
+      <w:r>
+        <w:t xml:space="preserve"> </w:t>
+      </w:r>
+      <w:r>
+        <w:rPr>
+          <w:i/>
+          <w:iCs/>
+        </w:rPr>
+        <w:t xml:space="preserve">shocks</w:t>
+      </w:r>
+      <w:r>
+        <w:t xml:space="preserve"> </w:t>
+      </w:r>
+      <w:r>
+        <w:t xml:space="preserve">lo hacen sobre paneles de países, y los que estudian la deuda argentina no los identifican. El segundo es la traducción del efecto de la política monetaria de Estados Unidos en un cambio de esa probabilidad. El tercero es la dinámica de la deuda consolidada con el BCRA: aunque el FMI (2021) admite incluir los pasivos del banco central en la deuda pública, en su análisis de la Argentina usa la deuda bruta del gobierno federal, y la consolidada aparece solo como un cuadro de</w:t>
+      </w:r>
+      <w:r>
+        <w:t xml:space="preserve"> </w:t>
+      </w:r>
+      <w:r>
+        <w:rPr>
+          <w:i/>
+          <w:iCs/>
+        </w:rPr>
+        <w:t xml:space="preserve">stocks</w:t>
       </w:r>
       <w:r>
         <w:rPr>
@@ -363,7 +405,7 @@
         <w:t xml:space="preserve"> </w:t>
       </w:r>
       <w:r>
-        <w:t xml:space="preserve">(FMI, 2025, anexo II). En la literatura revisada no se encontró un trabajo que estime cómo evolucionó esa deuda consolidada junto con sus determinantes.</w:t>
+        <w:t xml:space="preserve">(FMI, 2025, anexo II). No se encontró un trabajo que estime cómo evolucionó esa deuda junto con sus determinantes.</w:t>
       </w:r>
     </w:p>
     <w:bookmarkEnd w:id="14"/>
@@ -391,7 +433,23 @@
         <w:t xml:space="preserve"> </w:t>
       </w:r>
       <w:r>
-        <w:t xml:space="preserve">La historia argentina muestra un ciclo repetido de endeudamiento externo, interrupción de los flujos de capital y cesación de pagos (Reinhart y Rogoff, 2009; Rapoport, 2020). La administración que asumió en diciembre de 2023 recibió un stock elevado de pasivos y un acceso muy limitado al crédito voluntario. El Tesoro volvió a colocar un bono en dólares en diciembre de 2025, bajo ley local y a una tasa de 9,26% anual (Secretaría de Finanzas, 2025). A fines de julio de 2026, la deuda en moneda extranjera de la Administración Central sumaba USD 248.458 millones (Oficina de Presupuesto del Congreso [OPC], 2026). Entre 2002 y 2024, el BCRA absorbió liquidez con pasivos remunerados que llegaron a 18,4% del PIB en 2023 (FMI, 2025, anexo II), de modo que una parte del endeudamiento público no aparece en la deuda del Tesoro.</w:t>
+        <w:t xml:space="preserve">La historia argentina muestra un ciclo repetido de endeudamiento externo, interrupción de los flujos de capital y cesación de pagos (Reinhart y Rogoff, 2009; Rapoport, 2020). La administración que asumió en diciembre de 2023 recibió un</w:t>
+      </w:r>
+      <w:r>
+        <w:t xml:space="preserve"> </w:t>
+      </w:r>
+      <w:r>
+        <w:rPr>
+          <w:i/>
+          <w:iCs/>
+        </w:rPr>
+        <w:t xml:space="preserve">stock</w:t>
+      </w:r>
+      <w:r>
+        <w:t xml:space="preserve"> </w:t>
+      </w:r>
+      <w:r>
+        <w:t xml:space="preserve">elevado de pasivos y un acceso muy limitado al crédito voluntario. El Tesoro volvió a colocar un bono en dólares en diciembre de 2025, bajo ley local y a una tasa de 9,26% anual (Secretaría de Finanzas, 2025). A fines de julio de 2026, la deuda en moneda extranjera de la Administración Central sumaba USD 248.458 millones (Oficina de Presupuesto del Congreso [OPC], 2026). Durante buena parte del período, el BCRA absorbió liquidez con pasivos remunerados que llegaron a 18,4% del PIB en 2023 (FMI, 2025, anexo II), de modo que una parte del endeudamiento público no aparecía en la deuda del Tesoro.</w:t>
       </w:r>
     </w:p>
     <w:p>
@@ -409,7 +467,7 @@
         <w:t xml:space="preserve"> </w:t>
       </w:r>
       <w:r>
-        <w:t xml:space="preserve">Resta determinar si el superávit primario alcanza para estabilizar la deuda en el mediano plazo o si los determinantes estructurales de la economía argentina la condicionan más que el resultado fiscal.</w:t>
+        <w:t xml:space="preserve">El problema es determinar si el superávit primario alcanza para estabilizar la deuda en el mediano plazo o si los determinantes estructurales de la economía argentina la condicionan más que el resultado fiscal.</w:t>
       </w:r>
     </w:p>
     <w:p>
@@ -433,7 +491,7 @@
         </w:numPr>
       </w:pPr>
       <w:r>
-        <w:t xml:space="preserve">Pregunta general: ¿en qué medida el crecimiento, el tipo de cambio real, el riesgo país y el resultado primario de Argentina (1996-2025) condicionan la sostenibilidad de la deuda consolidada en 2026-2035, y cuál es la probabilidad de que la deuda no se estabilice bajo el escenario base?</w:t>
+        <w:t xml:space="preserve">Pregunta general: ¿en qué medida el crecimiento, el tipo de cambio real, el riesgo país y el resultado primario de Argentina condicionan la sostenibilidad de la deuda pública en 2026-2035, y cuál es la probabilidad de que la deuda no se estabilice bajo el escenario base del FMI?</w:t>
       </w:r>
     </w:p>
     <w:p>
@@ -445,7 +503,7 @@
         </w:numPr>
       </w:pPr>
       <w:r>
-        <w:t xml:space="preserve">Pregunta específica: ¿cómo y en qué magnitud impactaría un endurecimiento de la política monetaria de la FED sobre la dinámica de la deuda consolidada y sobre su probabilidad de no estabilizarse en 2026-2035?</w:t>
+        <w:t xml:space="preserve">Pregunta específica: ¿cómo y en qué magnitud impactaría un endurecimiento de la política monetaria de la FED sobre la dinámica de la deuda y sobre su probabilidad de no estabilizarse en 2026-2035?</w:t>
       </w:r>
     </w:p>
     <w:p>
@@ -463,7 +521,7 @@
         <w:t xml:space="preserve"> </w:t>
       </w:r>
       <w:r>
-        <w:t xml:space="preserve">Evaluar la dinámica de la deuda pública consolidada argentina a partir de sus determinantes macroeconómicos históricos (1996-2025), para proyectar su sostenibilidad en 2026-2035 y estimar la probabilidad de que no se estabilice.</w:t>
+        <w:t xml:space="preserve">Evaluar la dinámica de la deuda pública argentina a partir de sus determinantes macroeconómicos históricos (1999-2025), para proyectar su sostenibilidad en 2026-2035 y estimar la probabilidad de que no se estabilice.</w:t>
       </w:r>
     </w:p>
     <w:p>
@@ -487,7 +545,23 @@
         </w:numPr>
       </w:pPr>
       <w:r>
-        <w:t xml:space="preserve">Determinar la evolución de la deuda pública consolidada (Tesoro nacional y pasivos remunerados del BCRA) entre 1996 y 2025, con una serie trimestral construida para este trabajo.</w:t>
+        <w:t xml:space="preserve">Construir series trimestrales de la deuda bruta del gobierno federal y de la deuda consolidada con el BCRA entre 1999 y 2025, y contrastarlas con los</w:t>
+      </w:r>
+      <w:r>
+        <w:t xml:space="preserve"> </w:t>
+      </w:r>
+      <w:r>
+        <w:rPr>
+          <w:i/>
+          <w:iCs/>
+        </w:rPr>
+        <w:t xml:space="preserve">stocks</w:t>
+      </w:r>
+      <w:r>
+        <w:t xml:space="preserve"> </w:t>
+      </w:r>
+      <w:r>
+        <w:t xml:space="preserve">que publica el FMI.</w:t>
       </w:r>
     </w:p>
     <w:p>
@@ -539,7 +613,7 @@
         <w:t xml:space="preserve"> </w:t>
       </w:r>
       <w:r>
-        <w:t xml:space="preserve">fiscal, de actividad y cambiario y de riesgo a la variabilidad de la deuda.</w:t>
+        <w:t xml:space="preserve">fiscal, de actividad, cambiario y de riesgo y externo a la varianza de la deuda.</w:t>
       </w:r>
     </w:p>
     <w:p>
@@ -551,7 +625,7 @@
         </w:numPr>
       </w:pPr>
       <w:r>
-        <w:t xml:space="preserve">Simular la distribución de trayectorias de la deuda en 2026-2035 bajo el escenario base del FMI y calcular la probabilidad de que no se estabilice.</w:t>
+        <w:t xml:space="preserve">Simular la distribución de trayectorias de la deuda federal bruta en 2026-2035 bajo el escenario base del FMI, calcular la probabilidad de que no se estabilice y compararla con la del FMI; repetir el ejercicio con la deuda consolidada.</w:t>
       </w:r>
     </w:p>
     <w:p>
@@ -581,7 +655,7 @@
         <w:t xml:space="preserve"> </w:t>
       </w:r>
       <w:r>
-        <w:t xml:space="preserve">La Ley 27.612 (2021) exige una ley especial para emitir deuda en moneda extranjera bajo legislación extranjera por encima del máximo del presupuesto y una ley que apruebe cada programa con el FMI. Esas decisiones requieren evaluaciones de sostenibilidad, y la evaluación probabilística de referencia es la del FMI. El proyecto aporta una segunda medida, que usa el escenario y la métrica del FMI, con</w:t>
+        <w:t xml:space="preserve">La Ley 27.612 (2021) exige una ley especial para emitir deuda en moneda extranjera bajo legislación extranjera por encima del máximo del presupuesto y una ley que apruebe cada programa con el FMI. Esas decisiones requieren evaluaciones de sostenibilidad, y la evaluación probabilística de referencia es la del FMI. El proyecto aporta una segunda medida con</w:t>
       </w:r>
       <w:r>
         <w:t xml:space="preserve"> </w:t>
@@ -597,7 +671,33 @@
         <w:t xml:space="preserve"> </w:t>
       </w:r>
       <w:r>
-        <w:t xml:space="preserve">identificados y sobre el perímetro consolidado. En lo metodológico, deja un procedimiento replicable que puede actualizarse con cada nuevo informe del FMI.</w:t>
+        <w:t xml:space="preserve">identificados que usa el perímetro, el punto de partida, el escenario y la métrica del FMI, de modo que la diferencia entre ambas pueda atribuirse a la forma de generar los</w:t>
+      </w:r>
+      <w:r>
+        <w:t xml:space="preserve"> </w:t>
+      </w:r>
+      <w:r>
+        <w:rPr>
+          <w:i/>
+          <w:iCs/>
+        </w:rPr>
+        <w:t xml:space="preserve">shocks</w:t>
+      </w:r>
+      <w:r>
+        <w:t xml:space="preserve">. La extensión a la deuda consolidada con el BCRA mide la dinámica de un perímetro que el FMI informa solo como</w:t>
+      </w:r>
+      <w:r>
+        <w:t xml:space="preserve"> </w:t>
+      </w:r>
+      <w:r>
+        <w:rPr>
+          <w:i/>
+          <w:iCs/>
+        </w:rPr>
+        <w:t xml:space="preserve">stock</w:t>
+      </w:r>
+      <w:r>
+        <w:t xml:space="preserve">. En lo metodológico, deja un procedimiento replicable que puede actualizarse con cada nuevo informe del FMI.</w:t>
       </w:r>
     </w:p>
     <w:p>
@@ -615,17 +715,23 @@
         <w:t xml:space="preserve"> </w:t>
       </w:r>
       <w:r>
-        <w:t xml:space="preserve">El proyecto no requiere trabajo de campo ni financiamiento. La mayoría de los datos son de acceso público: Ministerio de Economía (MECON), BCRA, Instituto Nacional de Estadística y Censos (INDEC), FMI, Reserva Federal y la Bolsa de Opciones de Chicago (CBOE), que publica el índice de volatilidad implícita VIX. La excepción es el índice de bonos de mercados emergentes (EMBI+), que elabora J.P. Morgan y no se publica en forma libre: se obtiene de compilaciones secundarias, y el tramo 1996-1998, anterior al índice, se empalma con los diferenciales de los bonos Brady sin la parte garantizada (</w:t>
-      </w:r>
-      <w:r>
-        <w:rPr>
-          <w:i/>
-          <w:iCs/>
-        </w:rPr>
-        <w:t xml:space="preserve">stripped spreads</w:t>
-      </w:r>
-      <w:r>
-        <w:t xml:space="preserve">). La estimación y la simulación se programan en Python con bibliotecas de uso libre. El dato de acceso más incierto son las tenencias de títulos públicos del Fondo de Garantía de Sustentabilidad (FGS) de la Administración Nacional de la Seguridad Social (ANSES); si no se consiguen completas, se informa una variante que parte de la deuda consolidada neta del FMI, que ya las descuenta.</w:t>
+        <w:t xml:space="preserve">El proyecto no requiere trabajo de campo ni financiamiento. La mayoría de los datos son de acceso público: Ministerio de Economía (MECON), BCRA, Instituto Nacional de Estadística y Censos (INDEC), FMI, Reserva Federal y la Bolsa de Opciones de Chicago (CBOE), que publica el índice de volatilidad implícita VIX. La excepción es el índice de bonos de mercados emergentes (EMBI+), que elabora J.P. Morgan y no se publica en forma libre: se tomará de la serie diaria que publica Ámbito Financiero, disponible desde diciembre de 1998. Por eso los datos empiezan en 1999, el primer año en que todas las series tienen una fuente publicada y verificable. La estimación y la simulación se programarán en Python con bibliotecas de uso libre. El dato de acceso más incierto son las tenencias de títulos públicos del Fondo de Garantía de Sustentabilidad (FGS) de la Administración Nacional de la Seguridad Social (ANSES). Si no se consiguen completas, la serie histórica de deuda consolidada no las descontará y se declarará como limitación; la simulación de esa extensión partirá del</w:t>
+      </w:r>
+      <w:r>
+        <w:t xml:space="preserve"> </w:t>
+      </w:r>
+      <w:r>
+        <w:rPr>
+          <w:i/>
+          <w:iCs/>
+        </w:rPr>
+        <w:t xml:space="preserve">stock</w:t>
+      </w:r>
+      <w:r>
+        <w:t xml:space="preserve"> </w:t>
+      </w:r>
+      <w:r>
+        <w:t xml:space="preserve">consolidado del FMI, que ya las descuenta.</w:t>
       </w:r>
     </w:p>
     <w:bookmarkEnd w:id="15"/>
@@ -655,7 +761,7 @@
           <w:b/>
           <w:bCs/>
         </w:rPr>
-        <w:t xml:space="preserve">Restricción externa.</w:t>
+        <w:t xml:space="preserve">Nivel 1. Restricción externa.</w:t>
       </w:r>
       <w:r>
         <w:t xml:space="preserve"> </w:t>
@@ -673,13 +779,13 @@
           <w:b/>
           <w:bCs/>
         </w:rPr>
-        <w:t xml:space="preserve">Solvencia y sostenibilidad.</w:t>
-      </w:r>
-      <w:r>
-        <w:t xml:space="preserve"> </w:t>
-      </w:r>
-      <w:r>
-        <w:t xml:space="preserve">El gobierno es solvente si el valor presente de sus superávits primarios futuros cubre la deuda actual. Bohn (1998) muestra que una condición suficiente es que el superávit primario responda positivamente al nivel de deuda. Esa respuesta, sin embargo, no garantiza que la deuda se estabilice en un nivel determinado: si la diferencia entre la tasa de interés y el crecimiento es alta, el superávit necesario puede superar lo que la economía genera. El FMI (2021) define la deuda como sostenible cuando el gobierno puede cumplir sus obligaciones sin un ajuste poco realista, y evalúa la estabilización con la identidad de acumulación de la deuda.</w:t>
+        <w:t xml:space="preserve">Nivel 2. Solvencia y sostenibilidad.</w:t>
+      </w:r>
+      <w:r>
+        <w:t xml:space="preserve"> </w:t>
+      </w:r>
+      <w:r>
+        <w:t xml:space="preserve">El gobierno es solvente si el valor presente de sus superávits primarios futuros cubre la deuda actual. Bohn (1998) muestra que una condición suficiente es que el superávit primario responda positivamente al nivel de deuda. Esa respuesta no garantiza que la deuda se estabilice en un nivel determinado: si la diferencia entre la tasa de interés y el crecimiento es alta, el superávit necesario puede superar lo que la economía genera. La fatiga fiscal (Ghosh et al., 2013) fija un límite a cuánto superávit puede exigirse de manera realista. El FMI (2021) define la deuda como sostenible cuando el gobierno puede cumplir sus obligaciones sin un ajuste poco realista.</w:t>
       </w:r>
     </w:p>
     <w:p>
@@ -691,13 +797,29 @@
           <w:b/>
           <w:bCs/>
         </w:rPr>
-        <w:t xml:space="preserve">Identidad de la deuda con composición por monedas.</w:t>
-      </w:r>
-      <w:r>
-        <w:t xml:space="preserve"> </w:t>
-      </w:r>
-      <w:r>
-        <w:t xml:space="preserve">La ratio deuda/PIB cambia por el diferencial entre la tasa de interés y el crecimiento, por el resultado primario y, cuando parte de la deuda está en moneda extranjera, por la depreciación real. Esta identidad conecta las variables del modelo con la deuda y separa el efecto del esfuerzo fiscal del efecto de valuación.</w:t>
+        <w:t xml:space="preserve">Nivel 3. Identidad de la deuda y perímetro.</w:t>
+      </w:r>
+      <w:r>
+        <w:t xml:space="preserve"> </w:t>
+      </w:r>
+      <w:r>
+        <w:t xml:space="preserve">La ratio deuda/PIB cambia por el diferencial entre la tasa de interés y el crecimiento, por el resultado primario, por el ajuste entre</w:t>
+      </w:r>
+      <w:r>
+        <w:t xml:space="preserve"> </w:t>
+      </w:r>
+      <w:r>
+        <w:rPr>
+          <w:i/>
+          <w:iCs/>
+        </w:rPr>
+        <w:t xml:space="preserve">stocks</w:t>
+      </w:r>
+      <w:r>
+        <w:t xml:space="preserve"> </w:t>
+      </w:r>
+      <w:r>
+        <w:t xml:space="preserve">y flujos y, cuando parte de la deuda está en moneda extranjera, por la depreciación real. Esta identidad conecta las variables del modelo con la deuda y separa el efecto del esfuerzo fiscal del efecto de valuación. El FMI (2021) la usa para definir la estabilización: la deuda no se estabiliza en un año si el resultado primario es menor que el que la mantendría constante. El perímetro define qué deuda y qué resultado primario entran en la identidad. Cuando el banco central financia al Tesoro o absorbe liquidez con pasivos remunerados, la restricción relevante es la del sector público consolidado, y el FMI (2021) incluye esos pasivos en la deuda pública cuando pueden financiar al gobierno o representan un riesgo fiscal material.</w:t>
       </w:r>
     </w:p>
     <w:p>
@@ -709,77 +831,41 @@
           <w:b/>
           <w:bCs/>
         </w:rPr>
-        <w:t xml:space="preserve">Deuda consolidada.</w:t>
-      </w:r>
-      <w:r>
-        <w:t xml:space="preserve"> </w:t>
-      </w:r>
-      <w:r>
-        <w:t xml:space="preserve">Cuando el banco central financia al Tesoro o absorbe la liquidez con pasivos remunerados, la restricción presupuestaria relevante es la del sector público consolidado. El FMI (2021) incluye esos pasivos en la deuda pública cuando pueden financiar al gobierno o representan un riesgo fiscal material.</w:t>
-      </w:r>
-    </w:p>
-    <w:p>
-      <w:pPr>
-        <w:pStyle w:val="BodyText"/>
+        <w:t xml:space="preserve">Nivel 4. Transmisión externa y sostenibilidad probabilística.</w:t>
+      </w:r>
+      <w:r>
+        <w:t xml:space="preserve"> </w:t>
+      </w:r>
+      <w:r>
+        <w:t xml:space="preserve">Una suba de la tasa de la FED eleva la prima de riesgo de los emergentes (Uribe y Yue, 2006), deprecia su tipo de cambio real y reduce su crecimiento (Neumeyer y Perri, 2005). Cada canal entra en la identidad de la deuda por un término distinto. Como los determinantes son inciertos, la sostenibilidad se expresa como la probabilidad de que la deuda no se estabilice, construida con simulaciones (Celasun et al., 2006; FMI, 2021).</w:t>
+      </w:r>
+    </w:p>
+    <w:bookmarkEnd w:id="16"/>
+    <w:bookmarkStart w:id="17" w:name="hipótesis"/>
+    <w:p>
+      <w:pPr>
+        <w:pStyle w:val="Heading2"/>
+      </w:pPr>
+      <w:r>
+        <w:t xml:space="preserve">2.5. Hipótesis</w:t>
+      </w:r>
+    </w:p>
+    <w:p>
+      <w:pPr>
+        <w:pStyle w:val="FirstParagraph"/>
       </w:pPr>
       <w:r>
         <w:rPr>
           <w:b/>
           <w:bCs/>
         </w:rPr>
-        <w:t xml:space="preserve">Transmisión de la política monetaria de Estados Unidos.</w:t>
-      </w:r>
-      <w:r>
-        <w:t xml:space="preserve"> </w:t>
-      </w:r>
-      <w:r>
-        <w:t xml:space="preserve">Una suba de la tasa de la FED eleva la prima de riesgo de los emergentes (Uribe y Yue, 2006), deprecia su tipo de cambio real y reduce su crecimiento (Neumeyer y Perri, 2005). Cada canal entra en la identidad de la deuda por un término distinto.</w:t>
-      </w:r>
-    </w:p>
-    <w:p>
-      <w:pPr>
-        <w:pStyle w:val="BodyText"/>
-      </w:pPr>
-      <w:r>
-        <w:rPr>
-          <w:b/>
-          <w:bCs/>
-        </w:rPr>
-        <w:t xml:space="preserve">Sostenibilidad en sentido probabilístico.</w:t>
-      </w:r>
-      <w:r>
-        <w:t xml:space="preserve"> </w:t>
-      </w:r>
-      <w:r>
-        <w:t xml:space="preserve">Como los determinantes son inciertos, la sostenibilidad se expresa como la probabilidad de que la deuda no se estabilice, construida con simulaciones (Celasun et al., 2006; FMI, 2021). La fatiga fiscal (Ghosh et al., 2013) completa el marco: fija un límite a cuánto superávit puede exigirse de manera realista.</w:t>
-      </w:r>
-    </w:p>
-    <w:bookmarkEnd w:id="16"/>
-    <w:bookmarkStart w:id="17" w:name="hipótesis"/>
-    <w:p>
-      <w:pPr>
-        <w:pStyle w:val="Heading2"/>
-      </w:pPr>
-      <w:r>
-        <w:t xml:space="preserve">2.5. Hipótesis</w:t>
-      </w:r>
-    </w:p>
-    <w:p>
-      <w:pPr>
-        <w:pStyle w:val="FirstParagraph"/>
-      </w:pPr>
-      <w:r>
-        <w:rPr>
-          <w:b/>
-          <w:bCs/>
-        </w:rPr>
         <w:t xml:space="preserve">H1a.</w:t>
       </w:r>
       <w:r>
         <w:t xml:space="preserve"> </w:t>
       </w:r>
       <w:r>
-        <w:t xml:space="preserve">El crecimiento, el tipo de cambio real, el riesgo país y el resultado primario condicionan la sostenibilidad de la deuda consolidada, de modo que el superávit primario, por sí solo, no basta para estabilizarla en 2026-2035.</w:t>
+        <w:t xml:space="preserve">El crecimiento, el tipo de cambio real, el riesgo país y el resultado primario condicionan la sostenibilidad de la deuda, de modo que el superávit primario, por sí solo, no basta para estabilizarla en 2026-2035.</w:t>
       </w:r>
     </w:p>
     <w:p>
@@ -803,7 +889,23 @@
         </w:numPr>
       </w:pPr>
       <w:r>
-        <w:t xml:space="preserve">Variables: resultado primario necesario en 2031 y probabilidad de no estabilización de la deuda consolidada en 2031.</w:t>
+        <w:t xml:space="preserve">Variables: contribución de los</w:t>
+      </w:r>
+      <w:r>
+        <w:t xml:space="preserve"> </w:t>
+      </w:r>
+      <w:r>
+        <w:rPr>
+          <w:i/>
+          <w:iCs/>
+        </w:rPr>
+        <w:t xml:space="preserve">shocks</w:t>
+      </w:r>
+      <w:r>
+        <w:t xml:space="preserve"> </w:t>
+      </w:r>
+      <w:r>
+        <w:t xml:space="preserve">fiscal, de actividad, cambiario y de riesgo y externo a la varianza de la deuda federal bruta en 2035.</w:t>
       </w:r>
     </w:p>
     <w:p>
@@ -815,7 +917,39 @@
         </w:numPr>
       </w:pPr>
       <w:r>
-        <w:t xml:space="preserve">Relación esperada: el resultado primario que reduciría esa probabilidad a la estimación puntual del FMI para Argentina (1%) supera el máximo del Sector Público Nacional en 1996-2025.</w:t>
+        <w:t xml:space="preserve">Relación esperada: la contribución conjunta de los</w:t>
+      </w:r>
+      <w:r>
+        <w:t xml:space="preserve"> </w:t>
+      </w:r>
+      <w:r>
+        <w:rPr>
+          <w:i/>
+          <w:iCs/>
+        </w:rPr>
+        <w:t xml:space="preserve">shocks</w:t>
+      </w:r>
+      <w:r>
+        <w:t xml:space="preserve"> </w:t>
+      </w:r>
+      <w:r>
+        <w:t xml:space="preserve">no fiscales es mayor que la del</w:t>
+      </w:r>
+      <w:r>
+        <w:t xml:space="preserve"> </w:t>
+      </w:r>
+      <w:r>
+        <w:rPr>
+          <w:i/>
+          <w:iCs/>
+        </w:rPr>
+        <w:t xml:space="preserve">shock</w:t>
+      </w:r>
+      <w:r>
+        <w:t xml:space="preserve"> </w:t>
+      </w:r>
+      <w:r>
+        <w:t xml:space="preserve">fiscal.</w:t>
       </w:r>
     </w:p>
     <w:p>
@@ -827,7 +961,7 @@
         </w:numPr>
       </w:pPr>
       <w:r>
-        <w:t xml:space="preserve">Criterio de contraste: la hipótesis se respalda si el resultado primario necesario, con el de todos los años del escenario base desplazado en la misma magnitud, supera ese máximo (3,6% del PIB en 2004). La descomposición de la varianza de la deuda por bloque de</w:t>
+        <w:t xml:space="preserve">Criterio de contraste: la hipótesis se respalda si la diferencia entre la contribución de los</w:t>
       </w:r>
       <w:r>
         <w:t xml:space="preserve"> </w:t>
@@ -843,7 +977,23 @@
         <w:t xml:space="preserve"> </w:t>
       </w:r>
       <w:r>
-        <w:t xml:space="preserve">se informa como complemento.</w:t>
+        <w:t xml:space="preserve">no fiscales y la del</w:t>
+      </w:r>
+      <w:r>
+        <w:t xml:space="preserve"> </w:t>
+      </w:r>
+      <w:r>
+        <w:rPr>
+          <w:i/>
+          <w:iCs/>
+        </w:rPr>
+        <w:t xml:space="preserve">shock</w:t>
+      </w:r>
+      <w:r>
+        <w:t xml:space="preserve"> </w:t>
+      </w:r>
+      <w:r>
+        <w:t xml:space="preserve">fiscal es positiva y su intervalo de 90% excluye el cero. Como complemento descriptivo, sin criterio de contraste, se calculará la probabilidad de no estabilización con el resultado primario en su máximo anual de 1999-2025 y el aumento del resultado primario que la llevaría a la estimación del FMI.</w:t>
       </w:r>
     </w:p>
     <w:p>
@@ -861,7 +1011,7 @@
         <w:t xml:space="preserve"> </w:t>
       </w:r>
       <w:r>
-        <w:t xml:space="preserve">La probabilidad de que la deuda consolidada no se estabilice es mayor que la que informa el FMI para la deuda federal bruta: alrededor de 1% a mediano plazo (2031) y menos de 3% a diez años (2035) (FMI, 2026).</w:t>
+        <w:t xml:space="preserve">La probabilidad de que la deuda federal bruta no se estabilice es mayor que la que informa el FMI para esa misma deuda: alrededor de 1% a mediano plazo (2031) y menos de 3% a diez años (2035) (FMI, 2026).</w:t>
       </w:r>
     </w:p>
     <w:p>
@@ -885,7 +1035,7 @@
         </w:numPr>
       </w:pPr>
       <w:r>
-        <w:t xml:space="preserve">Variables: probabilidad de no estabilización de la deuda consolidada en 2031 y 2035, y la probabilidad que informa el FMI para cada horizonte.</w:t>
+        <w:t xml:space="preserve">Variables: probabilidad de no estabilización de la deuda federal bruta en 2031 y 2035, calculada con el punto de partida, el escenario base y la métrica del FMI, y la probabilidad que informa el FMI para cada horizonte.</w:t>
       </w:r>
     </w:p>
     <w:p>
@@ -909,7 +1059,7 @@
         </w:numPr>
       </w:pPr>
       <w:r>
-        <w:t xml:space="preserve">Criterio de contraste: el límite inferior del intervalo de 90% supera la cifra del FMI en cada horizonte (1% y 3%); se informa también la corrección de Bonferroni.</w:t>
+        <w:t xml:space="preserve">Criterio de contraste: el límite inferior del intervalo de 90% supera la cifra del FMI en cada horizonte (1% y 3%); se informará también el límite con la corrección de Bonferroni por los dos horizontes (95%).</w:t>
       </w:r>
     </w:p>
     <w:p>
@@ -927,7 +1077,7 @@
         <w:t xml:space="preserve"> </w:t>
       </w:r>
       <w:r>
-        <w:t xml:space="preserve">Un endurecimiento de la política monetaria de la FED eleva la trayectoria esperada de la deuda consolidada y su probabilidad de no estabilizarse, a través del riesgo país, el tipo de cambio real y el crecimiento.</w:t>
+        <w:t xml:space="preserve">Un endurecimiento de la política monetaria de la FED eleva la trayectoria esperada de la deuda y su probabilidad de no estabilizarse, a través del riesgo país, el tipo de cambio real y el crecimiento.</w:t>
       </w:r>
     </w:p>
     <w:p>
@@ -975,7 +1125,7 @@
         </w:numPr>
       </w:pPr>
       <w:r>
-        <w:t xml:space="preserve">Criterio de contraste: el intervalo de 90% de la diferencia entre cada escenario de la FED y el base excluye el cero, para la probabilidad y para la deuda esperada; se informa también la corrección de Bonferroni y la respuesta de cada canal.</w:t>
+        <w:t xml:space="preserve">Criterio de contraste: el intervalo de 90% de la diferencia entre cada escenario de la FED y el base excluye el cero en 2035, para la probabilidad y para la deuda esperada. Se mide al final del horizonte porque el efecto de una tasa más alta se acumula; 2031 se informará. Se informarán también la corrección de Bonferroni y la respuesta de cada canal.</w:t>
       </w:r>
     </w:p>
     <w:bookmarkEnd w:id="17"/>
@@ -1003,7 +1153,7 @@
         <w:t xml:space="preserve"> </w:t>
       </w:r>
       <w:r>
-        <w:t xml:space="preserve">Cuantitativo, explicativo y longitudinal. Es explicativo porque busca medir cómo los determinantes macroeconómicos afectan la deuda. Es retrospectivo en la estimación (1996-2025) y prospectivo en la simulación (2026-2035).</w:t>
+        <w:t xml:space="preserve">Cuantitativo, explicativo y longitudinal. Es explicativo porque busca medir cómo los determinantes macroeconómicos afectan la deuda. Es retrospectivo en la estimación (1999-2025) y prospectivo en la simulación (2026-2035).</w:t>
       </w:r>
     </w:p>
     <w:p>
@@ -1021,7 +1171,7 @@
         <w:t xml:space="preserve"> </w:t>
       </w:r>
       <w:r>
-        <w:t xml:space="preserve">La unidad de análisis es la economía argentina, observada como serie temporal trimestral. La población son todos los trimestres con datos de deuda pública. La muestra es no probabilística e intencional: 1996-2025, porque desde 1996 pueden construirse series trimestrales de todas las variables, con empalmes donde cambia la fuente o la metodología (el EMBI+ antes de 1999, la base del PIB en 2004, el resultado primario en 2007 y 2015), y porque el período incluye regímenes cambiarios y fiscales distintos (convertibilidad,</w:t>
+        <w:t xml:space="preserve">La unidad de análisis es la economía argentina, observada como serie temporal trimestral. La población son todos los trimestres con datos de deuda pública. La muestra es no probabilística e intencional: 1999T1-2025T4, porque desde 1999 todas las series tienen una fuente publicada y verificable, y porque el período incluye regímenes cambiarios y fiscales distintos (convertibilidad,</w:t>
       </w:r>
       <w:r>
         <w:t xml:space="preserve"> </w:t>
@@ -1034,7 +1184,7 @@
         <w:t xml:space="preserve">default</w:t>
       </w:r>
       <w:r>
-        <w:t xml:space="preserve">, desendeudamiento, reendeudamiento y programa con el FMI). La muestra efectiva de estimación es 1998T2-2025T4 (111 trimestres), porque los primeros trimestres se reservan para los rezagos.</w:t>
+        <w:t xml:space="preserve">, desendeudamiento, reendeudamiento y programa con el FMI). La muestra efectiva de estimación será 2000T3-2025T4 (102 trimestres): los primeros trimestres se reservan como condiciones iniciales, para que todos los órdenes de rezago considerados, hasta seis, se comparen sobre la misma muestra (Lütkepohl, 2005, sec. 4.3).</w:t>
       </w:r>
     </w:p>
     <w:p>
@@ -1052,7 +1202,23 @@
         <w:t xml:space="preserve"> </w:t>
       </w:r>
       <w:r>
-        <w:t xml:space="preserve">Todos los datos son secundarios. La evaluación de cada serie revisará cuatro aspectos: la institución que la produce, la definición y cobertura, los cambios metodológicos (por ejemplo, el cambio de base del PIB en 2004) y la coherencia con otra fuente. La serie de deuda consolidada se construirá sumando la deuda bruta de la Administración Central y los pasivos remunerados del BCRA, y restando la deuda del Tesoro en poder del BCRA y los depósitos del Tesoro en el banco central. Se contrastará con el cuadro de deuda consolidada del FMI (2025, anexo II) en los años en que ambos se superponen.</w:t>
+        <w:t xml:space="preserve">Todos los datos son secundarios. La evaluación de cada serie revisará cuatro aspectos: la institución que la produce, la definición y cobertura, los cambios metodológicos (el cambio de base del PIB en 2004 y los tramos metodológicos del resultado primario de 2007 y 2015) y la coherencia con otra fuente. La deuda federal bruta se tomará de los informes de deuda del MECON y se contrastará con la del FMI; la simulación partirá del</w:t>
+      </w:r>
+      <w:r>
+        <w:t xml:space="preserve"> </w:t>
+      </w:r>
+      <w:r>
+        <w:rPr>
+          <w:i/>
+          <w:iCs/>
+        </w:rPr>
+        <w:t xml:space="preserve">stock</w:t>
+      </w:r>
+      <w:r>
+        <w:t xml:space="preserve"> </w:t>
+      </w:r>
+      <w:r>
+        <w:t xml:space="preserve">del FMI a fines de 2025 (80,3% del PIB), que incluye conceptos que el MECON no informa, como los intereses capitalizados. La deuda consolidada se construirá sumando la deuda bruta de la Administración Central y los pasivos remunerados del BCRA, y restando la deuda del Tesoro en poder del BCRA y los depósitos del Tesoro en el banco central. Se contrastará con el cuadro de deuda consolidada del FMI (2025, anexo II; 2026) en los años en que ambos se superponen. El resultado primario se definirá de manera coherente con cada perímetro: con rentas de la propiedad para la deuda federal, que es la definición del FMI para el gobierno federal, porque las utilidades que el BCRA transfiere al Tesoro son un ingreso del Tesoro; sin rentas de la propiedad para la deuda consolidada, porque en ese perímetro esas utilidades son un flujo interno. La otra definición se informará como robustez. En la tasa de la FED, el cambio de la tasa sombra a la tasa efectiva en 2022T1 se tratará de modo que no se confunda con un cambio de política.</w:t>
       </w:r>
     </w:p>
     <w:p>
@@ -1315,7 +1481,7 @@
                 <w:rFonts w:ascii="Calibri" w:hAnsi="Calibri"/>
                 <w:sz w:val="20"/>
               </w:rPr>
-              <w:t xml:space="preserve">Deuda pública consolidada</w:t>
+              <w:t xml:space="preserve">Deuda pública federal</w:t>
             </w:r>
           </w:p>
         </w:tc>
@@ -1353,7 +1519,7 @@
                 <w:rFonts w:ascii="Calibri" w:hAnsi="Calibri"/>
                 <w:sz w:val="20"/>
               </w:rPr>
-              <w:t xml:space="preserve">Deuda del Tesoro y del BCRA neta de tenencias cruzadas, % del PIB</w:t>
+              <w:t xml:space="preserve">Deuda bruta de la Administración Central, % del PIB</w:t>
             </w:r>
           </w:p>
         </w:tc>
@@ -1372,7 +1538,37 @@
                 <w:rFonts w:ascii="Calibri" w:hAnsi="Calibri"/>
                 <w:sz w:val="20"/>
               </w:rPr>
-              <w:t xml:space="preserve">MECON y BCRA</w:t>
+              <w:t xml:space="preserve">MECON;</w:t>
+            </w:r>
+            <w:r>
+              <w:rPr>
+                <w:rFonts w:ascii="Calibri" w:hAnsi="Calibri"/>
+                <w:sz w:val="20"/>
+              </w:rPr>
+              <w:t xml:space="preserve"> </w:t>
+            </w:r>
+            <w:r>
+              <w:rPr>
+                <w:rFonts w:ascii="Calibri" w:hAnsi="Calibri"/>
+                <w:i/>
+                <w:iCs/>
+                <w:sz w:val="20"/>
+              </w:rPr>
+              <w:t xml:space="preserve">stock</w:t>
+            </w:r>
+            <w:r>
+              <w:rPr>
+                <w:rFonts w:ascii="Calibri" w:hAnsi="Calibri"/>
+                <w:sz w:val="20"/>
+              </w:rPr>
+              <w:t xml:space="preserve"> </w:t>
+            </w:r>
+            <w:r>
+              <w:rPr>
+                <w:rFonts w:ascii="Calibri" w:hAnsi="Calibri"/>
+                <w:sz w:val="20"/>
+              </w:rPr>
+              <w:t xml:space="preserve">inicial del FMI (2026)</w:t>
             </w:r>
           </w:p>
         </w:tc>
@@ -1391,7 +1587,7 @@
                 <w:rFonts w:ascii="Calibri" w:hAnsi="Calibri"/>
                 <w:sz w:val="20"/>
               </w:rPr>
-              <w:t xml:space="preserve">Entra rezagada y se acumula con la identidad</w:t>
+              <w:t xml:space="preserve">Entra rezagada y se acumula con la identidad (principal)</w:t>
             </w:r>
           </w:p>
         </w:tc>
@@ -1412,7 +1608,7 @@
                 <w:rFonts w:ascii="Calibri" w:hAnsi="Calibri"/>
                 <w:sz w:val="20"/>
               </w:rPr>
-              <w:t xml:space="preserve">Política fiscal</w:t>
+              <w:t xml:space="preserve">Deuda pública consolidada</w:t>
             </w:r>
           </w:p>
         </w:tc>
@@ -1431,7 +1627,7 @@
                 <w:rFonts w:ascii="Calibri" w:hAnsi="Calibri"/>
                 <w:sz w:val="20"/>
               </w:rPr>
-              <w:t xml:space="preserve">Esfuerzo fiscal</w:t>
+              <w:t xml:space="preserve">Nivel de endeudamiento</w:t>
             </w:r>
           </w:p>
         </w:tc>
@@ -1450,7 +1646,7 @@
                 <w:rFonts w:ascii="Calibri" w:hAnsi="Calibri"/>
                 <w:sz w:val="20"/>
               </w:rPr>
-              <w:t xml:space="preserve">Resultado primario del Sector Público Nacional, % del PIB</w:t>
+              <w:t xml:space="preserve">Deuda del Tesoro y del BCRA neta de tenencias cruzadas, % del PIB</w:t>
             </w:r>
           </w:p>
         </w:tc>
@@ -1469,7 +1665,37 @@
                 <w:rFonts w:ascii="Calibri" w:hAnsi="Calibri"/>
                 <w:sz w:val="20"/>
               </w:rPr>
-              <w:t xml:space="preserve">MECON</w:t>
+              <w:t xml:space="preserve">MECON y BCRA;</w:t>
+            </w:r>
+            <w:r>
+              <w:rPr>
+                <w:rFonts w:ascii="Calibri" w:hAnsi="Calibri"/>
+                <w:sz w:val="20"/>
+              </w:rPr>
+              <w:t xml:space="preserve"> </w:t>
+            </w:r>
+            <w:r>
+              <w:rPr>
+                <w:rFonts w:ascii="Calibri" w:hAnsi="Calibri"/>
+                <w:i/>
+                <w:iCs/>
+                <w:sz w:val="20"/>
+              </w:rPr>
+              <w:t xml:space="preserve">stock</w:t>
+            </w:r>
+            <w:r>
+              <w:rPr>
+                <w:rFonts w:ascii="Calibri" w:hAnsi="Calibri"/>
+                <w:sz w:val="20"/>
+              </w:rPr>
+              <w:t xml:space="preserve"> </w:t>
+            </w:r>
+            <w:r>
+              <w:rPr>
+                <w:rFonts w:ascii="Calibri" w:hAnsi="Calibri"/>
+                <w:sz w:val="20"/>
+              </w:rPr>
+              <w:t xml:space="preserve">inicial del FMI (2026)</w:t>
             </w:r>
           </w:p>
         </w:tc>
@@ -1488,7 +1714,7 @@
                 <w:rFonts w:ascii="Calibri" w:hAnsi="Calibri"/>
                 <w:sz w:val="20"/>
               </w:rPr>
-              <w:t xml:space="preserve">Endógena</w:t>
+              <w:t xml:space="preserve">Entra rezagada y se acumula con la identidad (extensión)</w:t>
             </w:r>
           </w:p>
         </w:tc>
@@ -1509,7 +1735,7 @@
                 <w:rFonts w:ascii="Calibri" w:hAnsi="Calibri"/>
                 <w:sz w:val="20"/>
               </w:rPr>
-              <w:t xml:space="preserve">Actividad</w:t>
+              <w:t xml:space="preserve">Política fiscal</w:t>
             </w:r>
           </w:p>
         </w:tc>
@@ -1528,7 +1754,7 @@
                 <w:rFonts w:ascii="Calibri" w:hAnsi="Calibri"/>
                 <w:sz w:val="20"/>
               </w:rPr>
-              <w:t xml:space="preserve">Crecimiento</w:t>
+              <w:t xml:space="preserve">Esfuerzo fiscal</w:t>
             </w:r>
           </w:p>
         </w:tc>
@@ -1547,7 +1773,7 @@
                 <w:rFonts w:ascii="Calibri" w:hAnsi="Calibri"/>
                 <w:sz w:val="20"/>
               </w:rPr>
-              <w:t xml:space="preserve">Variación trimestral del PIB real</w:t>
+              <w:t xml:space="preserve">Resultado primario, % del PIB, con o sin rentas de la propiedad según el perímetro</w:t>
             </w:r>
           </w:p>
         </w:tc>
@@ -1566,7 +1792,7 @@
                 <w:rFonts w:ascii="Calibri" w:hAnsi="Calibri"/>
                 <w:sz w:val="20"/>
               </w:rPr>
-              <w:t xml:space="preserve">INDEC</w:t>
+              <w:t xml:space="preserve">MECON</w:t>
             </w:r>
           </w:p>
         </w:tc>
@@ -1606,7 +1832,7 @@
                 <w:rFonts w:ascii="Calibri" w:hAnsi="Calibri"/>
                 <w:sz w:val="20"/>
               </w:rPr>
-              <w:t xml:space="preserve">Riesgo soberano</w:t>
+              <w:t xml:space="preserve">Actividad</w:t>
             </w:r>
           </w:p>
         </w:tc>
@@ -1625,7 +1851,7 @@
                 <w:rFonts w:ascii="Calibri" w:hAnsi="Calibri"/>
                 <w:sz w:val="20"/>
               </w:rPr>
-              <w:t xml:space="preserve">Costo del financiamiento</w:t>
+              <w:t xml:space="preserve">Crecimiento</w:t>
             </w:r>
           </w:p>
         </w:tc>
@@ -1644,7 +1870,7 @@
                 <w:rFonts w:ascii="Calibri" w:hAnsi="Calibri"/>
                 <w:sz w:val="20"/>
               </w:rPr>
-              <w:t xml:space="preserve">EMBI+ Argentina (puntos básicos)</w:t>
+              <w:t xml:space="preserve">Variación trimestral del PIB real</w:t>
             </w:r>
           </w:p>
         </w:tc>
@@ -1663,7 +1889,7 @@
                 <w:rFonts w:ascii="Calibri" w:hAnsi="Calibri"/>
                 <w:sz w:val="20"/>
               </w:rPr>
-              <w:t xml:space="preserve">J.P. Morgan, a través de compilaciones secundarias</w:t>
+              <w:t xml:space="preserve">INDEC</w:t>
             </w:r>
           </w:p>
         </w:tc>
@@ -1703,7 +1929,7 @@
                 <w:rFonts w:ascii="Calibri" w:hAnsi="Calibri"/>
                 <w:sz w:val="20"/>
               </w:rPr>
-              <w:t xml:space="preserve">Precios relativos</w:t>
+              <w:t xml:space="preserve">Riesgo soberano</w:t>
             </w:r>
           </w:p>
         </w:tc>
@@ -1722,7 +1948,7 @@
                 <w:rFonts w:ascii="Calibri" w:hAnsi="Calibri"/>
                 <w:sz w:val="20"/>
               </w:rPr>
-              <w:t xml:space="preserve">Efecto de valuación</w:t>
+              <w:t xml:space="preserve">Costo del financiamiento</w:t>
             </w:r>
           </w:p>
         </w:tc>
@@ -1741,7 +1967,7 @@
                 <w:rFonts w:ascii="Calibri" w:hAnsi="Calibri"/>
                 <w:sz w:val="20"/>
               </w:rPr>
-              <w:t xml:space="preserve">Tipo de cambio real multilateral</w:t>
+              <w:t xml:space="preserve">EMBI+ Argentina (puntos básicos)</w:t>
             </w:r>
           </w:p>
         </w:tc>
@@ -1760,7 +1986,7 @@
                 <w:rFonts w:ascii="Calibri" w:hAnsi="Calibri"/>
                 <w:sz w:val="20"/>
               </w:rPr>
-              <w:t xml:space="preserve">BCRA</w:t>
+              <w:t xml:space="preserve">J.P. Morgan, serie diaria publicada por Ámbito Financiero</w:t>
             </w:r>
           </w:p>
         </w:tc>
@@ -1800,6 +2026,103 @@
                 <w:rFonts w:ascii="Calibri" w:hAnsi="Calibri"/>
                 <w:sz w:val="20"/>
               </w:rPr>
+              <w:t xml:space="preserve">Precios relativos</w:t>
+            </w:r>
+          </w:p>
+        </w:tc>
+        <w:tc>
+          <w:tcPr>
+            <w:tcW w:type="dxa" w:w="1814"/>
+          </w:tcPr>
+          <w:p>
+            <w:pPr>
+              <w:pStyle w:val="Compact"/>
+              <w:spacing w:line="240" w:lineRule="auto"/>
+              <w:ind w:firstLine="0"/>
+            </w:pPr>
+            <w:r>
+              <w:rPr>
+                <w:rFonts w:ascii="Calibri" w:hAnsi="Calibri"/>
+                <w:sz w:val="20"/>
+              </w:rPr>
+              <w:t xml:space="preserve">Efecto de valuación</w:t>
+            </w:r>
+          </w:p>
+        </w:tc>
+        <w:tc>
+          <w:tcPr>
+            <w:tcW w:type="dxa" w:w="1814"/>
+          </w:tcPr>
+          <w:p>
+            <w:pPr>
+              <w:pStyle w:val="Compact"/>
+              <w:spacing w:line="240" w:lineRule="auto"/>
+              <w:ind w:firstLine="0"/>
+            </w:pPr>
+            <w:r>
+              <w:rPr>
+                <w:rFonts w:ascii="Calibri" w:hAnsi="Calibri"/>
+                <w:sz w:val="20"/>
+              </w:rPr>
+              <w:t xml:space="preserve">Tipo de cambio real multilateral</w:t>
+            </w:r>
+          </w:p>
+        </w:tc>
+        <w:tc>
+          <w:tcPr>
+            <w:tcW w:type="dxa" w:w="1814"/>
+          </w:tcPr>
+          <w:p>
+            <w:pPr>
+              <w:pStyle w:val="Compact"/>
+              <w:spacing w:line="240" w:lineRule="auto"/>
+              <w:ind w:firstLine="0"/>
+            </w:pPr>
+            <w:r>
+              <w:rPr>
+                <w:rFonts w:ascii="Calibri" w:hAnsi="Calibri"/>
+                <w:sz w:val="20"/>
+              </w:rPr>
+              <w:t xml:space="preserve">BCRA</w:t>
+            </w:r>
+          </w:p>
+        </w:tc>
+        <w:tc>
+          <w:tcPr>
+            <w:tcW w:type="dxa" w:w="1814"/>
+          </w:tcPr>
+          <w:p>
+            <w:pPr>
+              <w:pStyle w:val="Compact"/>
+              <w:spacing w:line="240" w:lineRule="auto"/>
+              <w:ind w:firstLine="0"/>
+            </w:pPr>
+            <w:r>
+              <w:rPr>
+                <w:rFonts w:ascii="Calibri" w:hAnsi="Calibri"/>
+                <w:sz w:val="20"/>
+              </w:rPr>
+              <w:t xml:space="preserve">Endógena</w:t>
+            </w:r>
+          </w:p>
+        </w:tc>
+      </w:tr>
+      <w:tr>
+        <w:tc>
+          <w:tcPr>
+            <w:tcW w:type="dxa" w:w="1814"/>
+          </w:tcPr>
+          <w:p>
+            <w:pPr>
+              <w:pStyle w:val="Compact"/>
+              <w:spacing w:line="240" w:lineRule="auto"/>
+              <w:ind w:firstLine="0"/>
+            </w:pPr>
+            <w:r>
+              <w:rPr>
+                <w:rFonts w:ascii="Calibri" w:hAnsi="Calibri"/>
+                <w:sz w:val="20"/>
+              </w:rPr>
               <w:t xml:space="preserve">Política monetaria de Estados Unidos</w:t>
             </w:r>
           </w:p>
@@ -2048,7 +2371,30 @@
                 <w:rFonts w:ascii="Calibri" w:hAnsi="Calibri"/>
                 <w:sz w:val="20"/>
               </w:rPr>
-              <w:t xml:space="preserve">Crecimiento, deflactor, tasa efectiva, resultado primario y ajuste stock-flujo, 2026-2035</w:t>
+              <w:t xml:space="preserve">Crecimiento, deflactor, tasa efectiva, resultado primario, ajuste</w:t>
+            </w:r>
+            <w:r>
+              <w:rPr>
+                <w:rFonts w:ascii="Calibri" w:hAnsi="Calibri"/>
+                <w:sz w:val="20"/>
+              </w:rPr>
+              <w:t xml:space="preserve"> </w:t>
+            </w:r>
+            <w:r>
+              <w:rPr>
+                <w:rFonts w:ascii="Calibri" w:hAnsi="Calibri"/>
+                <w:i/>
+                <w:iCs/>
+                <w:sz w:val="20"/>
+              </w:rPr>
+              <w:t xml:space="preserve">stock</w:t>
+            </w:r>
+            <w:r>
+              <w:rPr>
+                <w:rFonts w:ascii="Calibri" w:hAnsi="Calibri"/>
+                <w:sz w:val="20"/>
+              </w:rPr>
+              <w:t xml:space="preserve">-flujo e inflación relativa, 2026-2035</w:t>
             </w:r>
           </w:p>
         </w:tc>
@@ -2105,7 +2451,7 @@
         <w:pStyle w:val="BodyText"/>
       </w:pPr>
       <w:r>
-        <w:t xml:space="preserve">La primera fila de la tabla es un indicador de síntesis: la probabilidad de no estabilización es un resultado del modelo, no un dato observado. La matriz de datos tiene una fila por trimestre y una columna por cada variable observada (deuda consolidada, resultado primario, crecimiento, EMBI+, tipo de cambio real, tasa de la FED y VIX).</w:t>
+        <w:t xml:space="preserve">La primera fila de la tabla es un indicador de síntesis: la probabilidad de no estabilización es un resultado del modelo, no un dato observado. La matriz de datos tiene una fila por trimestre y una columna por cada variable observada (deuda federal bruta, deuda consolidada, resultado primario, crecimiento, EMBI+, tipo de cambio real, tasa de la FED y VIX).</w:t>
       </w:r>
     </w:p>
     <w:p>
@@ -2167,7 +2513,7 @@
         <w:t xml:space="preserve"> </w:t>
       </w:r>
       <w:r>
-        <w:t xml:space="preserve">Selección de rezagos con los criterios de Akaike, Hannan-Quinn y Schwarz, sujeta a que el modelo sea estable (todos los autovalores de la matriz compañera con módulo menor que uno). Diagnóstico de residuos: autocorrelación (Portmanteau), normalidad (Jarque-Bera) y heterocedasticidad.</w:t>
+        <w:t xml:space="preserve">El orden de rezagos será el que elija el criterio de Schwarz entre los órdenes estables, que Ivanov y Kilian (2005) recomiendan para datos trimestrales con menos de 120 observaciones. Si los residuos de ese orden rechazan la ausencia de autocorrelación (Portmanteau con 12 rezagos, al 5%), se tomará el menor orden mayor que no la rechace (Lütkepohl, 2005, sec. 4.4). Diagnóstico de residuos: autocorrelación, normalidad multivariada y heterocedasticidad condicional.</w:t>
       </w:r>
     </w:p>
     <w:p>
@@ -2205,7 +2551,55 @@
         <w:t xml:space="preserve"> </w:t>
       </w:r>
       <w:r>
-        <w:t xml:space="preserve">cambiarios y de riesgo, y su respuesta automática al ciclo se fija con una elasticidad de 0,25. Como robustez, dos ordenamientos de Cholesky.</w:t>
+        <w:t xml:space="preserve">cambiarios y de riesgo, y su respuesta automática al ciclo se fija con una elasticidad de 0,25. Como robustez, dos ordenamientos de Cholesky. La identificación no cambia la probabilidad de no estabilización, porque los</w:t>
+      </w:r>
+      <w:r>
+        <w:t xml:space="preserve"> </w:t>
+      </w:r>
+      <w:r>
+        <w:rPr>
+          <w:i/>
+          <w:iCs/>
+        </w:rPr>
+        <w:t xml:space="preserve">shocks</w:t>
+      </w:r>
+      <w:r>
+        <w:t xml:space="preserve"> </w:t>
+      </w:r>
+      <w:r>
+        <w:t xml:space="preserve">estructurales reconstruyen los mismos residuos; se necesita para repartir la varianza de la deuda por grupo de</w:t>
+      </w:r>
+      <w:r>
+        <w:t xml:space="preserve"> </w:t>
+      </w:r>
+      <w:r>
+        <w:rPr>
+          <w:i/>
+          <w:iCs/>
+        </w:rPr>
+        <w:t xml:space="preserve">shocks</w:t>
+      </w:r>
+      <w:r>
+        <w:t xml:space="preserve"> </w:t>
+      </w:r>
+      <w:r>
+        <w:t xml:space="preserve">y para definir el</w:t>
+      </w:r>
+      <w:r>
+        <w:t xml:space="preserve"> </w:t>
+      </w:r>
+      <w:r>
+        <w:rPr>
+          <w:i/>
+          <w:iCs/>
+        </w:rPr>
+        <w:t xml:space="preserve">shock</w:t>
+      </w:r>
+      <w:r>
+        <w:t xml:space="preserve"> </w:t>
+      </w:r>
+      <w:r>
+        <w:t xml:space="preserve">fiscal, de los que depende H1a.</w:t>
       </w:r>
     </w:p>
     <w:p>
@@ -2227,7 +2621,7 @@
         <w:t xml:space="preserve"> </w:t>
       </w:r>
       <w:r>
-        <w:t xml:space="preserve">Intervalos de confianza por</w:t>
+        <w:t xml:space="preserve">Intervalos de 90% por</w:t>
       </w:r>
       <w:r>
         <w:t xml:space="preserve"> </w:t>
@@ -2249,7 +2643,7 @@
         <w:t xml:space="preserve"> </w:t>
       </w:r>
       <w:r>
-        <w:t xml:space="preserve">salvaje (Gonçalves y Kilian, 2004), válidos con heterocedasticidad, y corrección del sesgo de muestra pequeña de Kilian (1998).</w:t>
+        <w:t xml:space="preserve">de bloques móviles de cuatro trimestres sobre los residuos, de diseño recursivo, en el que la deuda también se regenera (Brüggemann et al., 2016), con los percentiles de Hall (1992). La corrección del sesgo de muestra pequeña de Kilian (1998) se informará como robustez. Todas las especificaciones usarán los mismos números aleatorios, para que las diferencias entre ellas no provengan del sorteo.</w:t>
       </w:r>
     </w:p>
     <w:p>
@@ -2271,7 +2665,23 @@
         <w:t xml:space="preserve"> </w:t>
       </w:r>
       <w:r>
-        <w:t xml:space="preserve">Monte Carlo de 2026 a 2035 sobre el escenario base del FMI (2026), con los</w:t>
+        <w:t xml:space="preserve">Monte Carlo de 2026 a 2035 sobre el escenario base del FMI (2026), desde su</w:t>
+      </w:r>
+      <w:r>
+        <w:t xml:space="preserve"> </w:t>
+      </w:r>
+      <w:r>
+        <w:rPr>
+          <w:i/>
+          <w:iCs/>
+        </w:rPr>
+        <w:t xml:space="preserve">stock</w:t>
+      </w:r>
+      <w:r>
+        <w:t xml:space="preserve"> </w:t>
+      </w:r>
+      <w:r>
+        <w:t xml:space="preserve">inicial, con los</w:t>
       </w:r>
       <w:r>
         <w:t xml:space="preserve"> </w:t>
@@ -2287,7 +2697,36 @@
         <w:t xml:space="preserve"> </w:t>
       </w:r>
       <w:r>
-        <w:t xml:space="preserve">estructurales remuestreados de la historia. Antes de simular se verificará que la identidad reproduzca la senda de deuda del FMI.</w:t>
+        <w:t xml:space="preserve">estructurales remuestreados de la historia en bloques de ocho trimestres, como los bloques de dos años del abanico del FMI (FMI, 2021, anexo VI). El VIX y el nivel de la tasa de la FED se simularán con procesos autorregresivos de primer orden, con sus innovaciones remuestreadas junto con los</w:t>
+      </w:r>
+      <w:r>
+        <w:t xml:space="preserve"> </w:t>
+      </w:r>
+      <w:r>
+        <w:rPr>
+          <w:i/>
+          <w:iCs/>
+        </w:rPr>
+        <w:t xml:space="preserve">shocks</w:t>
+      </w:r>
+      <w:r>
+        <w:t xml:space="preserve"> </w:t>
+      </w:r>
+      <w:r>
+        <w:t xml:space="preserve">estructurales. El ajuste</w:t>
+      </w:r>
+      <w:r>
+        <w:t xml:space="preserve"> </w:t>
+      </w:r>
+      <w:r>
+        <w:rPr>
+          <w:i/>
+          <w:iCs/>
+        </w:rPr>
+        <w:t xml:space="preserve">stock</w:t>
+      </w:r>
+      <w:r>
+        <w:t xml:space="preserve">-flujo del escenario se escalará por la deuda en pesos simulada y la inflación relativa por la deuda en moneda extranjera; la proporción en pesos quedará fija, el mismo supuesto del FMI (2021, anexo VI). La retroalimentación de la deuda se actualizará al cierre de cada año, porque la identidad del FMI es anual. Antes de simular se verificará que la identidad reproduzca la senda de deuda del FMI.</w:t>
       </w:r>
     </w:p>
     <w:p>
@@ -2309,7 +2748,7 @@
         <w:t xml:space="preserve"> </w:t>
       </w:r>
       <w:r>
-        <w:t xml:space="preserve">H1a: superávit primario necesario para que la probabilidad baje a la estimación puntual del FMI (1%), comparado con el máximo histórico; como complemento, la descomposición de la varianza de la deuda por bloque de</w:t>
+        <w:t xml:space="preserve">H1a: descomposición de la varianza de la deuda en 2035 por grupo de</w:t>
       </w:r>
       <w:r>
         <w:t xml:space="preserve"> </w:t>
@@ -2322,7 +2761,7 @@
         <w:t xml:space="preserve">shocks</w:t>
       </w:r>
       <w:r>
-        <w:t xml:space="preserve">. H1b: el límite inferior del intervalo de 90% debe superar la probabilidad del FMI. H2: el intervalo de 90% de la diferencia entre el escenario de la FED y el base debe excluir el cero. Robustez: otras series de deuda, otra identificación, otros rezagos, otra muestra y el procedimiento de</w:t>
+        <w:t xml:space="preserve">, con el complemento descriptivo de suficiencia del superávit. H1b: el límite inferior del intervalo de 90% debe superar la probabilidad del FMI en 2031 y 2035. H2: el intervalo de 90% de la diferencia entre el escenario de la FED y el base debe excluir el cero en 2035, con dos escenarios: un nivel de la tasa más alto en un desvío estándar de su variación trimestral, en forma permanente, y la repetición de la senda de la tasa de 2022-2025. Robustez: deuda consolidada, la otra definición del resultado primario, otra identificación, otros rezagos, otra muestra, sin variables de quiebre, sin retroalimentación, corrección de sesgo y el procedimiento de</w:t>
       </w:r>
       <w:r>
         <w:t xml:space="preserve"> </w:t>
@@ -2338,7 +2777,7 @@
         <w:t xml:space="preserve"> </w:t>
       </w:r>
       <w:r>
-        <w:t xml:space="preserve">del propio FMI.</w:t>
+        <w:t xml:space="preserve">del propio FMI aplicado a la historia argentina.</w:t>
       </w:r>
     </w:p>
     <w:bookmarkEnd w:id="19"/>
@@ -2367,7 +2806,7 @@
         <w:t xml:space="preserve"> </w:t>
       </w:r>
       <w:r>
-        <w:t xml:space="preserve">El Congreso de la Nación, que por la Ley 27.612 aprueba el endeudamiento en moneda extranjera bajo ley extranjera y los programas con el FMI, y su Oficina de Presupuesto, que analiza la deuda pública. El Ministerio de Economía y el BCRA, como usuarios de una evaluación de la deuda consolidada que complementa la del FMI.</w:t>
+        <w:t xml:space="preserve">El Congreso de la Nación, que por la Ley 27.612 aprueba el endeudamiento en moneda extranjera bajo ley extranjera y los programas con el FMI, y su Oficina de Presupuesto, que analiza la deuda pública. El Ministerio de Economía y el BCRA, como usuarios de una evaluación probabilística de la deuda que complementa la del FMI con el mismo perímetro y la extiende a la deuda consolidada.</w:t>
       </w:r>
     </w:p>
     <w:p>
@@ -2403,7 +2842,7 @@
         <w:t xml:space="preserve"> </w:t>
       </w:r>
       <w:r>
-        <w:t xml:space="preserve">Analistas de riesgo soberano y periodistas económicos, que podrán contrastar la probabilidad de no estabilización con la del FMI, teniendo en cuenta las diferencias de perímetro y de método que la tesis documenta.</w:t>
+        <w:t xml:space="preserve">Analistas de riesgo soberano y periodistas económicos, que podrán contrastar la probabilidad de no estabilización con la del FMI sobre una base comparable.</w:t>
       </w:r>
     </w:p>
     <w:p>
@@ -3540,7 +3979,7 @@
                 <w:rFonts w:ascii="Calibri" w:hAnsi="Calibri"/>
                 <w:sz w:val="20"/>
               </w:rPr>
-              <w:t xml:space="preserve">Construcción de la deuda consolidada y evaluación de las fuentes</w:t>
+              <w:t xml:space="preserve">Construcción de las series de deuda y evaluación de las fuentes</w:t>
             </w:r>
           </w:p>
         </w:tc>
@@ -4304,7 +4743,7 @@
                 <w:rFonts w:ascii="Calibri" w:hAnsi="Calibri"/>
                 <w:sz w:val="20"/>
               </w:rPr>
-              <w:t xml:space="preserve">Contraste de hipótesis y pruebas de robustez</w:t>
+              <w:t xml:space="preserve">Contraste de hipótesis</w:t>
             </w:r>
           </w:p>
         </w:tc>
@@ -4495,7 +4934,7 @@
                 <w:rFonts w:ascii="Calibri" w:hAnsi="Calibri"/>
                 <w:sz w:val="20"/>
               </w:rPr>
-              <w:t xml:space="preserve">Revisión de criterios de contraste tras la primera estimación</w:t>
+              <w:t xml:space="preserve">Revisión de la especificación y pruebas de robustez</w:t>
             </w:r>
           </w:p>
         </w:tc>
@@ -5420,23 +5859,33 @@
         <w:jc w:val="left"/>
       </w:pPr>
       <w:r>
-        <w:t xml:space="preserve">Calvo, G. A., Izquierdo, A., y Talvi, E. (2003).</w:t>
-      </w:r>
-      <w:r>
-        <w:t xml:space="preserve"> </w:t>
-      </w:r>
-      <w:r>
-        <w:rPr>
-          <w:i/>
-          <w:iCs/>
-        </w:rPr>
-        <w:t xml:space="preserve">Sudden stops, the real exchange rate, and fiscal sustainability: Argentina’s lessons</w:t>
-      </w:r>
-      <w:r>
-        <w:t xml:space="preserve"> </w:t>
-      </w:r>
-      <w:r>
-        <w:t xml:space="preserve">(NBER Working Paper No. 9828). National Bureau of Economic Research. https://doi.org/10.3386/w9828</w:t>
+        <w:t xml:space="preserve">Brüggemann, R., Jentsch, C., y Trenkler, C. (2016). Inference in VARs with conditional heteroskedasticity of unknown form.</w:t>
+      </w:r>
+      <w:r>
+        <w:t xml:space="preserve"> </w:t>
+      </w:r>
+      <w:r>
+        <w:rPr>
+          <w:i/>
+          <w:iCs/>
+        </w:rPr>
+        <w:t xml:space="preserve">Journal of Econometrics</w:t>
+      </w:r>
+      <w:r>
+        <w:t xml:space="preserve">,</w:t>
+      </w:r>
+      <w:r>
+        <w:t xml:space="preserve"> </w:t>
+      </w:r>
+      <w:r>
+        <w:rPr>
+          <w:i/>
+          <w:iCs/>
+        </w:rPr>
+        <w:t xml:space="preserve">191</w:t>
+      </w:r>
+      <w:r>
+        <w:t xml:space="preserve">(1), 69-85. https://doi.org/10.1016/j.jeconom.2015.10.004</w:t>
       </w:r>
     </w:p>
     <w:p>
@@ -5446,51 +5895,23 @@
         <w:jc w:val="left"/>
       </w:pPr>
       <w:r>
-        <w:t xml:space="preserve">Celasun, O., Debrun, X., y Ostry, J. D. (2006).</w:t>
-      </w:r>
-      <w:r>
-        <w:t xml:space="preserve"> </w:t>
-      </w:r>
-      <w:r>
-        <w:rPr>
-          <w:i/>
-          <w:iCs/>
-        </w:rPr>
-        <w:t xml:space="preserve">Primary surplus behavior and risks to fiscal sustainability in emerging market countries: A</w:t>
-      </w:r>
-      <w:r>
-        <w:rPr>
-          <w:i/>
-          <w:iCs/>
-        </w:rPr>
-        <w:t xml:space="preserve"> </w:t>
-      </w:r>
-      <w:r>
-        <w:rPr>
-          <w:i/>
-          <w:iCs/>
-        </w:rPr>
-        <w:t xml:space="preserve">“fan-chart”</w:t>
-      </w:r>
-      <w:r>
-        <w:rPr>
-          <w:i/>
-          <w:iCs/>
-        </w:rPr>
-        <w:t xml:space="preserve"> </w:t>
-      </w:r>
-      <w:r>
-        <w:rPr>
-          <w:i/>
-          <w:iCs/>
-        </w:rPr>
-        <w:t xml:space="preserve">approach</w:t>
-      </w:r>
-      <w:r>
-        <w:t xml:space="preserve"> </w:t>
-      </w:r>
-      <w:r>
-        <w:t xml:space="preserve">(IMF Working Paper No. 06/67). Fondo Monetario Internacional. https://doi.org/10.5089/9781451863277.001</w:t>
+        <w:t xml:space="preserve">Calvo, G. A., Izquierdo, A., y Talvi, E. (2003).</w:t>
+      </w:r>
+      <w:r>
+        <w:t xml:space="preserve"> </w:t>
+      </w:r>
+      <w:r>
+        <w:rPr>
+          <w:i/>
+          <w:iCs/>
+        </w:rPr>
+        <w:t xml:space="preserve">Sudden stops, the real exchange rate, and fiscal sustainability: Argentina’s lessons</w:t>
+      </w:r>
+      <w:r>
+        <w:t xml:space="preserve"> </w:t>
+      </w:r>
+      <w:r>
+        <w:t xml:space="preserve">(NBER Working Paper No. 9828). National Bureau of Economic Research. https://doi.org/10.3386/w9828</w:t>
       </w:r>
     </w:p>
     <w:p>
@@ -5500,20 +5921,51 @@
         <w:jc w:val="left"/>
       </w:pPr>
       <w:r>
-        <w:t xml:space="preserve">Díaz Alejandro, C. F. (1970).</w:t>
-      </w:r>
-      <w:r>
-        <w:t xml:space="preserve"> </w:t>
-      </w:r>
-      <w:r>
-        <w:rPr>
-          <w:i/>
-          <w:iCs/>
-        </w:rPr>
-        <w:t xml:space="preserve">Essays on the economic history of the Argentine Republic</w:t>
-      </w:r>
-      <w:r>
-        <w:t xml:space="preserve">. Yale University Press.</w:t>
+        <w:t xml:space="preserve">Celasun, O., Debrun, X., y Ostry, J. D. (2006).</w:t>
+      </w:r>
+      <w:r>
+        <w:t xml:space="preserve"> </w:t>
+      </w:r>
+      <w:r>
+        <w:rPr>
+          <w:i/>
+          <w:iCs/>
+        </w:rPr>
+        <w:t xml:space="preserve">Primary surplus behavior and risks to fiscal sustainability in emerging market countries: A</w:t>
+      </w:r>
+      <w:r>
+        <w:rPr>
+          <w:i/>
+          <w:iCs/>
+        </w:rPr>
+        <w:t xml:space="preserve"> </w:t>
+      </w:r>
+      <w:r>
+        <w:rPr>
+          <w:i/>
+          <w:iCs/>
+        </w:rPr>
+        <w:t xml:space="preserve">“fan-chart”</w:t>
+      </w:r>
+      <w:r>
+        <w:rPr>
+          <w:i/>
+          <w:iCs/>
+        </w:rPr>
+        <w:t xml:space="preserve"> </w:t>
+      </w:r>
+      <w:r>
+        <w:rPr>
+          <w:i/>
+          <w:iCs/>
+        </w:rPr>
+        <w:t xml:space="preserve">approach</w:t>
+      </w:r>
+      <w:r>
+        <w:t xml:space="preserve"> </w:t>
+      </w:r>
+      <w:r>
+        <w:t xml:space="preserve">(IMF Working Paper No. 06/67). Fondo Monetario Internacional. https://doi.org/10.5089/9781451863277.001</w:t>
       </w:r>
     </w:p>
     <w:p>
@@ -5523,23 +5975,20 @@
         <w:jc w:val="left"/>
       </w:pPr>
       <w:r>
-        <w:t xml:space="preserve">Fondo Monetario Internacional. (2021).</w:t>
-      </w:r>
-      <w:r>
-        <w:t xml:space="preserve"> </w:t>
-      </w:r>
-      <w:r>
-        <w:rPr>
-          <w:i/>
-          <w:iCs/>
-        </w:rPr>
-        <w:t xml:space="preserve">Review of the debt sustainability framework for market access countries</w:t>
-      </w:r>
-      <w:r>
-        <w:t xml:space="preserve"> </w:t>
-      </w:r>
-      <w:r>
-        <w:t xml:space="preserve">(IMF Policy Paper). Aprobado por el Directorio el 14 de enero de 2021.</w:t>
+        <w:t xml:space="preserve">Díaz Alejandro, C. F. (1970).</w:t>
+      </w:r>
+      <w:r>
+        <w:t xml:space="preserve"> </w:t>
+      </w:r>
+      <w:r>
+        <w:rPr>
+          <w:i/>
+          <w:iCs/>
+        </w:rPr>
+        <w:t xml:space="preserve">Essays on the economic history of the Argentine Republic</w:t>
+      </w:r>
+      <w:r>
+        <w:t xml:space="preserve">. Yale University Press.</w:t>
       </w:r>
     </w:p>
     <w:p>
@@ -5549,23 +5998,23 @@
         <w:jc w:val="left"/>
       </w:pPr>
       <w:r>
-        <w:t xml:space="preserve">Fondo Monetario Internacional. (2025).</w:t>
-      </w:r>
-      <w:r>
-        <w:t xml:space="preserve"> </w:t>
-      </w:r>
-      <w:r>
-        <w:rPr>
-          <w:i/>
-          <w:iCs/>
-        </w:rPr>
-        <w:t xml:space="preserve">Argentina: Request for an extended arrangement under the Extended Fund Facility</w:t>
-      </w:r>
-      <w:r>
-        <w:t xml:space="preserve"> </w:t>
-      </w:r>
-      <w:r>
-        <w:t xml:space="preserve">(IMF Country Report No. 25/95). Anexo II: Application of the Sovereign Risk and Debt Sustainability Framework.</w:t>
+        <w:t xml:space="preserve">Fondo Monetario Internacional [FMI]. (2021).</w:t>
+      </w:r>
+      <w:r>
+        <w:t xml:space="preserve"> </w:t>
+      </w:r>
+      <w:r>
+        <w:rPr>
+          <w:i/>
+          <w:iCs/>
+        </w:rPr>
+        <w:t xml:space="preserve">Review of the debt sustainability framework for market access countries</w:t>
+      </w:r>
+      <w:r>
+        <w:t xml:space="preserve"> </w:t>
+      </w:r>
+      <w:r>
+        <w:t xml:space="preserve">(IMF Policy Paper).</w:t>
       </w:r>
     </w:p>
     <w:p>
@@ -5575,23 +6024,23 @@
         <w:jc w:val="left"/>
       </w:pPr>
       <w:r>
-        <w:t xml:space="preserve">Fondo Monetario Internacional. (2026).</w:t>
-      </w:r>
-      <w:r>
-        <w:t xml:space="preserve"> </w:t>
-      </w:r>
-      <w:r>
-        <w:rPr>
-          <w:i/>
-          <w:iCs/>
-        </w:rPr>
-        <w:t xml:space="preserve">Argentina: 2026 Article IV consultation, second review under the extended arrangement under the Extended Fund Facility</w:t>
-      </w:r>
-      <w:r>
-        <w:t xml:space="preserve"> </w:t>
-      </w:r>
-      <w:r>
-        <w:t xml:space="preserve">(IMF Country Report No. 26/105). Anexo: Sovereign Risk and Debt Sustainability Assessment.</w:t>
+        <w:t xml:space="preserve">Fondo Monetario Internacional [FMI]. (2025).</w:t>
+      </w:r>
+      <w:r>
+        <w:t xml:space="preserve"> </w:t>
+      </w:r>
+      <w:r>
+        <w:rPr>
+          <w:i/>
+          <w:iCs/>
+        </w:rPr>
+        <w:t xml:space="preserve">Argentina: Request for an extended arrangement under the Extended Fund Facility</w:t>
+      </w:r>
+      <w:r>
+        <w:t xml:space="preserve"> </w:t>
+      </w:r>
+      <w:r>
+        <w:t xml:space="preserve">(IMF Country Report No. 25/95).</w:t>
       </w:r>
     </w:p>
     <w:p>
@@ -5601,33 +6050,23 @@
         <w:jc w:val="left"/>
       </w:pPr>
       <w:r>
-        <w:t xml:space="preserve">Ghosh, A. R., Kim, J. I., Mendoza, E. G., Ostry, J. D., y Qureshi, M. S. (2013). Fiscal fatigue, fiscal space and debt sustainability in advanced economies.</w:t>
-      </w:r>
-      <w:r>
-        <w:t xml:space="preserve"> </w:t>
-      </w:r>
-      <w:r>
-        <w:rPr>
-          <w:i/>
-          <w:iCs/>
-        </w:rPr>
-        <w:t xml:space="preserve">The Economic Journal</w:t>
-      </w:r>
-      <w:r>
-        <w:t xml:space="preserve">,</w:t>
-      </w:r>
-      <w:r>
-        <w:t xml:space="preserve"> </w:t>
-      </w:r>
-      <w:r>
-        <w:rPr>
-          <w:i/>
-          <w:iCs/>
-        </w:rPr>
-        <w:t xml:space="preserve">123</w:t>
-      </w:r>
-      <w:r>
-        <w:t xml:space="preserve">(566), F4-F30. https://doi.org/10.1111/ecoj.12010</w:t>
+        <w:t xml:space="preserve">Fondo Monetario Internacional [FMI]. (2026).</w:t>
+      </w:r>
+      <w:r>
+        <w:t xml:space="preserve"> </w:t>
+      </w:r>
+      <w:r>
+        <w:rPr>
+          <w:i/>
+          <w:iCs/>
+        </w:rPr>
+        <w:t xml:space="preserve">Argentina: 2026 Article IV consultation, second review under the extended arrangement under the Extended Fund Facility</w:t>
+      </w:r>
+      <w:r>
+        <w:t xml:space="preserve"> </w:t>
+      </w:r>
+      <w:r>
+        <w:t xml:space="preserve">(IMF Country Report No. 26/105).</w:t>
       </w:r>
     </w:p>
     <w:p>
@@ -5637,17 +6076,17 @@
         <w:jc w:val="left"/>
       </w:pPr>
       <w:r>
-        <w:t xml:space="preserve">Gonçalves, S., y Kilian, L. (2004). Bootstrapping autoregressions with conditional heteroskedasticity of unknown form.</w:t>
-      </w:r>
-      <w:r>
-        <w:t xml:space="preserve"> </w:t>
-      </w:r>
-      <w:r>
-        <w:rPr>
-          <w:i/>
-          <w:iCs/>
-        </w:rPr>
-        <w:t xml:space="preserve">Journal of Econometrics</w:t>
+        <w:t xml:space="preserve">Ghosh, A. R., Kim, J. I., Mendoza, E. G., Ostry, J. D., y Qureshi, M. S. (2013). Fiscal fatigue, fiscal space and debt sustainability in advanced economies.</w:t>
+      </w:r>
+      <w:r>
+        <w:t xml:space="preserve"> </w:t>
+      </w:r>
+      <w:r>
+        <w:rPr>
+          <w:i/>
+          <w:iCs/>
+        </w:rPr>
+        <w:t xml:space="preserve">The Economic Journal</w:t>
       </w:r>
       <w:r>
         <w:t xml:space="preserve">,</w:t>
@@ -5663,7 +6102,7 @@
         <w:t xml:space="preserve">123</w:t>
       </w:r>
       <w:r>
-        <w:t xml:space="preserve">(1), 89-120. https://doi.org/10.1016/j.jeconom.2003.10.030</w:t>
+        <w:t xml:space="preserve">(566), F4-F30. https://doi.org/10.1111/ecoj.12010</w:t>
       </w:r>
     </w:p>
     <w:p>
@@ -5673,33 +6112,20 @@
         <w:jc w:val="left"/>
       </w:pPr>
       <w:r>
-        <w:t xml:space="preserve">Kilian, L. (1998). Small-sample confidence intervals for impulse response functions.</w:t>
-      </w:r>
-      <w:r>
-        <w:t xml:space="preserve"> </w:t>
-      </w:r>
-      <w:r>
-        <w:rPr>
-          <w:i/>
-          <w:iCs/>
-        </w:rPr>
-        <w:t xml:space="preserve">Review of Economics and Statistics</w:t>
-      </w:r>
-      <w:r>
-        <w:t xml:space="preserve">,</w:t>
-      </w:r>
-      <w:r>
-        <w:t xml:space="preserve"> </w:t>
-      </w:r>
-      <w:r>
-        <w:rPr>
-          <w:i/>
-          <w:iCs/>
-        </w:rPr>
-        <w:t xml:space="preserve">80</w:t>
-      </w:r>
-      <w:r>
-        <w:t xml:space="preserve">(2), 218-230. https://doi.org/10.1162/003465398557465</w:t>
+        <w:t xml:space="preserve">Hall, P. (1992).</w:t>
+      </w:r>
+      <w:r>
+        <w:t xml:space="preserve"> </w:t>
+      </w:r>
+      <w:r>
+        <w:rPr>
+          <w:i/>
+          <w:iCs/>
+        </w:rPr>
+        <w:t xml:space="preserve">The bootstrap and Edgeworth expansion</w:t>
+      </w:r>
+      <w:r>
+        <w:t xml:space="preserve">. Springer. https://doi.org/10.1007/978-1-4612-4384-7</w:t>
       </w:r>
     </w:p>
     <w:p>
@@ -5709,17 +6135,17 @@
         <w:jc w:val="left"/>
       </w:pPr>
       <w:r>
-        <w:t xml:space="preserve">Levy Yeyati, E., y Sturzenegger, F. (2023). A balance-sheet approach to fiscal sustainability.</w:t>
-      </w:r>
-      <w:r>
-        <w:t xml:space="preserve"> </w:t>
-      </w:r>
-      <w:r>
-        <w:rPr>
-          <w:i/>
-          <w:iCs/>
-        </w:rPr>
-        <w:t xml:space="preserve">Fiscal Studies</w:t>
+        <w:t xml:space="preserve">Ivanov, V., y Kilian, L. (2005). A practitioner’s guide to lag order selection for VAR impulse response analysis.</w:t>
+      </w:r>
+      <w:r>
+        <w:t xml:space="preserve"> </w:t>
+      </w:r>
+      <w:r>
+        <w:rPr>
+          <w:i/>
+          <w:iCs/>
+        </w:rPr>
+        <w:t xml:space="preserve">Studies in Nonlinear Dynamics and Econometrics</w:t>
       </w:r>
       <w:r>
         <w:t xml:space="preserve">,</w:t>
@@ -5732,10 +6158,10 @@
           <w:i/>
           <w:iCs/>
         </w:rPr>
-        <w:t xml:space="preserve">44</w:t>
-      </w:r>
-      <w:r>
-        <w:t xml:space="preserve">(1), 61-84. https://doi.org/10.1111/1475-5890.12319</w:t>
+        <w:t xml:space="preserve">9</w:t>
+      </w:r>
+      <w:r>
+        <w:t xml:space="preserve">(1), artículo 2. https://doi.org/10.2202/1558-3708.1219</w:t>
       </w:r>
     </w:p>
     <w:p>
@@ -5745,7 +6171,33 @@
         <w:jc w:val="left"/>
       </w:pPr>
       <w:r>
-        <w:t xml:space="preserve">Ley 27.612 de Fortalecimiento de la Sostenibilidad de la Deuda Pública. (2021, 3 de marzo). Boletín Oficial de la República Argentina. https://www.argentina.gob.ar/normativa/nacional/norma-347532/texto</w:t>
+        <w:t xml:space="preserve">Kilian, L. (1998). Small-sample confidence intervals for impulse response functions.</w:t>
+      </w:r>
+      <w:r>
+        <w:t xml:space="preserve"> </w:t>
+      </w:r>
+      <w:r>
+        <w:rPr>
+          <w:i/>
+          <w:iCs/>
+        </w:rPr>
+        <w:t xml:space="preserve">Review of Economics and Statistics</w:t>
+      </w:r>
+      <w:r>
+        <w:t xml:space="preserve">,</w:t>
+      </w:r>
+      <w:r>
+        <w:t xml:space="preserve"> </w:t>
+      </w:r>
+      <w:r>
+        <w:rPr>
+          <w:i/>
+          <w:iCs/>
+        </w:rPr>
+        <w:t xml:space="preserve">80</w:t>
+      </w:r>
+      <w:r>
+        <w:t xml:space="preserve">(2), 218-230. https://doi.org/10.1162/003465398557465</w:t>
       </w:r>
     </w:p>
     <w:p>
@@ -5755,23 +6207,33 @@
         <w:jc w:val="left"/>
       </w:pPr>
       <w:r>
-        <w:t xml:space="preserve">Medeiros, J. (2012).</w:t>
-      </w:r>
-      <w:r>
-        <w:t xml:space="preserve"> </w:t>
-      </w:r>
-      <w:r>
-        <w:rPr>
-          <w:i/>
-          <w:iCs/>
-        </w:rPr>
-        <w:t xml:space="preserve">Stochastic debt simulation using VAR models and a panel fiscal reaction function: Results for a selected number of countries</w:t>
-      </w:r>
-      <w:r>
-        <w:t xml:space="preserve"> </w:t>
-      </w:r>
-      <w:r>
-        <w:t xml:space="preserve">(European Economy Economic Papers No. 459). Comisión Europea.</w:t>
+        <w:t xml:space="preserve">Levy Yeyati, E., y Sturzenegger, F. (2023). A balance-sheet approach to fiscal sustainability.</w:t>
+      </w:r>
+      <w:r>
+        <w:t xml:space="preserve"> </w:t>
+      </w:r>
+      <w:r>
+        <w:rPr>
+          <w:i/>
+          <w:iCs/>
+        </w:rPr>
+        <w:t xml:space="preserve">Fiscal Studies</w:t>
+      </w:r>
+      <w:r>
+        <w:t xml:space="preserve">,</w:t>
+      </w:r>
+      <w:r>
+        <w:t xml:space="preserve"> </w:t>
+      </w:r>
+      <w:r>
+        <w:rPr>
+          <w:i/>
+          <w:iCs/>
+        </w:rPr>
+        <w:t xml:space="preserve">44</w:t>
+      </w:r>
+      <w:r>
+        <w:t xml:space="preserve">(1), 61-84. https://doi.org/10.1111/1475-5890.12319</w:t>
       </w:r>
     </w:p>
     <w:p>
@@ -5781,33 +6243,7 @@
         <w:jc w:val="left"/>
       </w:pPr>
       <w:r>
-        <w:t xml:space="preserve">Neumeyer, P. A., y Perri, F. (2005). Business cycles in emerging economies: The role of interest rates.</w:t>
-      </w:r>
-      <w:r>
-        <w:t xml:space="preserve"> </w:t>
-      </w:r>
-      <w:r>
-        <w:rPr>
-          <w:i/>
-          <w:iCs/>
-        </w:rPr>
-        <w:t xml:space="preserve">Journal of Monetary Economics</w:t>
-      </w:r>
-      <w:r>
-        <w:t xml:space="preserve">,</w:t>
-      </w:r>
-      <w:r>
-        <w:t xml:space="preserve"> </w:t>
-      </w:r>
-      <w:r>
-        <w:rPr>
-          <w:i/>
-          <w:iCs/>
-        </w:rPr>
-        <w:t xml:space="preserve">52</w:t>
-      </w:r>
-      <w:r>
-        <w:t xml:space="preserve">(2), 345-380. https://doi.org/10.1016/j.jmoneco.2004.04.011</w:t>
+        <w:t xml:space="preserve">Ley 27.612 de Fortalecimiento de la Sostenibilidad de la Deuda Pública. (2021, 3 de marzo). Boletín Oficial de la República Argentina. https://www.argentina.gob.ar/normativa/nacional/norma-347532/texto</w:t>
       </w:r>
     </w:p>
     <w:p>
@@ -5817,7 +6253,92 @@
         <w:jc w:val="left"/>
       </w:pPr>
       <w:r>
-        <w:t xml:space="preserve">Oficina de Presupuesto del Congreso. (2026).</w:t>
+        <w:t xml:space="preserve">Lütkepohl, H. (2005).</w:t>
+      </w:r>
+      <w:r>
+        <w:t xml:space="preserve"> </w:t>
+      </w:r>
+      <w:r>
+        <w:rPr>
+          <w:i/>
+          <w:iCs/>
+        </w:rPr>
+        <w:t xml:space="preserve">New introduction to multiple time series analysis</w:t>
+      </w:r>
+      <w:r>
+        <w:t xml:space="preserve">. Springer.</w:t>
+      </w:r>
+    </w:p>
+    <w:p>
+      <w:pPr>
+        <w:pStyle w:val="BodyText"/>
+        <w:ind w:left="720" w:hanging="720"/>
+        <w:jc w:val="left"/>
+      </w:pPr>
+      <w:r>
+        <w:t xml:space="preserve">Medeiros, J. (2012).</w:t>
+      </w:r>
+      <w:r>
+        <w:t xml:space="preserve"> </w:t>
+      </w:r>
+      <w:r>
+        <w:rPr>
+          <w:i/>
+          <w:iCs/>
+        </w:rPr>
+        <w:t xml:space="preserve">Stochastic debt simulation using VAR models and a panel fiscal reaction function: Results for a selected number of countries</w:t>
+      </w:r>
+      <w:r>
+        <w:t xml:space="preserve"> </w:t>
+      </w:r>
+      <w:r>
+        <w:t xml:space="preserve">(European Economy Economic Papers No. 459). Comisión Europea. https://doi.org/10.2765/26084</w:t>
+      </w:r>
+    </w:p>
+    <w:p>
+      <w:pPr>
+        <w:pStyle w:val="BodyText"/>
+        <w:ind w:left="720" w:hanging="720"/>
+        <w:jc w:val="left"/>
+      </w:pPr>
+      <w:r>
+        <w:t xml:space="preserve">Neumeyer, P. A., y Perri, F. (2005). Business cycles in emerging economies: The role of interest rates.</w:t>
+      </w:r>
+      <w:r>
+        <w:t xml:space="preserve"> </w:t>
+      </w:r>
+      <w:r>
+        <w:rPr>
+          <w:i/>
+          <w:iCs/>
+        </w:rPr>
+        <w:t xml:space="preserve">Journal of Monetary Economics</w:t>
+      </w:r>
+      <w:r>
+        <w:t xml:space="preserve">,</w:t>
+      </w:r>
+      <w:r>
+        <w:t xml:space="preserve"> </w:t>
+      </w:r>
+      <w:r>
+        <w:rPr>
+          <w:i/>
+          <w:iCs/>
+        </w:rPr>
+        <w:t xml:space="preserve">52</w:t>
+      </w:r>
+      <w:r>
+        <w:t xml:space="preserve">(2), 345-380. https://doi.org/10.1016/j.jmoneco.2004.04.011</w:t>
+      </w:r>
+    </w:p>
+    <w:p>
+      <w:pPr>
+        <w:pStyle w:val="BodyText"/>
+        <w:ind w:left="720" w:hanging="720"/>
+        <w:jc w:val="left"/>
+      </w:pPr>
+      <w:r>
+        <w:t xml:space="preserve">Oficina de Presupuesto del Congreso [OPC]. (2026).</w:t>
       </w:r>
       <w:r>
         <w:t xml:space="preserve"> </w:t>

</xml_diff>

<commit_message>
docs(plan): agrega al plan de labor la propuesta metodologica completa (sistema, tasas, estacionalidad, alternativas descartadas y lineas futuras)
Co-Authored-By: Claude Opus 5.5 <noreply@anthropic.com>
</commit_message>
<xml_diff>
--- a/tesis_oficial_borradores/para_el_grupo/Plan_de_labor.docx
+++ b/tesis_oficial_borradores/para_el_grupo/Plan_de_labor.docx
@@ -2469,7 +2469,7 @@
         <w:t xml:space="preserve"> </w:t>
       </w:r>
       <w:r>
-        <w:t xml:space="preserve">El trabajo empírico seguirá seis pasos.</w:t>
+        <w:t xml:space="preserve">El trabajo empírico seguirá siete pasos.</w:t>
       </w:r>
     </w:p>
     <w:p>
@@ -2507,13 +2507,29 @@
           <w:i/>
           <w:iCs/>
         </w:rPr>
-        <w:t xml:space="preserve">Especificación.</w:t>
-      </w:r>
-      <w:r>
-        <w:t xml:space="preserve"> </w:t>
-      </w:r>
-      <w:r>
-        <w:t xml:space="preserve">El orden de rezagos será el que elija el criterio de Schwarz entre los órdenes estables, que Ivanov y Kilian (2005) recomiendan para datos trimestrales con menos de 120 observaciones. Si los residuos de ese orden rechazan la ausencia de autocorrelación (Portmanteau con 12 rezagos, al 5%), se tomará el menor orden mayor que no la rechace (Lütkepohl, 2005, sec. 4.4). Diagnóstico de residuos: autocorrelación, normalidad multivariada y heterocedasticidad condicional.</w:t>
+        <w:t xml:space="preserve">Especificación del sistema.</w:t>
+      </w:r>
+      <w:r>
+        <w:t xml:space="preserve"> </w:t>
+      </w:r>
+      <w:r>
+        <w:t xml:space="preserve">El SVARX tendrá cuatro variables endógenas (resultado primario, crecimiento, EMBI+ y tipo de cambio real) y, como exógenas, la variación de la tasa de la FED con dos rezagos, el VIX, variables binarias estacionales y las de los quiebres. La deuda entrará rezagada en las cuatro ecuaciones y se acumulará con la identidad contable, no con una ecuación estimada: así la deuda responde a los</w:t>
+      </w:r>
+      <w:r>
+        <w:t xml:space="preserve"> </w:t>
+      </w:r>
+      <w:r>
+        <w:rPr>
+          <w:i/>
+          <w:iCs/>
+        </w:rPr>
+        <w:t xml:space="preserve">shocks</w:t>
+      </w:r>
+      <w:r>
+        <w:t xml:space="preserve"> </w:t>
+      </w:r>
+      <w:r>
+        <w:t xml:space="preserve">del sistema y, a la vez, condiciona al resultado primario, al riesgo país, al crecimiento y al tipo de cambio en los trimestres siguientes, sin romper la contabilidad (Favero y Giavazzi, 2007). El efecto de esa retroalimentación se medirá comparando con una versión que la apaga. Se usará el crecimiento sin desestacionalizar, porque la serie desestacionalizada del INDEC empieza en 2004; la estacionalidad la absorberán las variables binarias trimestrales (Lütkepohl, 2005), en lugar de un filtro X-13 que agregaría un paso de estimación previo. La tasa de la deuda en dólares se construirá con la tasa efectiva del escenario más el desvío simulado del EMBI+ y del nivel de la tasa de la FED, que alcanza a la deuda a medida que se refinancia; la tasa de la deuda en pesos seguirá la del escenario, y la variante en la que el riesgo país también la encarece se informará como robustez.</w:t>
       </w:r>
     </w:p>
     <w:p>
@@ -2529,77 +2545,13 @@
           <w:i/>
           <w:iCs/>
         </w:rPr>
-        <w:t xml:space="preserve">Identificación.</w:t>
-      </w:r>
-      <w:r>
-        <w:t xml:space="preserve"> </w:t>
-      </w:r>
-      <w:r>
-        <w:t xml:space="preserve">Restricciones de impacto según Blanchard y Perotti (2002): el resultado primario no responde dentro del trimestre a los</w:t>
-      </w:r>
-      <w:r>
-        <w:t xml:space="preserve"> </w:t>
-      </w:r>
-      <w:r>
-        <w:rPr>
-          <w:i/>
-          <w:iCs/>
-        </w:rPr>
-        <w:t xml:space="preserve">shocks</w:t>
-      </w:r>
-      <w:r>
-        <w:t xml:space="preserve"> </w:t>
-      </w:r>
-      <w:r>
-        <w:t xml:space="preserve">cambiarios y de riesgo, y su respuesta automática al ciclo se fija con una elasticidad de 0,25. Como robustez, dos ordenamientos de Cholesky. La identificación no cambia la probabilidad de no estabilización, porque los</w:t>
-      </w:r>
-      <w:r>
-        <w:t xml:space="preserve"> </w:t>
-      </w:r>
-      <w:r>
-        <w:rPr>
-          <w:i/>
-          <w:iCs/>
-        </w:rPr>
-        <w:t xml:space="preserve">shocks</w:t>
-      </w:r>
-      <w:r>
-        <w:t xml:space="preserve"> </w:t>
-      </w:r>
-      <w:r>
-        <w:t xml:space="preserve">estructurales reconstruyen los mismos residuos; se necesita para repartir la varianza de la deuda por grupo de</w:t>
-      </w:r>
-      <w:r>
-        <w:t xml:space="preserve"> </w:t>
-      </w:r>
-      <w:r>
-        <w:rPr>
-          <w:i/>
-          <w:iCs/>
-        </w:rPr>
-        <w:t xml:space="preserve">shocks</w:t>
-      </w:r>
-      <w:r>
-        <w:t xml:space="preserve"> </w:t>
-      </w:r>
-      <w:r>
-        <w:t xml:space="preserve">y para definir el</w:t>
-      </w:r>
-      <w:r>
-        <w:t xml:space="preserve"> </w:t>
-      </w:r>
-      <w:r>
-        <w:rPr>
-          <w:i/>
-          <w:iCs/>
-        </w:rPr>
-        <w:t xml:space="preserve">shock</w:t>
-      </w:r>
-      <w:r>
-        <w:t xml:space="preserve"> </w:t>
-      </w:r>
-      <w:r>
-        <w:t xml:space="preserve">fiscal, de los que depende H1a.</w:t>
+        <w:t xml:space="preserve">Selección de rezagos.</w:t>
+      </w:r>
+      <w:r>
+        <w:t xml:space="preserve"> </w:t>
+      </w:r>
+      <w:r>
+        <w:t xml:space="preserve">El orden de rezagos será el que elija el criterio de Schwarz entre los órdenes estables, que Ivanov y Kilian (2005) recomiendan para datos trimestrales con menos de 120 observaciones. Si los residuos de ese orden rechazan la ausencia de autocorrelación (Portmanteau con 12 rezagos, al 5%), se tomará el menor orden mayor que no la rechace (Lütkepohl, 2005, sec. 4.4). Diagnóstico de residuos: autocorrelación, normalidad multivariada y heterocedasticidad condicional.</w:t>
       </w:r>
     </w:p>
     <w:p>
@@ -2615,35 +2567,77 @@
           <w:i/>
           <w:iCs/>
         </w:rPr>
-        <w:t xml:space="preserve">Inferencia.</w:t>
-      </w:r>
-      <w:r>
-        <w:t xml:space="preserve"> </w:t>
-      </w:r>
-      <w:r>
-        <w:t xml:space="preserve">Intervalos de 90% por</w:t>
-      </w:r>
-      <w:r>
-        <w:t xml:space="preserve"> </w:t>
-      </w:r>
-      <w:r>
-        <w:rPr>
-          <w:i/>
-          <w:iCs/>
-        </w:rPr>
-        <w:t xml:space="preserve">bootstrap</w:t>
-      </w:r>
-      <w:r>
-        <w:rPr>
-          <w:rStyle w:val="FootnoteReference"/>
-        </w:rPr>
-        <w:footnoteReference w:id="18"/>
-      </w:r>
-      <w:r>
-        <w:t xml:space="preserve"> </w:t>
-      </w:r>
-      <w:r>
-        <w:t xml:space="preserve">de bloques móviles de cuatro trimestres sobre los residuos, de diseño recursivo, en el que la deuda también se regenera (Brüggemann et al., 2016), con los percentiles de Hall (1992). La corrección del sesgo de muestra pequeña de Kilian (1998) se informará como robustez. Todas las especificaciones usarán los mismos números aleatorios, para que las diferencias entre ellas no provengan del sorteo.</w:t>
+        <w:t xml:space="preserve">Identificación.</w:t>
+      </w:r>
+      <w:r>
+        <w:t xml:space="preserve"> </w:t>
+      </w:r>
+      <w:r>
+        <w:t xml:space="preserve">Restricciones de impacto según Blanchard y Perotti (2002): el resultado primario no responde dentro del trimestre a los</w:t>
+      </w:r>
+      <w:r>
+        <w:t xml:space="preserve"> </w:t>
+      </w:r>
+      <w:r>
+        <w:rPr>
+          <w:i/>
+          <w:iCs/>
+        </w:rPr>
+        <w:t xml:space="preserve">shocks</w:t>
+      </w:r>
+      <w:r>
+        <w:t xml:space="preserve"> </w:t>
+      </w:r>
+      <w:r>
+        <w:t xml:space="preserve">cambiarios y de riesgo, y su respuesta automática al ciclo se fija con una elasticidad de 0,25. Como robustez, dos ordenamientos de Cholesky. La identificación no cambia la probabilidad de no estabilización, porque los</w:t>
+      </w:r>
+      <w:r>
+        <w:t xml:space="preserve"> </w:t>
+      </w:r>
+      <w:r>
+        <w:rPr>
+          <w:i/>
+          <w:iCs/>
+        </w:rPr>
+        <w:t xml:space="preserve">shocks</w:t>
+      </w:r>
+      <w:r>
+        <w:t xml:space="preserve"> </w:t>
+      </w:r>
+      <w:r>
+        <w:t xml:space="preserve">estructurales reconstruyen los mismos residuos; se necesita para repartir la varianza de la deuda por grupo de</w:t>
+      </w:r>
+      <w:r>
+        <w:t xml:space="preserve"> </w:t>
+      </w:r>
+      <w:r>
+        <w:rPr>
+          <w:i/>
+          <w:iCs/>
+        </w:rPr>
+        <w:t xml:space="preserve">shocks</w:t>
+      </w:r>
+      <w:r>
+        <w:t xml:space="preserve"> </w:t>
+      </w:r>
+      <w:r>
+        <w:t xml:space="preserve">y para definir el</w:t>
+      </w:r>
+      <w:r>
+        <w:t xml:space="preserve"> </w:t>
+      </w:r>
+      <w:r>
+        <w:rPr>
+          <w:i/>
+          <w:iCs/>
+        </w:rPr>
+        <w:t xml:space="preserve">shock</w:t>
+      </w:r>
+      <w:r>
+        <w:t xml:space="preserve"> </w:t>
+      </w:r>
+      <w:r>
+        <w:t xml:space="preserve">fiscal, de los que depende H1a.</w:t>
       </w:r>
     </w:p>
     <w:p>
@@ -2659,74 +2653,35 @@
           <w:i/>
           <w:iCs/>
         </w:rPr>
-        <w:t xml:space="preserve">Simulación.</w:t>
-      </w:r>
-      <w:r>
-        <w:t xml:space="preserve"> </w:t>
-      </w:r>
-      <w:r>
-        <w:t xml:space="preserve">Monte Carlo de 2026 a 2035 sobre el escenario base del FMI (2026), desde su</w:t>
-      </w:r>
-      <w:r>
-        <w:t xml:space="preserve"> </w:t>
-      </w:r>
-      <w:r>
-        <w:rPr>
-          <w:i/>
-          <w:iCs/>
-        </w:rPr>
-        <w:t xml:space="preserve">stock</w:t>
-      </w:r>
-      <w:r>
-        <w:t xml:space="preserve"> </w:t>
-      </w:r>
-      <w:r>
-        <w:t xml:space="preserve">inicial, con los</w:t>
-      </w:r>
-      <w:r>
-        <w:t xml:space="preserve"> </w:t>
-      </w:r>
-      <w:r>
-        <w:rPr>
-          <w:i/>
-          <w:iCs/>
-        </w:rPr>
-        <w:t xml:space="preserve">shocks</w:t>
-      </w:r>
-      <w:r>
-        <w:t xml:space="preserve"> </w:t>
-      </w:r>
-      <w:r>
-        <w:t xml:space="preserve">estructurales remuestreados de la historia en bloques de ocho trimestres, como los bloques de dos años del abanico del FMI (FMI, 2021, anexo VI). El VIX y el nivel de la tasa de la FED se simularán con procesos autorregresivos de primer orden, con sus innovaciones remuestreadas junto con los</w:t>
-      </w:r>
-      <w:r>
-        <w:t xml:space="preserve"> </w:t>
-      </w:r>
-      <w:r>
-        <w:rPr>
-          <w:i/>
-          <w:iCs/>
-        </w:rPr>
-        <w:t xml:space="preserve">shocks</w:t>
-      </w:r>
-      <w:r>
-        <w:t xml:space="preserve"> </w:t>
-      </w:r>
-      <w:r>
-        <w:t xml:space="preserve">estructurales. El ajuste</w:t>
-      </w:r>
-      <w:r>
-        <w:t xml:space="preserve"> </w:t>
-      </w:r>
-      <w:r>
-        <w:rPr>
-          <w:i/>
-          <w:iCs/>
-        </w:rPr>
-        <w:t xml:space="preserve">stock</w:t>
-      </w:r>
-      <w:r>
-        <w:t xml:space="preserve">-flujo del escenario se escalará por la deuda en pesos simulada y la inflación relativa por la deuda en moneda extranjera; la proporción en pesos quedará fija, el mismo supuesto del FMI (2021, anexo VI). La retroalimentación de la deuda se actualizará al cierre de cada año, porque la identidad del FMI es anual. Antes de simular se verificará que la identidad reproduzca la senda de deuda del FMI.</w:t>
+        <w:t xml:space="preserve">Inferencia.</w:t>
+      </w:r>
+      <w:r>
+        <w:t xml:space="preserve"> </w:t>
+      </w:r>
+      <w:r>
+        <w:t xml:space="preserve">Intervalos de 90% por</w:t>
+      </w:r>
+      <w:r>
+        <w:t xml:space="preserve"> </w:t>
+      </w:r>
+      <w:r>
+        <w:rPr>
+          <w:i/>
+          <w:iCs/>
+        </w:rPr>
+        <w:t xml:space="preserve">bootstrap</w:t>
+      </w:r>
+      <w:r>
+        <w:rPr>
+          <w:rStyle w:val="FootnoteReference"/>
+        </w:rPr>
+        <w:footnoteReference w:id="18"/>
+      </w:r>
+      <w:r>
+        <w:t xml:space="preserve"> </w:t>
+      </w:r>
+      <w:r>
+        <w:t xml:space="preserve">de bloques móviles de cuatro trimestres sobre los residuos, de diseño recursivo, en el que la deuda también se regenera (Brüggemann et al., 2016), con los percentiles de Hall (1992). La corrección del sesgo de muestra pequeña de Kilian (1998) se informará como robustez. Todas las especificaciones usarán los mismos números aleatorios, para que las diferencias entre ellas no provengan del sorteo.</w:t>
       </w:r>
     </w:p>
     <w:p>
@@ -2742,6 +2697,89 @@
           <w:i/>
           <w:iCs/>
         </w:rPr>
+        <w:t xml:space="preserve">Simulación.</w:t>
+      </w:r>
+      <w:r>
+        <w:t xml:space="preserve"> </w:t>
+      </w:r>
+      <w:r>
+        <w:t xml:space="preserve">Monte Carlo de 2026 a 2035 sobre el escenario base del FMI (2026), desde su</w:t>
+      </w:r>
+      <w:r>
+        <w:t xml:space="preserve"> </w:t>
+      </w:r>
+      <w:r>
+        <w:rPr>
+          <w:i/>
+          <w:iCs/>
+        </w:rPr>
+        <w:t xml:space="preserve">stock</w:t>
+      </w:r>
+      <w:r>
+        <w:t xml:space="preserve"> </w:t>
+      </w:r>
+      <w:r>
+        <w:t xml:space="preserve">inicial, con los</w:t>
+      </w:r>
+      <w:r>
+        <w:t xml:space="preserve"> </w:t>
+      </w:r>
+      <w:r>
+        <w:rPr>
+          <w:i/>
+          <w:iCs/>
+        </w:rPr>
+        <w:t xml:space="preserve">shocks</w:t>
+      </w:r>
+      <w:r>
+        <w:t xml:space="preserve"> </w:t>
+      </w:r>
+      <w:r>
+        <w:t xml:space="preserve">estructurales remuestreados de la historia en bloques de ocho trimestres, como los bloques de dos años del abanico del FMI (FMI, 2021, anexo VI). El VIX y el nivel de la tasa de la FED se simularán con procesos autorregresivos de primer orden, con sus innovaciones remuestreadas junto con los</w:t>
+      </w:r>
+      <w:r>
+        <w:t xml:space="preserve"> </w:t>
+      </w:r>
+      <w:r>
+        <w:rPr>
+          <w:i/>
+          <w:iCs/>
+        </w:rPr>
+        <w:t xml:space="preserve">shocks</w:t>
+      </w:r>
+      <w:r>
+        <w:t xml:space="preserve"> </w:t>
+      </w:r>
+      <w:r>
+        <w:t xml:space="preserve">estructurales. El ajuste</w:t>
+      </w:r>
+      <w:r>
+        <w:t xml:space="preserve"> </w:t>
+      </w:r>
+      <w:r>
+        <w:rPr>
+          <w:i/>
+          <w:iCs/>
+        </w:rPr>
+        <w:t xml:space="preserve">stock</w:t>
+      </w:r>
+      <w:r>
+        <w:t xml:space="preserve">-flujo del escenario se escalará por la deuda en pesos simulada y la inflación relativa por la deuda en moneda extranjera; la proporción en pesos quedará fija, el mismo supuesto del FMI (2021, anexo VI). La retroalimentación de la deuda se actualizará al cierre de cada año, porque la identidad del FMI es anual. Antes de simular se verificará que la identidad reproduzca la senda de deuda del FMI.</w:t>
+      </w:r>
+    </w:p>
+    <w:p>
+      <w:pPr>
+        <w:pStyle w:val="Compact"/>
+        <w:numPr>
+          <w:ilvl w:val="0"/>
+          <w:numId w:val="1006"/>
+        </w:numPr>
+      </w:pPr>
+      <w:r>
+        <w:rPr>
+          <w:i/>
+          <w:iCs/>
+        </w:rPr>
         <w:t xml:space="preserve">Contraste de hipótesis y robustez.</w:t>
       </w:r>
       <w:r>
@@ -2761,7 +2799,7 @@
         <w:t xml:space="preserve">shocks</w:t>
       </w:r>
       <w:r>
-        <w:t xml:space="preserve">, con el complemento descriptivo de suficiencia del superávit. H1b: el límite inferior del intervalo de 90% debe superar la probabilidad del FMI en 2031 y 2035. H2: el intervalo de 90% de la diferencia entre el escenario de la FED y el base debe excluir el cero en 2035, con dos escenarios: un nivel de la tasa más alto en un desvío estándar de su variación trimestral, en forma permanente, y la repetición de la senda de la tasa de 2022-2025. Robustez: deuda consolidada, la otra definición del resultado primario, otra identificación, otros rezagos, otra muestra, sin variables de quiebre, sin retroalimentación, corrección de sesgo y el procedimiento de</w:t>
+        <w:t xml:space="preserve">, con el complemento descriptivo de suficiencia del superávit. H1b: el límite inferior del intervalo de 90% debe superar la probabilidad del FMI en 2031 y 2035. H2: el intervalo de 90% de la diferencia entre el escenario de la FED y el base debe excluir el cero en 2035, con dos escenarios: un nivel de la tasa más alto en un desvío estándar de su variación trimestral, en forma permanente, y la repetición de la senda de la tasa de 2022-2025. Robustez: deuda consolidada; la otra definición del resultado primario; canal de tasas en pesos; sin retroalimentación; uno y tres rezagos; dos ordenamientos de Cholesky y elasticidades cíclicas de 0 y 0,5; sin los</w:t>
       </w:r>
       <w:r>
         <w:t xml:space="preserve"> </w:t>
@@ -2777,7 +2815,70 @@
         <w:t xml:space="preserve"> </w:t>
       </w:r>
       <w:r>
+        <w:t xml:space="preserve">del período de cesación de pagos y canje; datos desde 2004; sin variables de quiebre; ajuste</w:t>
+      </w:r>
+      <w:r>
+        <w:t xml:space="preserve"> </w:t>
+      </w:r>
+      <w:r>
+        <w:rPr>
+          <w:i/>
+          <w:iCs/>
+        </w:rPr>
+        <w:t xml:space="preserve">stock</w:t>
+      </w:r>
+      <w:r>
+        <w:t xml:space="preserve">-flujo en cero; dos velocidades de refinanciación; el escenario del FMI de 2025; corrección de sesgo, y el procedimiento de</w:t>
+      </w:r>
+      <w:r>
+        <w:t xml:space="preserve"> </w:t>
+      </w:r>
+      <w:r>
+        <w:rPr>
+          <w:i/>
+          <w:iCs/>
+        </w:rPr>
+        <w:t xml:space="preserve">shocks</w:t>
+      </w:r>
+      <w:r>
+        <w:t xml:space="preserve"> </w:t>
+      </w:r>
+      <w:r>
         <w:t xml:space="preserve">del propio FMI aplicado a la historia argentina.</w:t>
+      </w:r>
+    </w:p>
+    <w:p>
+      <w:pPr>
+        <w:pStyle w:val="FirstParagraph"/>
+      </w:pPr>
+      <w:r>
+        <w:rPr>
+          <w:b/>
+          <w:bCs/>
+        </w:rPr>
+        <w:t xml:space="preserve">Alcances, alternativas descartadas y líneas futuras.</w:t>
+      </w:r>
+      <w:r>
+        <w:t xml:space="preserve"> </w:t>
+      </w:r>
+      <w:r>
+        <w:t xml:space="preserve">Las restricciones de signo y las de largo plazo de Blanchard y Quah no se usarán: exigen suponer, entre otras cosas, que el tipo de cambio real es neutral en el largo plazo, un supuesto difícil de sostener para la Argentina. La probabilidad de que la deuda supere el 100% del PIB se reemplazará por la métrica de no estabilización del FMI, porque ese umbral no tiene una fuente que lo justifique y la métrica del FMI permite comparar con su evaluación. Quedarán como líneas futuras, fuera del alcance de una tesis de grado, los</w:t>
+      </w:r>
+      <w:r>
+        <w:t xml:space="preserve"> </w:t>
+      </w:r>
+      <w:r>
+        <w:rPr>
+          <w:i/>
+          <w:iCs/>
+        </w:rPr>
+        <w:t xml:space="preserve">shocks</w:t>
+      </w:r>
+      <w:r>
+        <w:t xml:space="preserve"> </w:t>
+      </w:r>
+      <w:r>
+        <w:t xml:space="preserve">de política monetaria de la FED identificados con datos de alta frecuencia, los términos de intercambio como determinante externo, un módulo de balanza de pagos y un panel con Chile que compare la dinámica de la deuda en dos economías de la región.</w:t>
       </w:r>
     </w:p>
     <w:bookmarkEnd w:id="19"/>
@@ -5989,6 +6090,32 @@
       </w:r>
       <w:r>
         <w:t xml:space="preserve">. Yale University Press.</w:t>
+      </w:r>
+    </w:p>
+    <w:p>
+      <w:pPr>
+        <w:pStyle w:val="BodyText"/>
+        <w:ind w:left="720" w:hanging="720"/>
+        <w:jc w:val="left"/>
+      </w:pPr>
+      <w:r>
+        <w:t xml:space="preserve">Favero, C., y Giavazzi, F. (2007).</w:t>
+      </w:r>
+      <w:r>
+        <w:t xml:space="preserve"> </w:t>
+      </w:r>
+      <w:r>
+        <w:rPr>
+          <w:i/>
+          <w:iCs/>
+        </w:rPr>
+        <w:t xml:space="preserve">Debt and the effects of fiscal policy</w:t>
+      </w:r>
+      <w:r>
+        <w:t xml:space="preserve"> </w:t>
+      </w:r>
+      <w:r>
+        <w:t xml:space="preserve">(NBER Working Paper No. 12822). National Bureau of Economic Research. https://doi.org/10.3386/w12822</w:t>
       </w:r>
     </w:p>
     <w:p>

</xml_diff>

<commit_message>
docs(plan): criterios finales de H1a y H1b con la definición del FMI, transiciones de la tasa sombra, réplicas y alternativas descartadas
Co-Authored-By: Claude Opus 5.5 <noreply@anthropic.com>
Claude-Session: https://claude.ai/code/session_018bgUgSbAMcEtYJMckDB2k6
</commit_message>
<xml_diff>
--- a/tesis_oficial_borradores/para_el_grupo/Plan_de_labor.docx
+++ b/tesis_oficial_borradores/para_el_grupo/Plan_de_labor.docx
@@ -527,7 +527,7 @@
         <w:t xml:space="preserve"> </w:t>
       </w:r>
       <w:r>
-        <w:t xml:space="preserve">elevado de pasivos y un acceso muy limitado al crédito voluntario. El Tesoro volvió a colocar un bono en dólares en diciembre de 2025, bajo ley local y a una tasa de 9,26% anual (Secretaría de Finanzas, 2025). A fines de julio de 2026, la deuda en moneda extranjera de la Administración Central sumaba USD 248.458 millones (Oficina de Presupuesto del Congreso [OPC], 2026). Durante buena parte del período, el BCRA absorbió liquidez con pasivos remunerados que llegaron a 18,4% del PIB en 2023 (FMI, 2025, anexo II), de modo que una parte del endeudamiento público no aparecía en la deuda del Tesoro.</w:t>
+        <w:t xml:space="preserve">elevado de pasivos y un acceso muy limitado al crédito voluntario. El Tesoro volvió a colocar un bono en dólares en diciembre de 2025, bajo ley local y a una tasa de 9,26% anual (Secretaría de Finanzas, 2025). A fines de julio de 2026, la deuda en moneda extranjera de la Administración Central sumaba USD 248.458 millones (Oficina de Presupuesto del Congreso [OPC], 2026). Durante buena parte del período, el BCRA absorbió liquidez con pasivos remunerados que llegaron a 19,2% del PIB en 2023 (FMI, 2026, anexo II, cuadro 2), de modo que una parte del endeudamiento público no aparecía en la deuda del Tesoro.</w:t>
       </w:r>
     </w:p>
     <w:p>
@@ -1071,7 +1071,7 @@
         <w:t xml:space="preserve"> </w:t>
       </w:r>
       <w:r>
-        <w:t xml:space="preserve">fiscal es positiva y su intervalo de 90% excluye el cero. Como complemento descriptivo, sin criterio de contraste, se calculará la probabilidad de no estabilización con el resultado primario en su máximo anual de 1996-2025 y el aumento del resultado primario que la llevaría a la estimación del FMI.</w:t>
+        <w:t xml:space="preserve">fiscal es positiva y su intervalo de 90% excluye el cero. Se exige además una segunda condición: con el resultado primario de todos los años desplazado en la misma magnitud hasta que el de 2031 alcanza su máximo anual de 1996-2025, la probabilidad de no estabilización en 2031, medida con la definición operativa del FMI, debe seguir por encima del 1% del FMI. La hipótesis se respalda si se cumplen las dos condiciones.</w:t>
       </w:r>
     </w:p>
     <w:p>
@@ -1113,7 +1113,7 @@
         <w:pStyle w:val="Compact"/>
       </w:pPr>
       <w:r>
-        <w:t xml:space="preserve">Variables: probabilidad de no estabilización de la deuda federal bruta en 2031 y 2035, calculada con el punto de partida y el escenario base del FMI, con una métrica anual y con la definición operativa del FMI, y la probabilidad que informa el FMI para cada horizonte.</w:t>
+        <w:t xml:space="preserve">Variables: probabilidad de no estabilización de la deuda federal bruta en 2031 y 2035, calculada con el punto de partida y el escenario base del FMI, con la definición operativa del FMI (FMI, 2022, recuadro 3), de la que surgen las cifras de comparación, y la probabilidad que informa el FMI para cada horizonte. Como complemento se informará una métrica anual, que incluye la valuación de la deuda en moneda extranjera de cada año y que la definición del FMI excluye.</w:t>
       </w:r>
     </w:p>
     <w:p>
@@ -1296,7 +1296,7 @@
         <w:t xml:space="preserve"> </w:t>
       </w:r>
       <w:r>
-        <w:t xml:space="preserve">del FMI a fines de 2025 (80,3% del PIB), que incluye conceptos que el MECON no informa, como los intereses capitalizados. La deuda consolidada se construirá sumando la deuda bruta de la Administración Central y los pasivos remunerados del BCRA, y restando la deuda del Tesoro en poder del BCRA y los depósitos del Tesoro en el banco central. Se contrastará con el cuadro de deuda consolidada del FMI (2025, anexo II; 2026) en los años en que ambos se superponen. El resultado primario tendrá una sola definición para todo el estudio: el del Sector Público Nacional sin rentas de la propiedad. El FMI excluye de su resultado primario las transferencias de utilidades del BCRA (FMI, 2026, cuadro 1, nota 4), y la fuente pública del MECON no las separa del resto de las rentas de la propiedad, de modo que la serie sin rentas es la que las deja afuera. En el perímetro consolidado esas utilidades también son un flujo interno. La serie con rentas de la propiedad se informará como robustez. En la tasa de la FED, el cambio de la tasa sombra a la tasa efectiva en 2022T1 se tratará de modo que no se confunda con un cambio de política.</w:t>
+        <w:t xml:space="preserve">del FMI a fines de 2025 (80,3% del PIB), que incluye conceptos que el MECON no informa, como los intereses capitalizados. La deuda consolidada se construirá sumando la deuda bruta de la Administración Central y los pasivos remunerados del BCRA, y restando la deuda del Tesoro en poder del BCRA y los depósitos del Tesoro en el banco central. Se contrastará con el cuadro de deuda consolidada del FMI (2025, anexo II; 2026) en los años en que ambos se superponen. El resultado primario tendrá una sola definición para todo el estudio: el del Sector Público Nacional sin rentas de la propiedad. El FMI excluye de su resultado primario las transferencias de utilidades del BCRA (FMI, 2026, cuadro 1, nota 4), y la fuente pública del MECON no las separa del resto de las rentas de la propiedad, de modo que la serie sin rentas es la que las deja afuera. En el perímetro consolidado esas utilidades también son un flujo interno. La serie con rentas de la propiedad se informará como robustez. En la tasa de la FED, el cambio entre la tasa sombra y la tasa efectiva (2009T1, 2016T1, 2020T2 y 2022T1) se tratará de modo que no se confunda con un cambio de política.</w:t>
       </w:r>
     </w:p>
     <w:p>
@@ -2833,7 +2833,7 @@
         <w:t xml:space="preserve"> </w:t>
       </w:r>
       <w:r>
-        <w:t xml:space="preserve">de bloques móviles de cuatro trimestres sobre los residuos, de diseño recursivo, en el que la deuda también se regenera (Brüggemann et al., 2016), con los percentiles de Hall (1992). La corrección del sesgo de muestra pequeña de Kilian (1998) se informará como robustez. Todas las especificaciones usarán los mismos números aleatorios, para que las diferencias entre ellas no provengan del sorteo.</w:t>
+        <w:t xml:space="preserve">de bloques móviles de cuatro trimestres sobre los residuos, de diseño recursivo, en el que la deuda también se regenera (Brüggemann et al., 2016), con los percentiles de Hall (1992), con 1.000 réplicas; las participaciones y varianzas, que están acotadas, usarán percentiles simples. La corrección del sesgo de muestra pequeña de Kilian (1998) se informará como robustez. Todas las especificaciones usarán los mismos números aleatorios, para que las diferencias entre ellas no provengan del sorteo.</w:t>
       </w:r>
     </w:p>
     <w:p>
@@ -2954,7 +2954,7 @@
         <w:t xml:space="preserve"> </w:t>
       </w:r>
       <w:r>
-        <w:t xml:space="preserve">y la suficiencia del superávit (con el resultado primario de 2031 en su máximo histórico, la probabilidad debe seguir por encima del 1% del FMI). H1b: el límite inferior del intervalo de 90% debe superar la probabilidad del FMI en 2031 y 2035, con cada métrica. H2: el intervalo de 90% de la diferencia entre el escenario de la FED y el base debe excluir el cero en 2035, en la probabilidad y en la deuda esperada (si se cumple en una y no en la otra, parcialmente respaldada), con dos escenarios: un nivel de la tasa más alto en un desvío estándar de su variación trimestral, en forma permanente, y la repetición de la senda de la tasa de 2022-2025. Robustez: deuda consolidada con el BCRA, estimada desde 2002; sin las binarias presidenciales; la otra definición del resultado primario; canal de tasas en pesos; sin retroalimentación; uno y tres rezagos; dos ordenamientos de Cholesky (resultado primario primero y resultado primario último) y elasticidades cíclicas de 0 y 0,5; sin los</w:t>
+        <w:t xml:space="preserve">y la suficiencia del superávit (con el resultado primario de 2031 en su máximo histórico, la probabilidad debe seguir por encima del 1% del FMI). H1b: el límite inferior del intervalo de 90% debe superar la probabilidad del FMI en 2031 y 2035, con la definición operativa del FMI. H2: el intervalo de 90% de la diferencia entre el escenario de la FED y el base debe excluir el cero en 2035, en la probabilidad y en la deuda esperada (si se cumple en una y no en la otra, parcialmente respaldada), con dos escenarios: un nivel de la tasa más alto en un desvío estándar de su variación trimestral, en forma permanente, y la repetición de la senda de la tasa de 2022-2025. Robustez: deuda consolidada con el BCRA, estimada desde 2002; sin las binarias presidenciales; la otra definición del resultado primario; canal de tasas en pesos; sin retroalimentación; uno y tres rezagos; dos ordenamientos de Cholesky (resultado primario primero y resultado primario último) y elasticidades cíclicas de 0 y 0,5; sin los</w:t>
       </w:r>
       <w:r>
         <w:t xml:space="preserve"> </w:t>
@@ -3017,7 +3017,7 @@
         <w:t xml:space="preserve"> </w:t>
       </w:r>
       <w:r>
-        <w:t xml:space="preserve">Las restricciones de signo y las de largo plazo de Blanchard y Quah (1989) no se usarán: exigen suponer, entre otras cosas, que el tipo de cambio real es neutral en el largo plazo, un supuesto difícil de sostener para la Argentina. La probabilidad de que la deuda supere el 100% del PIB se reemplazará por la métrica de no estabilización del FMI, porque ese umbral no tiene una fuente que lo justifique y la métrica del FMI permite comparar con su evaluación. Quedarán como líneas futuras, fuera del alcance de una tesis de grado, los</w:t>
+        <w:t xml:space="preserve">Las restricciones de signo no se usarán porque identifican un conjunto de modelos y no uno solo, de modo que la descomposición de la varianza de la que depende H1a no quedaría determinada, y porque exigirían fijar de antemano el signo de respuestas que el proyecto busca medir. Las restricciones de largo plazo de Blanchard y Quah (1989) tampoco: exigen suponer que el tipo de cambio real es neutral en el largo plazo, un supuesto difícil de sostener para la Argentina. La probabilidad de que la deuda supere el 100% del PIB se reemplazará por la métrica de no estabilización del FMI, porque ese umbral no tiene una fuente que lo justifique y la métrica del FMI permite comparar con su evaluación. Quedarán como líneas futuras, fuera del alcance de una tesis de grado, los</w:t>
       </w:r>
       <w:r>
         <w:t xml:space="preserve"> </w:t>
@@ -6362,6 +6362,32 @@
       </w:r>
       <w:r>
         <w:t xml:space="preserve">(IMF Policy Paper).</w:t>
+      </w:r>
+    </w:p>
+    <w:p>
+      <w:pPr>
+        <w:pStyle w:val="BodyText"/>
+        <w:ind w:left="720" w:hanging="720"/>
+        <w:jc w:val="left"/>
+      </w:pPr>
+      <w:r>
+        <w:t xml:space="preserve">Fondo Monetario Internacional [FMI]. (2022).</w:t>
+      </w:r>
+      <w:r>
+        <w:t xml:space="preserve"> </w:t>
+      </w:r>
+      <w:r>
+        <w:rPr>
+          <w:iCs/>
+          <w:i/>
+        </w:rPr>
+        <w:t xml:space="preserve">Staff guidance note on the Sovereign Risk and Debt Sustainability Framework for market access countries</w:t>
+      </w:r>
+      <w:r>
+        <w:t xml:space="preserve"> </w:t>
+      </w:r>
+      <w:r>
+        <w:t xml:space="preserve">(IMF Policy Paper No. 2022/039). https://www.imf.org/en/Publications/Policy-Papers/Issues/2022/08/08/Staff-Guidance-Note-on-the-Sovereign-Risk-and-Debt-Sustainability-Framework-for-Market-521884</w:t>
       </w:r>
     </w:p>
     <w:p>

</xml_diff>